<commit_message>
Reformatea el informe con el formato de la memoria: secciones numeradas, marco teorico, seminario de titulo, objetivos de un verbo, organigrama y carta Gantt mejorados, 12+ citas APA
</commit_message>
<xml_diff>
--- a/Informe de Internado - Farmacia Asistencial y APS - CESFAM Villa Nonguen.docx
+++ b/Informe de Internado - Farmacia Asistencial y APS - CESFAM Villa Nonguen.docx
@@ -4,7 +4,7 @@
   <w:body>
     <w:p>
       <w:pPr>
-        <w:spacing w:line="360" w:lineRule="auto" w:after="360" w:before="240"/>
+        <w:spacing w:line="360" w:lineRule="auto" w:after="320" w:before="120"/>
         <w:jc w:val="center"/>
       </w:pPr>
       <w:r>
@@ -12,6 +12,7 @@
           <w:rFonts w:ascii="Arial" w:hAnsi="Arial"/>
           <w:b w:val="0"/>
           <w:i/>
+          <w:color w:val="000000"/>
           <w:sz w:val="22"/>
         </w:rPr>
         <w:t>[Insertar logo institucional actualizado de la USS]</w:t>
@@ -27,6 +28,7 @@
           <w:rFonts w:ascii="Arial" w:hAnsi="Arial"/>
           <w:b/>
           <w:i w:val="0"/>
+          <w:color w:val="000000"/>
           <w:sz w:val="28"/>
         </w:rPr>
         <w:t>UNIVERSIDAD SAN SEBASTIÁN</w:t>
@@ -42,6 +44,7 @@
           <w:rFonts w:ascii="Arial" w:hAnsi="Arial"/>
           <w:b/>
           <w:i w:val="0"/>
+          <w:color w:val="000000"/>
           <w:sz w:val="28"/>
         </w:rPr>
         <w:t>FACULTAD DE CIENCIAS</w:t>
@@ -57,6 +60,7 @@
           <w:rFonts w:ascii="Arial" w:hAnsi="Arial"/>
           <w:b/>
           <w:i w:val="0"/>
+          <w:color w:val="000000"/>
           <w:sz w:val="28"/>
         </w:rPr>
         <w:t>ESCUELA DE QUÍMICA Y FARMACIA</w:t>
@@ -64,7 +68,7 @@
     </w:p>
     <w:p>
       <w:pPr>
-        <w:spacing w:line="360" w:lineRule="auto" w:after="960" w:before="0"/>
+        <w:spacing w:line="360" w:lineRule="auto" w:after="1080" w:before="0"/>
         <w:jc w:val="center"/>
       </w:pPr>
       <w:r>
@@ -72,6 +76,7 @@
           <w:rFonts w:ascii="Arial" w:hAnsi="Arial"/>
           <w:b/>
           <w:i w:val="0"/>
+          <w:color w:val="000000"/>
           <w:sz w:val="28"/>
         </w:rPr>
         <w:t>SEDE CONCEPCIÓN</w:t>
@@ -79,7 +84,7 @@
     </w:p>
     <w:p>
       <w:pPr>
-        <w:spacing w:line="360" w:lineRule="auto" w:after="800" w:before="0"/>
+        <w:spacing w:line="360" w:lineRule="auto" w:after="960" w:before="0"/>
         <w:jc w:val="center"/>
       </w:pPr>
       <w:r>
@@ -87,7 +92,8 @@
           <w:rFonts w:ascii="Arial" w:hAnsi="Arial"/>
           <w:b/>
           <w:i w:val="0"/>
-          <w:sz w:val="24"/>
+          <w:color w:val="000000"/>
+          <w:sz w:val="26"/>
         </w:rPr>
         <w:t>Informe de Internado en Farmacia Asistencial y Atención Primaria de Salud</w:t>
       </w:r>
@@ -102,6 +108,7 @@
           <w:rFonts w:ascii="Arial" w:hAnsi="Arial"/>
           <w:b w:val="0"/>
           <w:i w:val="0"/>
+          <w:color w:val="000000"/>
           <w:sz w:val="24"/>
         </w:rPr>
         <w:t>Lugar de Internado</w:t>
@@ -117,14 +124,15 @@
           <w:rFonts w:ascii="Arial" w:hAnsi="Arial"/>
           <w:b/>
           <w:i w:val="0"/>
-          <w:sz w:val="28"/>
+          <w:color w:val="000000"/>
+          <w:sz w:val="26"/>
         </w:rPr>
         <w:t>Centro de Salud Familiar Villa Nonguén, Concepción</w:t>
       </w:r>
     </w:p>
     <w:p>
       <w:pPr>
-        <w:spacing w:line="360" w:lineRule="auto" w:after="40" w:before="0"/>
+        <w:spacing w:line="360" w:lineRule="auto" w:after="120" w:before="0"/>
         <w:jc w:val="center"/>
       </w:pPr>
       <w:r>
@@ -132,29 +140,15 @@
           <w:rFonts w:ascii="Arial" w:hAnsi="Arial"/>
           <w:b w:val="0"/>
           <w:i w:val="0"/>
+          <w:color w:val="000000"/>
           <w:sz w:val="24"/>
         </w:rPr>
-        <w:t>Estudiante</w:t>
+        <w:t>Estudiante: Bastián Alonso Espinoza Palma</w:t>
       </w:r>
     </w:p>
     <w:p>
       <w:pPr>
-        <w:spacing w:line="360" w:lineRule="auto" w:after="880" w:before="0"/>
-        <w:jc w:val="center"/>
-      </w:pPr>
-      <w:r>
-        <w:rPr>
-          <w:rFonts w:ascii="Arial" w:hAnsi="Arial"/>
-          <w:b/>
-          <w:i w:val="0"/>
-          <w:sz w:val="24"/>
-        </w:rPr>
-        <w:t>Bastián Alonso Espinoza Palma</w:t>
-      </w:r>
-    </w:p>
-    <w:p>
-      <w:pPr>
-        <w:spacing w:line="360" w:lineRule="auto" w:after="40" w:before="0"/>
+        <w:spacing w:line="360" w:lineRule="auto" w:after="120" w:before="0"/>
         <w:jc w:val="center"/>
       </w:pPr>
       <w:r>
@@ -162,14 +156,15 @@
           <w:rFonts w:ascii="Arial" w:hAnsi="Arial"/>
           <w:b w:val="0"/>
           <w:i w:val="0"/>
-          <w:sz w:val="22"/>
+          <w:color w:val="000000"/>
+          <w:sz w:val="24"/>
         </w:rPr>
         <w:t>Docente Tutor: Q.F. de la Unidad de Farmacia, CESFAM Villa Nonguén</w:t>
       </w:r>
     </w:p>
     <w:p>
       <w:pPr>
-        <w:spacing w:line="360" w:lineRule="auto" w:after="800" w:before="0"/>
+        <w:spacing w:line="360" w:lineRule="auto" w:after="960" w:before="0"/>
         <w:jc w:val="center"/>
       </w:pPr>
       <w:r>
@@ -177,7 +172,8 @@
           <w:rFonts w:ascii="Arial" w:hAnsi="Arial"/>
           <w:b w:val="0"/>
           <w:i w:val="0"/>
-          <w:sz w:val="22"/>
+          <w:color w:val="000000"/>
+          <w:sz w:val="24"/>
         </w:rPr>
         <w:t>Docente Supervisor: Escuela de Química y Farmacia, USS</w:t>
       </w:r>
@@ -192,6 +188,7 @@
           <w:rFonts w:ascii="Arial" w:hAnsi="Arial"/>
           <w:b w:val="0"/>
           <w:i w:val="0"/>
+          <w:color w:val="000000"/>
           <w:sz w:val="24"/>
         </w:rPr>
         <w:t>Concepción, Chile</w:t>
@@ -207,14 +204,16 @@
           <w:rFonts w:ascii="Arial" w:hAnsi="Arial"/>
           <w:b w:val="0"/>
           <w:i w:val="0"/>
+          <w:color w:val="000000"/>
           <w:sz w:val="24"/>
         </w:rPr>
-        <w:t>Julio de 2026</w:t>
+        <w:t>2026</w:t>
       </w:r>
     </w:p>
     <w:p>
       <w:pPr>
         <w:sectPr>
+          <w:footerReference w:type="default" r:id="rId9"/>
           <w:pgSz w:w="12240" w:h="15840"/>
           <w:pgMar w:top="1417" w:right="1417" w:bottom="1417" w:left="2268" w:header="720" w:footer="720" w:gutter="0"/>
           <w:cols w:space="720"/>
@@ -241,7 +240,7 @@
         <w:fldChar w:fldCharType="separate"/>
       </w:r>
       <w:r>
-        <w:t>Actualice este campo en Word (clic derecho sobre la tabla y Actualizar campos).</w:t>
+        <w:t>Actualice este campo en Word: seleccione todo (Ctrl+E) y presione F9.</w:t>
       </w:r>
       <w:r>
         <w:fldChar w:fldCharType="end"/>
@@ -271,7 +270,7 @@
         <w:fldChar w:fldCharType="separate"/>
       </w:r>
       <w:r>
-        <w:t>Actualice este campo en Word (clic derecho y Actualizar campos).</w:t>
+        <w:t>Actualice este campo en Word (F9).</w:t>
       </w:r>
       <w:r>
         <w:fldChar w:fldCharType="end"/>
@@ -296,7 +295,7 @@
         <w:fldChar w:fldCharType="separate"/>
       </w:r>
       <w:r>
-        <w:t>Actualice este campo en Word (clic derecho y Actualizar campos).</w:t>
+        <w:t>Actualice este campo en Word (F9).</w:t>
       </w:r>
       <w:r>
         <w:fldChar w:fldCharType="end"/>
@@ -678,7 +677,7 @@
     <w:p>
       <w:pPr>
         <w:sectPr>
-          <w:footerReference w:type="default" r:id="rId9"/>
+          <w:footerReference w:type="default" r:id="rId10"/>
           <w:pgSz w:w="12240" w:h="15840"/>
           <w:pgMar w:top="1417" w:right="1417" w:bottom="1417" w:left="2268" w:header="720" w:footer="720" w:gutter="0"/>
           <w:cols w:space="720"/>
@@ -692,16 +691,21 @@
         <w:pStyle w:val="Heading1"/>
       </w:pPr>
       <w:r>
-        <w:t>INTRODUCCIÓN</w:t>
+        <w:t>1. INTRODUCCIÓN</w:t>
       </w:r>
     </w:p>
     <w:p>
+      <w:pPr>
+        <w:jc w:val="both"/>
+      </w:pPr>
       <w:r>
         <w:rPr>
+          <w:rFonts w:ascii="Arial" w:hAnsi="Arial"/>
           <w:b w:val="0"/>
           <w:i w:val="0"/>
+          <w:sz w:val="24"/>
         </w:rPr>
-        <w:t>El presente informe reúne la experiencia desarrollada durante el Internado en Farmacia Asistencial y Atención Primaria de Salud, realizado en la unidad de farmacia del Centro de Salud Familiar (CESFAM) Villa Nonguén, en la comuna de Concepción, Región del Biobío. El internado corresponde a una actividad obligatoria del plan de estudios de la carrera de Química y Farmacia, cuyo propósito es que el estudiante adquiera experiencia directa del quehacer profesional del químico farmacéutico en un establecimiento de ejercicio real, bajo la supervisión de un profesional del área. La atención primaria constituye la puerta de entrada al sistema público de salud y, dentro de ella, la farmacia cumple un rol central en el acceso a los medicamentos y en el uso seguro y racional de la farmacoterapia por parte de la población (Ministerio de Salud de Chile, 2018b).</w:t>
+        <w:t>El presente informe reúne la experiencia desarrollada durante el Internado en Farmacia Asistencial y Atención Primaria de Salud, realizado en la unidad de farmacia del Centro de Salud Familiar (CESFAM) Villa Nonguén, en la comuna de Concepción, Región del Biobío, entre el 11 de mayo y el 10 de julio de 2026. El internado corresponde a una actividad obligatoria del plan de estudios de la carrera de Química y Farmacia, cuyo propósito es que el estudiante adquiera experiencia directa del quehacer profesional del químico farmacéutico en un establecimiento de ejercicio real, bajo la supervisión de un profesional del área. La atención primaria constituye la puerta de entrada al sistema público de salud y, dentro de ella, la farmacia cumple un rol central en el acceso a los medicamentos y en el uso seguro y racional de la farmacoterapia por parte de la población (Ministerio de Salud de Chile, 2018b).</w:t>
       </w:r>
     </w:p>
     <w:p>
@@ -709,23 +713,33 @@
         <w:pStyle w:val="Heading2"/>
       </w:pPr>
       <w:r>
-        <w:t>Aspectos generales del centro de internado</w:t>
+        <w:t>1.1 Aspectos generales del centro de internado</w:t>
       </w:r>
     </w:p>
     <w:p>
+      <w:pPr>
+        <w:jc w:val="both"/>
+      </w:pPr>
       <w:r>
         <w:rPr>
+          <w:rFonts w:ascii="Arial" w:hAnsi="Arial"/>
           <w:b w:val="0"/>
           <w:i w:val="0"/>
+          <w:sz w:val="24"/>
         </w:rPr>
-        <w:t>El CESFAM Villa Nonguén es un establecimiento del nivel primario de atención, ubicado en Río Loa 1397, en el sector de Nonguén, en la periferia oriente de Concepción, e integrado a la red asistencial del Servicio de Salud Concepción. Su origen se remonta a 1987, cuando profesionales de la entonces Octava Región, con el apoyo de la organización italiana CESTAS y financiamiento de la cooperación del Gobierno de Italia y de la Unión Europea, elaboraron un proyecto de salud comunitaria para el sector. El establecimiento inició sus funciones asistenciales en 1991 y, en 1993, fue seleccionado por el Ministerio de Salud como uno de los centros piloto para implementar el Modelo de Salud Familiar y el financiamiento per cápita en el país (Diario Concepción, 2017). Desde entonces funciona bajo la modalidad de administración delegada, a cargo de la Corporación de Salud y Desarrollo Social (COSADES), lo que le permite formar parte de la red pública manteniendo cierta autonomía en su gestión (COSADES, s.f.).</w:t>
+        <w:t>El CESFAM Villa Nonguén es un establecimiento del nivel primario de atención, ubicado en Río Loa 1397, en el sector de Nonguén, en la periferia oriente de Concepción, e integrado a la red asistencial del Servicio de Salud Concepción. Su origen se remonta a 1987, cuando profesionales de la entonces Octava Región, con apoyo de la cooperación internacional, elaboraron un proyecto de salud comunitaria para el sector. El establecimiento inició sus funciones asistenciales en 1991 y, en 1993, fue seleccionado por el Ministerio de Salud como uno de los centros pioneros en implementar el Modelo de Salud Familiar y el financiamiento per cápita en el país (Diario Concepción, 2017). Desde entonces funciona bajo la modalidad de administración delegada, a cargo de la Corporación de Salud y Desarrollo Social (COSADES), lo que le permite formar parte de la red pública manteniendo cierta autonomía en su gestión (COSADES, s.f.).</w:t>
       </w:r>
     </w:p>
     <w:p>
+      <w:pPr>
+        <w:jc w:val="both"/>
+      </w:pPr>
       <w:r>
         <w:rPr>
+          <w:rFonts w:ascii="Arial" w:hAnsi="Arial"/>
           <w:b w:val="0"/>
           <w:i w:val="0"/>
+          <w:sz w:val="24"/>
         </w:rPr>
         <w:t>El centro atiende a una población inscrita validada cercana a las 16.760 personas, organizada en torno a unas 5.560 familias, con un promedio de 3,1 integrantes por grupo familiar, y entrega prestaciones a todos los grupos del ciclo vital, desde la gestación hasta la persona mayor. Para ordenar la atención, el territorio se divide en cuatro sectores identificados por colores (verde, azul, café y blanco), lo que facilita la planificación de los controles, las visitas domiciliarias y las actividades comunitarias según el lugar de residencia de los usuarios. La dotación total del establecimiento alcanza los 122 funcionarios distribuidos en distintas profesiones y oficios, y contempla una jornada diurna y otra vespertina. La Tabla 1 resume los principales antecedentes del centro y la Tabla 2 detalla su dotación de personal.</w:t>
       </w:r>
@@ -816,7 +830,7 @@
           </w:tcPr>
           <w:p>
             <w:pPr>
-              <w:spacing w:after="40"/>
+              <w:spacing w:after="40" w:line="240" w:lineRule="auto"/>
               <w:jc w:val="left"/>
             </w:pPr>
             <w:r/>
@@ -835,7 +849,7 @@
           </w:tcPr>
           <w:p>
             <w:pPr>
-              <w:spacing w:after="40"/>
+              <w:spacing w:after="40" w:line="240" w:lineRule="auto"/>
               <w:jc w:val="left"/>
             </w:pPr>
             <w:r/>
@@ -856,7 +870,7 @@
           </w:tcPr>
           <w:p>
             <w:pPr>
-              <w:spacing w:after="40"/>
+              <w:spacing w:after="40" w:line="240" w:lineRule="auto"/>
               <w:jc w:val="left"/>
             </w:pPr>
             <w:r/>
@@ -875,7 +889,7 @@
           </w:tcPr>
           <w:p>
             <w:pPr>
-              <w:spacing w:after="40"/>
+              <w:spacing w:after="40" w:line="240" w:lineRule="auto"/>
               <w:jc w:val="left"/>
             </w:pPr>
             <w:r/>
@@ -896,7 +910,7 @@
           </w:tcPr>
           <w:p>
             <w:pPr>
-              <w:spacing w:after="40"/>
+              <w:spacing w:after="40" w:line="240" w:lineRule="auto"/>
               <w:jc w:val="left"/>
             </w:pPr>
             <w:r/>
@@ -915,7 +929,7 @@
           </w:tcPr>
           <w:p>
             <w:pPr>
-              <w:spacing w:after="40"/>
+              <w:spacing w:after="40" w:line="240" w:lineRule="auto"/>
               <w:jc w:val="left"/>
             </w:pPr>
             <w:r/>
@@ -936,7 +950,7 @@
           </w:tcPr>
           <w:p>
             <w:pPr>
-              <w:spacing w:after="40"/>
+              <w:spacing w:after="40" w:line="240" w:lineRule="auto"/>
               <w:jc w:val="left"/>
             </w:pPr>
             <w:r/>
@@ -955,7 +969,7 @@
           </w:tcPr>
           <w:p>
             <w:pPr>
-              <w:spacing w:after="40"/>
+              <w:spacing w:after="40" w:line="240" w:lineRule="auto"/>
               <w:jc w:val="left"/>
             </w:pPr>
             <w:r/>
@@ -976,7 +990,7 @@
           </w:tcPr>
           <w:p>
             <w:pPr>
-              <w:spacing w:after="40"/>
+              <w:spacing w:after="40" w:line="240" w:lineRule="auto"/>
               <w:jc w:val="left"/>
             </w:pPr>
             <w:r/>
@@ -995,7 +1009,7 @@
           </w:tcPr>
           <w:p>
             <w:pPr>
-              <w:spacing w:after="40"/>
+              <w:spacing w:after="40" w:line="240" w:lineRule="auto"/>
               <w:jc w:val="left"/>
             </w:pPr>
             <w:r/>
@@ -1016,7 +1030,7 @@
           </w:tcPr>
           <w:p>
             <w:pPr>
-              <w:spacing w:after="40"/>
+              <w:spacing w:after="40" w:line="240" w:lineRule="auto"/>
               <w:jc w:val="left"/>
             </w:pPr>
             <w:r/>
@@ -1035,7 +1049,7 @@
           </w:tcPr>
           <w:p>
             <w:pPr>
-              <w:spacing w:after="40"/>
+              <w:spacing w:after="40" w:line="240" w:lineRule="auto"/>
               <w:jc w:val="left"/>
             </w:pPr>
             <w:r/>
@@ -1056,7 +1070,7 @@
           </w:tcPr>
           <w:p>
             <w:pPr>
-              <w:spacing w:after="40"/>
+              <w:spacing w:after="40" w:line="240" w:lineRule="auto"/>
               <w:jc w:val="left"/>
             </w:pPr>
             <w:r/>
@@ -1075,7 +1089,7 @@
           </w:tcPr>
           <w:p>
             <w:pPr>
-              <w:spacing w:after="40"/>
+              <w:spacing w:after="40" w:line="240" w:lineRule="auto"/>
               <w:jc w:val="left"/>
             </w:pPr>
             <w:r/>
@@ -1218,7 +1232,7 @@
           </w:tcPr>
           <w:p>
             <w:pPr>
-              <w:spacing w:after="40"/>
+              <w:spacing w:after="40" w:line="240" w:lineRule="auto"/>
               <w:jc w:val="left"/>
             </w:pPr>
             <w:r/>
@@ -1237,7 +1251,7 @@
           </w:tcPr>
           <w:p>
             <w:pPr>
-              <w:spacing w:after="40"/>
+              <w:spacing w:after="40" w:line="240" w:lineRule="auto"/>
               <w:jc w:val="left"/>
             </w:pPr>
             <w:r/>
@@ -1256,7 +1270,7 @@
           </w:tcPr>
           <w:p>
             <w:pPr>
-              <w:spacing w:after="40"/>
+              <w:spacing w:after="40" w:line="240" w:lineRule="auto"/>
               <w:jc w:val="left"/>
             </w:pPr>
             <w:r/>
@@ -1275,7 +1289,7 @@
           </w:tcPr>
           <w:p>
             <w:pPr>
-              <w:spacing w:after="40"/>
+              <w:spacing w:after="40" w:line="240" w:lineRule="auto"/>
               <w:jc w:val="left"/>
             </w:pPr>
             <w:r/>
@@ -1296,7 +1310,7 @@
           </w:tcPr>
           <w:p>
             <w:pPr>
-              <w:spacing w:after="40"/>
+              <w:spacing w:after="40" w:line="240" w:lineRule="auto"/>
               <w:jc w:val="left"/>
             </w:pPr>
             <w:r/>
@@ -1315,7 +1329,7 @@
           </w:tcPr>
           <w:p>
             <w:pPr>
-              <w:spacing w:after="40"/>
+              <w:spacing w:after="40" w:line="240" w:lineRule="auto"/>
               <w:jc w:val="left"/>
             </w:pPr>
             <w:r/>
@@ -1334,7 +1348,7 @@
           </w:tcPr>
           <w:p>
             <w:pPr>
-              <w:spacing w:after="40"/>
+              <w:spacing w:after="40" w:line="240" w:lineRule="auto"/>
               <w:jc w:val="left"/>
             </w:pPr>
             <w:r/>
@@ -1353,7 +1367,7 @@
           </w:tcPr>
           <w:p>
             <w:pPr>
-              <w:spacing w:after="40"/>
+              <w:spacing w:after="40" w:line="240" w:lineRule="auto"/>
               <w:jc w:val="left"/>
             </w:pPr>
             <w:r/>
@@ -1374,7 +1388,7 @@
           </w:tcPr>
           <w:p>
             <w:pPr>
-              <w:spacing w:after="40"/>
+              <w:spacing w:after="40" w:line="240" w:lineRule="auto"/>
               <w:jc w:val="left"/>
             </w:pPr>
             <w:r/>
@@ -1393,7 +1407,7 @@
           </w:tcPr>
           <w:p>
             <w:pPr>
-              <w:spacing w:after="40"/>
+              <w:spacing w:after="40" w:line="240" w:lineRule="auto"/>
               <w:jc w:val="left"/>
             </w:pPr>
             <w:r/>
@@ -1412,7 +1426,7 @@
           </w:tcPr>
           <w:p>
             <w:pPr>
-              <w:spacing w:after="40"/>
+              <w:spacing w:after="40" w:line="240" w:lineRule="auto"/>
               <w:jc w:val="left"/>
             </w:pPr>
             <w:r/>
@@ -1431,7 +1445,7 @@
           </w:tcPr>
           <w:p>
             <w:pPr>
-              <w:spacing w:after="40"/>
+              <w:spacing w:after="40" w:line="240" w:lineRule="auto"/>
               <w:jc w:val="left"/>
             </w:pPr>
             <w:r/>
@@ -1452,7 +1466,7 @@
           </w:tcPr>
           <w:p>
             <w:pPr>
-              <w:spacing w:after="40"/>
+              <w:spacing w:after="40" w:line="240" w:lineRule="auto"/>
               <w:jc w:val="left"/>
             </w:pPr>
             <w:r/>
@@ -1471,7 +1485,7 @@
           </w:tcPr>
           <w:p>
             <w:pPr>
-              <w:spacing w:after="40"/>
+              <w:spacing w:after="40" w:line="240" w:lineRule="auto"/>
               <w:jc w:val="left"/>
             </w:pPr>
             <w:r/>
@@ -1490,7 +1504,7 @@
           </w:tcPr>
           <w:p>
             <w:pPr>
-              <w:spacing w:after="40"/>
+              <w:spacing w:after="40" w:line="240" w:lineRule="auto"/>
               <w:jc w:val="left"/>
             </w:pPr>
             <w:r/>
@@ -1509,7 +1523,7 @@
           </w:tcPr>
           <w:p>
             <w:pPr>
-              <w:spacing w:after="40"/>
+              <w:spacing w:after="40" w:line="240" w:lineRule="auto"/>
               <w:jc w:val="left"/>
             </w:pPr>
             <w:r/>
@@ -1530,7 +1544,7 @@
           </w:tcPr>
           <w:p>
             <w:pPr>
-              <w:spacing w:after="40"/>
+              <w:spacing w:after="40" w:line="240" w:lineRule="auto"/>
               <w:jc w:val="left"/>
             </w:pPr>
             <w:r/>
@@ -1549,7 +1563,7 @@
           </w:tcPr>
           <w:p>
             <w:pPr>
-              <w:spacing w:after="40"/>
+              <w:spacing w:after="40" w:line="240" w:lineRule="auto"/>
               <w:jc w:val="left"/>
             </w:pPr>
             <w:r/>
@@ -1568,7 +1582,7 @@
           </w:tcPr>
           <w:p>
             <w:pPr>
-              <w:spacing w:after="40"/>
+              <w:spacing w:after="40" w:line="240" w:lineRule="auto"/>
               <w:jc w:val="left"/>
             </w:pPr>
             <w:r/>
@@ -1587,7 +1601,7 @@
           </w:tcPr>
           <w:p>
             <w:pPr>
-              <w:spacing w:after="40"/>
+              <w:spacing w:after="40" w:line="240" w:lineRule="auto"/>
               <w:jc w:val="left"/>
             </w:pPr>
             <w:r/>
@@ -1608,7 +1622,7 @@
           </w:tcPr>
           <w:p>
             <w:pPr>
-              <w:spacing w:after="40"/>
+              <w:spacing w:after="40" w:line="240" w:lineRule="auto"/>
               <w:jc w:val="left"/>
             </w:pPr>
             <w:r/>
@@ -1627,7 +1641,7 @@
           </w:tcPr>
           <w:p>
             <w:pPr>
-              <w:spacing w:after="40"/>
+              <w:spacing w:after="40" w:line="240" w:lineRule="auto"/>
               <w:jc w:val="left"/>
             </w:pPr>
             <w:r/>
@@ -1646,7 +1660,7 @@
           </w:tcPr>
           <w:p>
             <w:pPr>
-              <w:spacing w:after="40"/>
+              <w:spacing w:after="40" w:line="240" w:lineRule="auto"/>
               <w:jc w:val="left"/>
             </w:pPr>
             <w:r/>
@@ -1665,7 +1679,7 @@
           </w:tcPr>
           <w:p>
             <w:pPr>
-              <w:spacing w:after="40"/>
+              <w:spacing w:after="40" w:line="240" w:lineRule="auto"/>
               <w:jc w:val="left"/>
             </w:pPr>
             <w:r/>
@@ -1686,7 +1700,7 @@
           </w:tcPr>
           <w:p>
             <w:pPr>
-              <w:spacing w:after="40"/>
+              <w:spacing w:after="40" w:line="240" w:lineRule="auto"/>
               <w:jc w:val="left"/>
             </w:pPr>
             <w:r/>
@@ -1705,7 +1719,7 @@
           </w:tcPr>
           <w:p>
             <w:pPr>
-              <w:spacing w:after="40"/>
+              <w:spacing w:after="40" w:line="240" w:lineRule="auto"/>
               <w:jc w:val="left"/>
             </w:pPr>
             <w:r/>
@@ -1724,7 +1738,7 @@
           </w:tcPr>
           <w:p>
             <w:pPr>
-              <w:spacing w:after="40"/>
+              <w:spacing w:after="40" w:line="240" w:lineRule="auto"/>
               <w:jc w:val="left"/>
             </w:pPr>
             <w:r/>
@@ -1733,7 +1747,7 @@
                 <w:rFonts w:ascii="Arial" w:hAnsi="Arial"/>
                 <w:sz w:val="20"/>
               </w:rPr>
-              <w:t>Otros (administrativos y de apoyo)</w:t>
+              <w:t>Otros (apoyo administrativo)</w:t>
             </w:r>
           </w:p>
         </w:tc>
@@ -1743,7 +1757,7 @@
           </w:tcPr>
           <w:p>
             <w:pPr>
-              <w:spacing w:after="40"/>
+              <w:spacing w:after="40" w:line="240" w:lineRule="auto"/>
               <w:jc w:val="left"/>
             </w:pPr>
             <w:r/>
@@ -1761,9 +1775,11 @@
     <w:p>
       <w:pPr>
         <w:spacing w:after="200"/>
+        <w:jc w:val="both"/>
       </w:pPr>
       <w:r>
         <w:rPr>
+          <w:rFonts w:ascii="Arial" w:hAnsi="Arial"/>
           <w:b w:val="0"/>
           <w:i/>
           <w:sz w:val="20"/>
@@ -1776,16 +1792,21 @@
         <w:pStyle w:val="Heading2"/>
       </w:pPr>
       <w:r>
-        <w:t>Organigrama y distribución de la unidad de farmacia</w:t>
+        <w:t>1.2 Organigrama y distribución de la unidad de farmacia</w:t>
       </w:r>
     </w:p>
     <w:p>
+      <w:pPr>
+        <w:jc w:val="both"/>
+      </w:pPr>
       <w:r>
         <w:rPr>
+          <w:rFonts w:ascii="Arial" w:hAnsi="Arial"/>
           <w:b w:val="0"/>
           <w:i w:val="0"/>
+          <w:sz w:val="24"/>
         </w:rPr>
-        <w:t>La unidad de farmacia se organiza bajo la responsabilidad de un químico farmacéutico que ejerce la dirección técnica y responde por el funcionamiento general de la unidad, el cumplimiento normativo y la gestión del arsenal farmacoterapéutico. Un segundo químico farmacéutico se dedica de manera preferente a la atención farmacéutica, tanto en box como en las visitas domiciliarias del Programa de Salud Cardiovascular, y un equipo permanente de cuatro técnicos en enfermería de nivel superior (TENS) apoya las tareas de recepción, almacenamiento, fraccionamiento, reenvasado y dispensación. El interno de Química y Farmacia se integró a este equipo durante toda la rotación. La Figura 1 presenta el organigrama de la unidad.</w:t>
+        <w:t>La unidad de farmacia se organiza bajo la responsabilidad de un químico farmacéutico que ejerce la dirección técnica y responde por el funcionamiento general de la unidad, el cumplimiento normativo y la gestión del arsenal farmacoterapéutico. Un segundo químico farmacéutico se dedica de manera preferente a la atención farmacéutica, tanto en box como en las visitas domiciliarias del Programa de Salud Cardiovascular, y un equipo permanente de cuatro técnicos en enfermería de nivel superior (TENS) apoya las tareas de recepción, almacenamiento, fraccionamiento, reenvasado y dispensación. El interno de Química y Farmacia se integró a este equipo durante toda la rotación. La Figura 1 presenta el organigrama de la unidad, con los químicos farmacéuticos y los técnicos que componen el equipo.</w:t>
       </w:r>
     </w:p>
     <w:p>
@@ -1796,7 +1817,7 @@
       <w:r>
         <w:drawing>
           <wp:inline xmlns:a="http://schemas.openxmlformats.org/drawingml/2006/main" xmlns:pic="http://schemas.openxmlformats.org/drawingml/2006/picture">
-            <wp:extent cx="4860000" cy="3363793"/>
+            <wp:extent cx="5400000" cy="3552632"/>
             <wp:docPr id="1" name="Picture 1"/>
             <wp:cNvGraphicFramePr>
               <a:graphicFrameLocks noChangeAspect="1"/>
@@ -1809,7 +1830,7 @@
                     <pic:cNvPicPr/>
                   </pic:nvPicPr>
                   <pic:blipFill>
-                    <a:blip r:embed="rId11"/>
+                    <a:blip r:embed="rId12"/>
                     <a:stretch>
                       <a:fillRect/>
                     </a:stretch>
@@ -1817,7 +1838,7 @@
                   <pic:spPr>
                     <a:xfrm>
                       <a:off x="0" y="0"/>
-                      <a:ext cx="4860000" cy="3363793"/>
+                      <a:ext cx="5400000" cy="3552632"/>
                     </a:xfrm>
                     <a:prstGeom prst="rect"/>
                   </pic:spPr>
@@ -1859,23 +1880,33 @@
         <w:pStyle w:val="Heading2"/>
       </w:pPr>
       <w:r>
-        <w:t>Servicios que brinda el centro</w:t>
+        <w:t>1.3 Servicios que brinda el centro</w:t>
       </w:r>
     </w:p>
     <w:p>
+      <w:pPr>
+        <w:jc w:val="both"/>
+      </w:pPr>
       <w:r>
         <w:rPr>
+          <w:rFonts w:ascii="Arial" w:hAnsi="Arial"/>
           <w:b w:val="0"/>
           <w:i w:val="0"/>
+          <w:sz w:val="24"/>
         </w:rPr>
-        <w:t>El CESFAM Villa Nonguén entrega una atención integral y continua a lo largo del curso de vida, con acciones de promoción, prevención, tratamiento y rehabilitación. Su cartera de prestaciones incluye, entre otros, el Programa de Salud de la Mujer, el Programa Nacional de Salud de la Infancia, el Programa de Salud Integral del Adolescente, el Programa de Salud Cardiovascular, el Programa de Salud Mental, el Programa Nacional de Salud Integral de Personas Mayores, el Programa de Salud Familiar y el Programa VIH/ITS. A ello se suman prestaciones de procedimientos, vacunatorio, toma de muestras, salud dental, controles de salud, exámenes preventivos y atención domiciliaria, junto con la entrega de alimentos de los programas PNAC y PACAM en el hall central del establecimiento.</w:t>
+        <w:t>El CESFAM Villa Nonguén entrega una atención integral y continua a lo largo del curso de vida, con acciones de promoción, prevención, tratamiento y rehabilitación. Su cartera de prestaciones incluye, entre otros, el Programa de Salud de la Mujer, el Programa Nacional de Salud de la Infancia, el Programa de Salud Integral del Adolescente, el Programa de Salud Cardiovascular, el Programa de Salud Mental, el Programa Nacional de Salud Integral de Personas Mayores, el Programa de Salud Familiar y el Programa VIH/ITS. A ello se suman prestaciones de procedimientos, vacunatorio, toma de muestras, salud dental, controles de salud, exámenes preventivos y atención domiciliaria, junto con la entrega de alimentos de los programas PNAC y PACAM.</w:t>
       </w:r>
     </w:p>
     <w:p>
+      <w:pPr>
+        <w:jc w:val="both"/>
+      </w:pPr>
       <w:r>
         <w:rPr>
+          <w:rFonts w:ascii="Arial" w:hAnsi="Arial"/>
           <w:b w:val="0"/>
           <w:i w:val="0"/>
+          <w:sz w:val="24"/>
         </w:rPr>
         <w:t>La unidad de farmacia participa de manera transversal en estos programas a través de la entrega de medicamentos, el fraccionamiento y reenvasado según las indicaciones, el control del arsenal y de los medicamentos sujetos a control legal, y la atención farmacéutica orientada al uso seguro y racional de la terapia. Dentro del Programa de Salud Cardiovascular, el químico farmacéutico acompaña a los usuarios en box y en su domicilio, con seguimiento farmacoterapéutico, educación y revisión de la medicación, y participa en la gestión del Fondo de Farmacia (FOFAR), que financia su presencia en la atención primaria y el acceso a los medicamentos para la hipertensión, la diabetes y la dislipidemia (Ministerio de Salud de Chile, 2020).</w:t>
       </w:r>
@@ -1885,37 +1916,71 @@
         <w:pStyle w:val="Heading2"/>
       </w:pPr>
       <w:r>
-        <w:t>Terminología y definiciones</w:t>
+        <w:t>1.4 Marco teórico</w:t>
       </w:r>
     </w:p>
     <w:p>
+      <w:pPr>
+        <w:jc w:val="both"/>
+      </w:pPr>
       <w:r>
         <w:rPr>
+          <w:rFonts w:ascii="Arial" w:hAnsi="Arial"/>
           <w:b w:val="0"/>
           <w:i w:val="0"/>
+          <w:sz w:val="24"/>
         </w:rPr>
-        <w:t>Para facilitar la lectura del informe se precisan a continuación algunos términos propios del trabajo desarrollado en la unidad de farmacia.</w:t>
+        <w:t>La atención farmacéutica se entiende hoy como la participación del farmacéutico en el cuidado de la persona para aprovechar mejor sus medicamentos y mejorar sus resultados en salud. Bonal y colaboradores la describen como el proceso por el cual el farmacéutico coopera con el paciente y con el resto del equipo en el diseño, la ejecución y el seguimiento de un plan terapéutico orientado a metas concretas (Bonal et al., 2003). Este enfoque supone un cambio respecto del modelo clásico, centrado en entregar el medicamento, hacia otro que se preocupa de lo que ocurre con ese medicamento una vez que el paciente lo lleva a su casa.</w:t>
       </w:r>
     </w:p>
     <w:p>
       <w:pPr>
-        <w:spacing w:line="360" w:lineRule="auto" w:after="80"/>
         <w:jc w:val="both"/>
       </w:pPr>
       <w:r>
         <w:rPr>
           <w:rFonts w:ascii="Arial" w:hAnsi="Arial"/>
-          <w:b/>
+          <w:b w:val="0"/>
+          <w:i w:val="0"/>
           <w:sz w:val="24"/>
         </w:rPr>
-        <w:t xml:space="preserve">Atención farmacéutica: </w:t>
+        <w:t>En la atención primaria chilena, la incorporación del químico farmacéutico a los equipos ha permitido acercar esta labor a la comunidad, con especial relevancia en las enfermedades crónicas. La Encuesta Nacional de Salud estimó que cerca del 27,6% de la población tiene sospecha de hipertensión, un 12,3% diabetes tipo 2 y alrededor del 60% algún grado de dislipidemia (Ministerio de Salud de Chile, 2017a), condiciones que se atienden principalmente a través del Programa de Salud Cardiovascular. Ahora bien, que un tratamiento esté indicado no asegura que el paciente lo tome como corresponde. La adherencia, entendida como el grado en que la persona sigue las indicaciones acordadas con el equipo de salud, es uno de los factores que más influye en el control de estas enfermedades y suele ser baja en quienes usan varios medicamentos a la vez (Haynes et al., 1979; Martín Alfonso, 2004). Para medirla de forma sencilla se utilizan instrumentos como el test de Morisky-Green-Levine (Morisky et al., 1986), y para clasificar los problemas detectados se recurre al Tercer Consenso de Granada, que ordena los resultados negativos asociados a la medicación según si el tratamiento es necesario, efectivo y seguro (Comité de Consenso de Granada, 2007).</w:t>
       </w:r>
+    </w:p>
+    <w:p>
+      <w:pPr>
+        <w:jc w:val="both"/>
+      </w:pPr>
       <w:r>
         <w:rPr>
           <w:rFonts w:ascii="Arial" w:hAnsi="Arial"/>
+          <w:b w:val="0"/>
+          <w:i w:val="0"/>
           <w:sz w:val="24"/>
         </w:rPr>
-        <w:t>participación del farmacéutico en el cuidado de la persona para aprovechar mejor sus medicamentos y mejorar sus resultados en salud, cooperando con el paciente y el equipo en el diseño, la ejecución y el seguimiento de un plan terapéutico (Bonal et al., 2003).</w:t>
+        <w:t>El marco que hoy se usa como referencia para modernizar la atención farmacéutica es el Modelo CMO, sigla de Capacidad, Motivación y Oportunidad, desarrollado en España y validado por su sociedad de farmacia hospitalaria (Calleja Hernández &amp; Morillo Verdugo, 2016). Su valor está en que ordena la atención en torno a tres ideas que pueden llevarse al domicilio del paciente. La Capacidad tiene que ver con priorizar, es decir, concentrar el tiempo en los pacientes que más lo necesitan según criterios de riesgo y complejidad (Manzano García &amp; Morillo Verdugo, 2018). La Motivación pone el foco en la relación con el paciente y en su adherencia, trabajando mediante la entrevista motivacional las creencias y dificultades que llevan a no tomar bien el tratamiento. La Oportunidad, por último, busca llegar al paciente más allá del box, en su casa o por teléfono, para resolver a tiempo lo que vaya surgiendo. Estos tres pilares son los que dan forma al protocolo desarrollado como seminario de título durante el internado, descrito en la sección 2.4.</w:t>
+      </w:r>
+    </w:p>
+    <w:p>
+      <w:pPr>
+        <w:pStyle w:val="Heading2"/>
+      </w:pPr>
+      <w:r>
+        <w:t>1.5 Terminología y definiciones</w:t>
+      </w:r>
+    </w:p>
+    <w:p>
+      <w:pPr>
+        <w:jc w:val="both"/>
+      </w:pPr>
+      <w:r>
+        <w:rPr>
+          <w:rFonts w:ascii="Arial" w:hAnsi="Arial"/>
+          <w:b w:val="0"/>
+          <w:i w:val="0"/>
+          <w:sz w:val="24"/>
+        </w:rPr>
+        <w:t>Para facilitar la lectura del informe se precisan a continuación algunos términos propios del trabajo desarrollado en la unidad de farmacia.</w:t>
       </w:r>
     </w:p>
     <w:p>
@@ -1992,6 +2057,27 @@
           <w:b/>
           <w:sz w:val="24"/>
         </w:rPr>
+        <w:t xml:space="preserve">Conciliación de la medicación: </w:t>
+      </w:r>
+      <w:r>
+        <w:rPr>
+          <w:rFonts w:ascii="Arial" w:hAnsi="Arial"/>
+          <w:sz w:val="24"/>
+        </w:rPr>
+        <w:t>comparación entre la medicación que el paciente tiene indicada y la que realmente utiliza, para acordar los cambios que correspondan (Delgado et al., 2007).</w:t>
+      </w:r>
+    </w:p>
+    <w:p>
+      <w:pPr>
+        <w:spacing w:line="360" w:lineRule="auto" w:after="80"/>
+        <w:jc w:val="both"/>
+      </w:pPr>
+      <w:r>
+        <w:rPr>
+          <w:rFonts w:ascii="Arial" w:hAnsi="Arial"/>
+          <w:b/>
+          <w:sz w:val="24"/>
+        </w:rPr>
         <w:t xml:space="preserve">Problemas relacionados con los medicamentos (PRM): </w:t>
       </w:r>
       <w:r>
@@ -2020,61 +2106,58 @@
           <w:rFonts w:ascii="Arial" w:hAnsi="Arial"/>
           <w:sz w:val="24"/>
         </w:rPr>
-        <w:t>resultados en la salud del paciente que no se corresponden con los objetivos de la farmacoterapia y que se clasifican según necesidad, efectividad y seguridad (Comité de Consenso de Granada, 2007).</w:t>
+        <w:t>resultados en la salud del paciente que no se corresponden con los objetivos de la farmacoterapia (Comité de Consenso de Granada, 2007).</w:t>
       </w:r>
     </w:p>
     <w:p>
       <w:pPr>
-        <w:spacing w:line="360" w:lineRule="auto" w:after="80"/>
+        <w:pStyle w:val="Heading2"/>
+      </w:pPr>
+      <w:r>
+        <w:t>1.6 Objetivos</w:t>
+      </w:r>
+    </w:p>
+    <w:p>
+      <w:pPr>
+        <w:pStyle w:val="Heading3"/>
+      </w:pPr>
+      <w:r>
+        <w:t>1.6.1 Objetivo general</w:t>
+      </w:r>
+    </w:p>
+    <w:p>
+      <w:pPr>
         <w:jc w:val="both"/>
       </w:pPr>
       <w:r>
         <w:rPr>
           <w:rFonts w:ascii="Arial" w:hAnsi="Arial"/>
-          <w:b/>
+          <w:b w:val="0"/>
+          <w:i w:val="0"/>
           <w:sz w:val="24"/>
         </w:rPr>
-        <w:t xml:space="preserve">Modelo CMO: </w:t>
+        <w:t>Desarrollar las competencias profesionales del químico farmacéutico en el ámbito de la farmacia asistencial y la atención primaria de salud durante el internado en el CESFAM Villa Nonguén.</w:t>
       </w:r>
+    </w:p>
+    <w:p>
+      <w:pPr>
+        <w:pStyle w:val="Heading3"/>
+      </w:pPr>
+      <w:r>
+        <w:t>1.6.2 Objetivos específicos</w:t>
+      </w:r>
+    </w:p>
+    <w:p>
+      <w:pPr>
+        <w:pStyle w:val="ListNumber"/>
+        <w:spacing w:line="360" w:lineRule="auto"/>
+      </w:pPr>
       <w:r>
         <w:rPr>
           <w:rFonts w:ascii="Arial" w:hAnsi="Arial"/>
           <w:sz w:val="24"/>
         </w:rPr>
-        <w:t>marco de atención farmacéutica que ordena el trabajo en torno a tres pilares, Capacidad, Motivación y Oportunidad, orientado a priorizar a los pacientes más complejos, trabajar la adherencia y dar continuidad al seguimiento (Calleja Hernández y Morillo Verdugo, 2016).</w:t>
-      </w:r>
-    </w:p>
-    <w:p>
-      <w:pPr>
-        <w:pStyle w:val="Heading2"/>
-      </w:pPr>
-      <w:r>
-        <w:t>Objetivos</w:t>
-      </w:r>
-    </w:p>
-    <w:p>
-      <w:pPr>
-        <w:pStyle w:val="Heading3"/>
-      </w:pPr>
-      <w:r>
-        <w:t>Objetivo general</w:t>
-      </w:r>
-    </w:p>
-    <w:p>
-      <w:r>
-        <w:rPr>
-          <w:b w:val="0"/>
-          <w:i w:val="0"/>
-        </w:rPr>
-        <w:t>Desarrollar las competencias profesionales del químico farmacéutico en el ámbito de la farmacia asistencial y la atención primaria de salud, mediante la integración al equipo de la unidad de farmacia del CESFAM Villa Nonguén y la participación en sus procesos técnicos y clínicos durante el periodo de internado.</w:t>
-      </w:r>
-    </w:p>
-    <w:p>
-      <w:pPr>
-        <w:pStyle w:val="Heading3"/>
-      </w:pPr>
-      <w:r>
-        <w:t>Objetivos específicos</w:t>
+        <w:t>Reconocer la estructura organizacional y las funciones del equipo de la unidad de farmacia del CESFAM Villa Nonguén.</w:t>
       </w:r>
     </w:p>
     <w:p>
@@ -2087,7 +2170,7 @@
           <w:rFonts w:ascii="Arial" w:hAnsi="Arial"/>
           <w:sz w:val="24"/>
         </w:rPr>
-        <w:t>Conocer la estructura organizacional, las funciones del equipo y los procesos administrativos y técnicos de la unidad de farmacia del CESFAM Villa Nonguén.</w:t>
+        <w:t>Participar en los procesos técnicos de recepción, almacenamiento, fraccionamiento, reenvasado y dispensación de medicamentos de la unidad de farmacia.</w:t>
       </w:r>
     </w:p>
     <w:p>
@@ -2100,7 +2183,7 @@
           <w:rFonts w:ascii="Arial" w:hAnsi="Arial"/>
           <w:sz w:val="24"/>
         </w:rPr>
-        <w:t>Participar en los procesos de recepción, almacenamiento, gestión de stock, fraccionamiento, reenvasado y dispensación de medicamentos, aplicando las buenas prácticas y resguardando la trazabilidad.</w:t>
+        <w:t>Ejecutar actividades de atención farmacéutica, visitas domiciliarias y educación sanitaria orientadas al uso racional de los medicamentos.</w:t>
       </w:r>
     </w:p>
     <w:p>
@@ -2113,7 +2196,44 @@
           <w:rFonts w:ascii="Arial" w:hAnsi="Arial"/>
           <w:sz w:val="24"/>
         </w:rPr>
-        <w:t>Desarrollar actividades de atención farmacéutica, seguimiento farmacoterapéutico y educación sanitaria, incluidas las visitas domiciliarias y la promoción del uso racional de los medicamentos.</w:t>
+        <w:t>Diseñar un protocolo de atención farmacéutica domiciliaria basado en el Modelo CMO para el Programa de Salud Cardiovascular del CESFAM Villa Nonguén.</w:t>
+      </w:r>
+    </w:p>
+    <w:p>
+      <w:pPr>
+        <w:spacing w:after="160"/>
+        <w:jc w:val="both"/>
+      </w:pPr>
+      <w:r>
+        <w:rPr>
+          <w:rFonts w:ascii="Arial" w:hAnsi="Arial"/>
+          <w:b w:val="0"/>
+          <w:i w:val="0"/>
+          <w:sz w:val="24"/>
+        </w:rPr>
+        <w:t>Cada uno de estos objetivos se desarrolla de forma explícita en el informe: los tres primeros a través de las actividades descritas en la sección 2.3, y el cuarto a través del seminario de título presentado en la sección 2.4. Su grado de cumplimiento se evalúa en la sección 3.1.</w:t>
+      </w:r>
+    </w:p>
+    <w:p>
+      <w:pPr>
+        <w:pStyle w:val="Heading1"/>
+      </w:pPr>
+      <w:r>
+        <w:t>2. ACTIVIDADES REALIZADAS</w:t>
+      </w:r>
+    </w:p>
+    <w:p>
+      <w:pPr>
+        <w:jc w:val="both"/>
+      </w:pPr>
+      <w:r>
+        <w:rPr>
+          <w:rFonts w:ascii="Arial" w:hAnsi="Arial"/>
+          <w:b w:val="0"/>
+          <w:i w:val="0"/>
+          <w:sz w:val="24"/>
+        </w:rPr>
+        <w:t>El internado se organizó en nueve semanas, entre el 11 de mayo y el 10 de julio de 2026. Durante ese periodo el interno rotó por las distintas tareas de la unidad de farmacia y, en paralelo, desarrolló el seminario de título. Las actividades realizadas fueron las siguientes:</w:t>
       </w:r>
     </w:p>
     <w:p>
@@ -2126,43 +2246,170 @@
           <w:rFonts w:ascii="Arial" w:hAnsi="Arial"/>
           <w:sz w:val="24"/>
         </w:rPr>
-        <w:t>Diseñar un protocolo de atención farmacéutica domiciliaria basado en el Modelo CMO para los pacientes del Programa de Salud Cardiovascular del CESFAM Villa Nonguén, como trabajo de investigación del internado.</w:t>
+        <w:t>Inducción y conocimiento del centro y de la unidad de farmacia.</w:t>
       </w:r>
     </w:p>
     <w:p>
       <w:pPr>
-        <w:pStyle w:val="Heading1"/>
+        <w:pStyle w:val="ListNumber"/>
+        <w:spacing w:line="360" w:lineRule="auto"/>
       </w:pPr>
       <w:r>
-        <w:t>ACTIVIDADES REALIZADAS</w:t>
+        <w:rPr>
+          <w:rFonts w:ascii="Arial" w:hAnsi="Arial"/>
+          <w:sz w:val="24"/>
+        </w:rPr>
+        <w:t>Recepción, almacenamiento y gestión del stock de medicamentos.</w:t>
       </w:r>
     </w:p>
     <w:p>
       <w:pPr>
-        <w:pStyle w:val="Heading2"/>
+        <w:pStyle w:val="ListNumber"/>
+        <w:spacing w:line="360" w:lineRule="auto"/>
       </w:pPr>
       <w:r>
-        <w:t>Cronograma de actividades planificadas</w:t>
+        <w:rPr>
+          <w:rFonts w:ascii="Arial" w:hAnsi="Arial"/>
+          <w:sz w:val="24"/>
+        </w:rPr>
+        <w:t>Fraccionamiento y reenvasado de medicamentos.</w:t>
       </w:r>
     </w:p>
     <w:p>
+      <w:pPr>
+        <w:pStyle w:val="ListNumber"/>
+        <w:spacing w:line="360" w:lineRule="auto"/>
+      </w:pPr>
       <w:r>
         <w:rPr>
-          <w:b w:val="0"/>
-          <w:i w:val="0"/>
+          <w:rFonts w:ascii="Arial" w:hAnsi="Arial"/>
+          <w:sz w:val="24"/>
         </w:rPr>
-        <w:t>Al inicio del internado se acordó con el equipo de farmacia un plan de trabajo que ordenó la rotación por las distintas tareas de la unidad y reservó tiempo para el desarrollo del trabajo de investigación. La Figura 2 presenta la carta Gantt con las actividades planificadas a lo largo de las nueve semanas de internado, comprendidas entre el 11 de mayo y el 10 de julio de 2026.</w:t>
+        <w:t>Dispensación informada de medicamentos.</w:t>
       </w:r>
     </w:p>
     <w:p>
       <w:pPr>
+        <w:pStyle w:val="ListNumber"/>
+        <w:spacing w:line="360" w:lineRule="auto"/>
+      </w:pPr>
+      <w:r>
+        <w:rPr>
+          <w:rFonts w:ascii="Arial" w:hAnsi="Arial"/>
+          <w:sz w:val="24"/>
+        </w:rPr>
+        <w:t>Control de indicadores y registros de despacho.</w:t>
+      </w:r>
+    </w:p>
+    <w:p>
+      <w:pPr>
+        <w:pStyle w:val="ListNumber"/>
+        <w:spacing w:line="360" w:lineRule="auto"/>
+      </w:pPr>
+      <w:r>
+        <w:rPr>
+          <w:rFonts w:ascii="Arial" w:hAnsi="Arial"/>
+          <w:sz w:val="24"/>
+        </w:rPr>
+        <w:t>Atención farmacéutica y visitas domiciliarias.</w:t>
+      </w:r>
+    </w:p>
+    <w:p>
+      <w:pPr>
+        <w:pStyle w:val="ListNumber"/>
+        <w:spacing w:line="360" w:lineRule="auto"/>
+      </w:pPr>
+      <w:r>
+        <w:rPr>
+          <w:rFonts w:ascii="Arial" w:hAnsi="Arial"/>
+          <w:sz w:val="24"/>
+        </w:rPr>
+        <w:t>Educación sanitaria y promoción del uso racional de medicamentos.</w:t>
+      </w:r>
+    </w:p>
+    <w:p>
+      <w:pPr>
+        <w:pStyle w:val="ListNumber"/>
+        <w:spacing w:line="360" w:lineRule="auto"/>
+      </w:pPr>
+      <w:r>
+        <w:rPr>
+          <w:rFonts w:ascii="Arial" w:hAnsi="Arial"/>
+          <w:sz w:val="24"/>
+        </w:rPr>
+        <w:t>Inventario y ordenamiento de bodega.</w:t>
+      </w:r>
+    </w:p>
+    <w:p>
+      <w:pPr>
+        <w:pStyle w:val="ListNumber"/>
+        <w:spacing w:line="360" w:lineRule="auto"/>
+      </w:pPr>
+      <w:r>
+        <w:rPr>
+          <w:rFonts w:ascii="Arial" w:hAnsi="Arial"/>
+          <w:sz w:val="24"/>
+        </w:rPr>
+        <w:t>Apoyo en las supervisiones del Servicio de Salud.</w:t>
+      </w:r>
+    </w:p>
+    <w:p>
+      <w:pPr>
+        <w:pStyle w:val="ListNumber"/>
+        <w:spacing w:line="360" w:lineRule="auto"/>
+      </w:pPr>
+      <w:r>
+        <w:rPr>
+          <w:rFonts w:ascii="Arial" w:hAnsi="Arial"/>
+          <w:sz w:val="24"/>
+        </w:rPr>
+        <w:t>Vinculación con el medio.</w:t>
+      </w:r>
+    </w:p>
+    <w:p>
+      <w:pPr>
+        <w:pStyle w:val="ListNumber"/>
+        <w:spacing w:line="360" w:lineRule="auto"/>
+      </w:pPr>
+      <w:r>
+        <w:rPr>
+          <w:rFonts w:ascii="Arial" w:hAnsi="Arial"/>
+          <w:sz w:val="24"/>
+        </w:rPr>
+        <w:t>Seminario de título: diseño de un protocolo de atención farmacéutica domiciliaria.</w:t>
+      </w:r>
+    </w:p>
+    <w:p>
+      <w:pPr>
+        <w:pStyle w:val="Heading2"/>
+      </w:pPr>
+      <w:r>
+        <w:t>2.1 Cronograma de actividades planificadas</w:t>
+      </w:r>
+    </w:p>
+    <w:p>
+      <w:pPr>
+        <w:jc w:val="both"/>
+      </w:pPr>
+      <w:r>
+        <w:rPr>
+          <w:rFonts w:ascii="Arial" w:hAnsi="Arial"/>
+          <w:b w:val="0"/>
+          <w:i w:val="0"/>
+          <w:sz w:val="24"/>
+        </w:rPr>
+        <w:t>Al inicio del internado se acordó con el equipo de farmacia un plan de trabajo que ordenó la rotación por las distintas tareas de la unidad y reservó tiempo para el desarrollo del seminario de título. La Figura 2 presenta la carta Gantt con las actividades planificadas a lo largo de las nueve semanas.</w:t>
+      </w:r>
+    </w:p>
+    <w:p>
+      <w:pPr>
         <w:spacing w:before="120" w:after="40"/>
         <w:jc w:val="center"/>
       </w:pPr>
       <w:r>
         <w:drawing>
           <wp:inline xmlns:a="http://schemas.openxmlformats.org/drawingml/2006/main" xmlns:pic="http://schemas.openxmlformats.org/drawingml/2006/picture">
-            <wp:extent cx="5400000" cy="3228558"/>
+            <wp:extent cx="5580000" cy="2984651"/>
             <wp:docPr id="2" name="Picture 2"/>
             <wp:cNvGraphicFramePr>
               <a:graphicFrameLocks noChangeAspect="1"/>
@@ -2171,11 +2418,11 @@
               <a:graphicData uri="http://schemas.openxmlformats.org/drawingml/2006/picture">
                 <pic:pic>
                   <pic:nvPicPr>
-                    <pic:cNvPr id="0" name="fig_gantt_planificadas.png"/>
+                    <pic:cNvPr id="0" name="fig_gantt_planificada.png"/>
                     <pic:cNvPicPr/>
                   </pic:nvPicPr>
                   <pic:blipFill>
-                    <a:blip r:embed="rId12"/>
+                    <a:blip r:embed="rId13"/>
                     <a:stretch>
                       <a:fillRect/>
                     </a:stretch>
@@ -2183,7 +2430,7 @@
                   <pic:spPr>
                     <a:xfrm>
                       <a:off x="0" y="0"/>
-                      <a:ext cx="5400000" cy="3228558"/>
+                      <a:ext cx="5580000" cy="2984651"/>
                     </a:xfrm>
                     <a:prstGeom prst="rect"/>
                   </pic:spPr>
@@ -2225,16 +2472,21 @@
         <w:pStyle w:val="Heading2"/>
       </w:pPr>
       <w:r>
-        <w:t>Cronograma de actividades desarrolladas</w:t>
+        <w:t>2.2 Cronograma de actividades desarrolladas</w:t>
       </w:r>
     </w:p>
     <w:p>
+      <w:pPr>
+        <w:jc w:val="both"/>
+      </w:pPr>
       <w:r>
         <w:rPr>
+          <w:rFonts w:ascii="Arial" w:hAnsi="Arial"/>
           <w:b w:val="0"/>
           <w:i w:val="0"/>
+          <w:sz w:val="24"/>
         </w:rPr>
-        <w:t>La Figura 3 muestra las actividades efectivamente desarrolladas. En términos generales, la ejecución siguió lo planificado, con algunos ajustes propios de la dinámica del establecimiento. El fraccionamiento, la dispensación y la atención farmacéutica se extendieron durante casi todo el periodo, ya que constituyen tareas habituales de la unidad, y se sumaron actividades no previstas al inicio, como el apoyo durante las supervisiones del Servicio de Salud y una situación de vinculación con el medio surgida en terreno.</w:t>
+        <w:t>La Figura 3 muestra las actividades efectivamente desarrolladas, con detalle por día y por semana. En términos generales, la ejecución siguió lo planificado, con algunos ajustes propios de la dinámica del establecimiento. El fraccionamiento, la dispensación y la atención farmacéutica se extendieron durante casi todo el periodo, ya que constituyen tareas habituales de la unidad, y se sumaron actividades no previstas al inicio, como el apoyo durante las supervisiones del Servicio de Salud y una situación de vinculación con el medio surgida en terreno. La Tabla 3 complementa la figura con el detalle diario de lo realizado.</w:t>
       </w:r>
     </w:p>
     <w:p>
@@ -2245,7 +2497,7 @@
       <w:r>
         <w:drawing>
           <wp:inline xmlns:a="http://schemas.openxmlformats.org/drawingml/2006/main" xmlns:pic="http://schemas.openxmlformats.org/drawingml/2006/picture">
-            <wp:extent cx="5400000" cy="3228558"/>
+            <wp:extent cx="5400000" cy="7039594"/>
             <wp:docPr id="3" name="Picture 3"/>
             <wp:cNvGraphicFramePr>
               <a:graphicFrameLocks noChangeAspect="1"/>
@@ -2254,11 +2506,11 @@
               <a:graphicData uri="http://schemas.openxmlformats.org/drawingml/2006/picture">
                 <pic:pic>
                   <pic:nvPicPr>
-                    <pic:cNvPr id="0" name="fig_gantt_desarrolladas.png"/>
+                    <pic:cNvPr id="0" name="fig_gantt_desarrollada.png"/>
                     <pic:cNvPicPr/>
                   </pic:nvPicPr>
                   <pic:blipFill>
-                    <a:blip r:embed="rId13"/>
+                    <a:blip r:embed="rId14"/>
                     <a:stretch>
                       <a:fillRect/>
                     </a:stretch>
@@ -2266,7 +2518,7 @@
                   <pic:spPr>
                     <a:xfrm>
                       <a:off x="0" y="0"/>
-                      <a:ext cx="5400000" cy="3228558"/>
+                      <a:ext cx="5400000" cy="7039594"/>
                     </a:xfrm>
                     <a:prstGeom prst="rect"/>
                   </pic:spPr>
@@ -2300,16 +2552,1247 @@
         <w:fldChar w:fldCharType="end"/>
       </w:r>
       <w:r>
-        <w:t>. Carta Gantt de actividades desarrolladas del internado.</w:t>
+        <w:t>. Carta Gantt de actividades desarrolladas, con detalle por día y semana.</w:t>
       </w:r>
     </w:p>
     <w:p>
+      <w:pPr>
+        <w:pStyle w:val="Caption"/>
+      </w:pPr>
+      <w:r>
+        <w:t xml:space="preserve">Tabla </w:t>
+      </w:r>
+      <w:r>
+        <w:fldChar w:fldCharType="begin"/>
+      </w:r>
+      <w:r>
+        <w:instrText xml:space="preserve"> SEQ Tabla \* ARABIC </w:instrText>
+      </w:r>
+      <w:r>
+        <w:fldChar w:fldCharType="separate"/>
+      </w:r>
+      <w:r>
+        <w:t>1</w:t>
+      </w:r>
+      <w:r>
+        <w:fldChar w:fldCharType="end"/>
+      </w:r>
+      <w:r>
+        <w:t>. Cronograma detallado de actividades por día y semana.</w:t>
+      </w:r>
+    </w:p>
+    <w:tbl>
+      <w:tblPr>
+        <w:tblStyle w:val="TableGrid"/>
+        <w:tblW w:type="auto" w:w="0"/>
+        <w:jc w:val="center"/>
+        <w:tblLook w:firstColumn="1" w:firstRow="1" w:lastColumn="0" w:lastRow="0" w:noHBand="0" w:noVBand="1" w:val="04A0"/>
+      </w:tblPr>
+      <w:tblGrid>
+        <w:gridCol w:w="1426"/>
+        <w:gridCol w:w="1426"/>
+        <w:gridCol w:w="1426"/>
+        <w:gridCol w:w="1426"/>
+        <w:gridCol w:w="1426"/>
+        <w:gridCol w:w="1426"/>
+      </w:tblGrid>
+      <w:tr>
+        <w:tc>
+          <w:tcPr>
+            <w:tcW w:type="dxa" w:w="1134"/>
+            <w:shd w:fill="D9E2F3"/>
+          </w:tcPr>
+          <w:p>
+            <w:pPr>
+              <w:jc w:val="center"/>
+            </w:pPr>
+            <w:r/>
+            <w:r>
+              <w:rPr>
+                <w:rFonts w:ascii="Arial" w:hAnsi="Arial"/>
+                <w:b/>
+                <w:sz w:val="16"/>
+              </w:rPr>
+              <w:t>Semana</w:t>
+            </w:r>
+          </w:p>
+        </w:tc>
+        <w:tc>
+          <w:tcPr>
+            <w:tcW w:type="dxa" w:w="1474"/>
+            <w:shd w:fill="D9E2F3"/>
+          </w:tcPr>
+          <w:p>
+            <w:pPr>
+              <w:jc w:val="center"/>
+            </w:pPr>
+            <w:r/>
+            <w:r>
+              <w:rPr>
+                <w:rFonts w:ascii="Arial" w:hAnsi="Arial"/>
+                <w:b/>
+                <w:sz w:val="16"/>
+              </w:rPr>
+              <w:t>Lunes</w:t>
+            </w:r>
+          </w:p>
+        </w:tc>
+        <w:tc>
+          <w:tcPr>
+            <w:tcW w:type="dxa" w:w="1474"/>
+            <w:shd w:fill="D9E2F3"/>
+          </w:tcPr>
+          <w:p>
+            <w:pPr>
+              <w:jc w:val="center"/>
+            </w:pPr>
+            <w:r/>
+            <w:r>
+              <w:rPr>
+                <w:rFonts w:ascii="Arial" w:hAnsi="Arial"/>
+                <w:b/>
+                <w:sz w:val="16"/>
+              </w:rPr>
+              <w:t>Martes</w:t>
+            </w:r>
+          </w:p>
+        </w:tc>
+        <w:tc>
+          <w:tcPr>
+            <w:tcW w:type="dxa" w:w="1474"/>
+            <w:shd w:fill="D9E2F3"/>
+          </w:tcPr>
+          <w:p>
+            <w:pPr>
+              <w:jc w:val="center"/>
+            </w:pPr>
+            <w:r/>
+            <w:r>
+              <w:rPr>
+                <w:rFonts w:ascii="Arial" w:hAnsi="Arial"/>
+                <w:b/>
+                <w:sz w:val="16"/>
+              </w:rPr>
+              <w:t>Miércoles</w:t>
+            </w:r>
+          </w:p>
+        </w:tc>
+        <w:tc>
+          <w:tcPr>
+            <w:tcW w:type="dxa" w:w="1474"/>
+            <w:shd w:fill="D9E2F3"/>
+          </w:tcPr>
+          <w:p>
+            <w:pPr>
+              <w:jc w:val="center"/>
+            </w:pPr>
+            <w:r/>
+            <w:r>
+              <w:rPr>
+                <w:rFonts w:ascii="Arial" w:hAnsi="Arial"/>
+                <w:b/>
+                <w:sz w:val="16"/>
+              </w:rPr>
+              <w:t>Jueves</w:t>
+            </w:r>
+          </w:p>
+        </w:tc>
+        <w:tc>
+          <w:tcPr>
+            <w:tcW w:type="dxa" w:w="1474"/>
+            <w:shd w:fill="D9E2F3"/>
+          </w:tcPr>
+          <w:p>
+            <w:pPr>
+              <w:jc w:val="center"/>
+            </w:pPr>
+            <w:r/>
+            <w:r>
+              <w:rPr>
+                <w:rFonts w:ascii="Arial" w:hAnsi="Arial"/>
+                <w:b/>
+                <w:sz w:val="16"/>
+              </w:rPr>
+              <w:t>Viernes</w:t>
+            </w:r>
+          </w:p>
+        </w:tc>
+      </w:tr>
+      <w:tr>
+        <w:tc>
+          <w:tcPr>
+            <w:tcW w:type="dxa" w:w="1134"/>
+          </w:tcPr>
+          <w:p>
+            <w:pPr>
+              <w:spacing w:after="40" w:line="240" w:lineRule="auto"/>
+              <w:jc w:val="left"/>
+            </w:pPr>
+            <w:r/>
+            <w:r>
+              <w:rPr>
+                <w:rFonts w:ascii="Arial" w:hAnsi="Arial"/>
+                <w:sz w:val="16"/>
+              </w:rPr>
+              <w:t>S1</w:t>
+              <w:br/>
+              <w:t>11-15 may</w:t>
+            </w:r>
+          </w:p>
+        </w:tc>
+        <w:tc>
+          <w:tcPr>
+            <w:tcW w:type="dxa" w:w="1474"/>
+          </w:tcPr>
+          <w:p>
+            <w:pPr>
+              <w:spacing w:after="40" w:line="240" w:lineRule="auto"/>
+              <w:jc w:val="left"/>
+            </w:pPr>
+            <w:r/>
+            <w:r>
+              <w:rPr>
+                <w:rFonts w:ascii="Arial" w:hAnsi="Arial"/>
+                <w:sz w:val="16"/>
+              </w:rPr>
+              <w:t>Inducción y recorrido de la unidad</w:t>
+            </w:r>
+          </w:p>
+        </w:tc>
+        <w:tc>
+          <w:tcPr>
+            <w:tcW w:type="dxa" w:w="1474"/>
+          </w:tcPr>
+          <w:p>
+            <w:pPr>
+              <w:spacing w:after="40" w:line="240" w:lineRule="auto"/>
+              <w:jc w:val="left"/>
+            </w:pPr>
+            <w:r/>
+            <w:r>
+              <w:rPr>
+                <w:rFonts w:ascii="Arial" w:hAnsi="Arial"/>
+                <w:sz w:val="16"/>
+              </w:rPr>
+              <w:t>Fraccionamiento y reenvasado; cambio de vildagliptina</w:t>
+            </w:r>
+          </w:p>
+        </w:tc>
+        <w:tc>
+          <w:tcPr>
+            <w:tcW w:type="dxa" w:w="1474"/>
+          </w:tcPr>
+          <w:p>
+            <w:pPr>
+              <w:spacing w:after="40" w:line="240" w:lineRule="auto"/>
+              <w:jc w:val="left"/>
+            </w:pPr>
+            <w:r/>
+            <w:r>
+              <w:rPr>
+                <w:rFonts w:ascii="Arial" w:hAnsi="Arial"/>
+                <w:sz w:val="16"/>
+              </w:rPr>
+              <w:t>Control de vencimientos; indicador de despacho por sector</w:t>
+            </w:r>
+          </w:p>
+        </w:tc>
+        <w:tc>
+          <w:tcPr>
+            <w:tcW w:type="dxa" w:w="1474"/>
+          </w:tcPr>
+          <w:p>
+            <w:pPr>
+              <w:spacing w:after="40" w:line="240" w:lineRule="auto"/>
+              <w:jc w:val="left"/>
+            </w:pPr>
+            <w:r/>
+            <w:r>
+              <w:rPr>
+                <w:rFonts w:ascii="Arial" w:hAnsi="Arial"/>
+                <w:sz w:val="16"/>
+              </w:rPr>
+              <w:t>Envasado; protocolos de emergencia; llegada de pedido; atención farmacéutica</w:t>
+            </w:r>
+          </w:p>
+        </w:tc>
+        <w:tc>
+          <w:tcPr>
+            <w:tcW w:type="dxa" w:w="1474"/>
+          </w:tcPr>
+          <w:p>
+            <w:pPr>
+              <w:spacing w:after="40" w:line="240" w:lineRule="auto"/>
+              <w:jc w:val="left"/>
+            </w:pPr>
+            <w:r/>
+            <w:r>
+              <w:rPr>
+                <w:rFonts w:ascii="Arial" w:hAnsi="Arial"/>
+                <w:sz w:val="16"/>
+              </w:rPr>
+              <w:t>Seminario: revisión bibliográfica y Modelo CMO</w:t>
+            </w:r>
+          </w:p>
+        </w:tc>
+      </w:tr>
+      <w:tr>
+        <w:tc>
+          <w:tcPr>
+            <w:tcW w:type="dxa" w:w="1134"/>
+          </w:tcPr>
+          <w:p>
+            <w:pPr>
+              <w:spacing w:after="40" w:line="240" w:lineRule="auto"/>
+              <w:jc w:val="left"/>
+            </w:pPr>
+            <w:r/>
+            <w:r>
+              <w:rPr>
+                <w:rFonts w:ascii="Arial" w:hAnsi="Arial"/>
+                <w:sz w:val="16"/>
+              </w:rPr>
+              <w:t>S2</w:t>
+              <w:br/>
+              <w:t>18-22 may</w:t>
+            </w:r>
+          </w:p>
+        </w:tc>
+        <w:tc>
+          <w:tcPr>
+            <w:tcW w:type="dxa" w:w="1474"/>
+          </w:tcPr>
+          <w:p>
+            <w:pPr>
+              <w:spacing w:after="40" w:line="240" w:lineRule="auto"/>
+              <w:jc w:val="left"/>
+            </w:pPr>
+            <w:r/>
+            <w:r>
+              <w:rPr>
+                <w:rFonts w:ascii="Arial" w:hAnsi="Arial"/>
+                <w:sz w:val="16"/>
+              </w:rPr>
+              <w:t>Protocolo de AF y entrega a domicilio</w:t>
+            </w:r>
+          </w:p>
+        </w:tc>
+        <w:tc>
+          <w:tcPr>
+            <w:tcW w:type="dxa" w:w="1474"/>
+          </w:tcPr>
+          <w:p>
+            <w:pPr>
+              <w:spacing w:after="40" w:line="240" w:lineRule="auto"/>
+              <w:jc w:val="left"/>
+            </w:pPr>
+            <w:r/>
+            <w:r>
+              <w:rPr>
+                <w:rFonts w:ascii="Arial" w:hAnsi="Arial"/>
+                <w:sz w:val="16"/>
+              </w:rPr>
+              <w:t>Seminario: objetivos; bolsas y pedido</w:t>
+            </w:r>
+          </w:p>
+        </w:tc>
+        <w:tc>
+          <w:tcPr>
+            <w:tcW w:type="dxa" w:w="1474"/>
+          </w:tcPr>
+          <w:p>
+            <w:pPr>
+              <w:spacing w:after="40" w:line="240" w:lineRule="auto"/>
+              <w:jc w:val="left"/>
+            </w:pPr>
+            <w:r/>
+            <w:r>
+              <w:rPr>
+                <w:rFonts w:ascii="Arial" w:hAnsi="Arial"/>
+                <w:sz w:val="16"/>
+              </w:rPr>
+              <w:t>Fraccionamiento y reenvasado</w:t>
+            </w:r>
+          </w:p>
+        </w:tc>
+        <w:tc>
+          <w:tcPr>
+            <w:tcW w:type="dxa" w:w="1474"/>
+          </w:tcPr>
+          <w:p>
+            <w:pPr>
+              <w:spacing w:after="40" w:line="240" w:lineRule="auto"/>
+              <w:jc w:val="left"/>
+            </w:pPr>
+            <w:r/>
+            <w:r>
+              <w:rPr>
+                <w:rFonts w:ascii="Arial" w:hAnsi="Arial"/>
+                <w:sz w:val="16"/>
+              </w:rPr>
+              <w:t>Dispensación</w:t>
+            </w:r>
+          </w:p>
+        </w:tc>
+        <w:tc>
+          <w:tcPr>
+            <w:tcW w:type="dxa" w:w="1474"/>
+          </w:tcPr>
+          <w:p>
+            <w:pPr>
+              <w:spacing w:after="40" w:line="240" w:lineRule="auto"/>
+              <w:jc w:val="left"/>
+            </w:pPr>
+            <w:r/>
+            <w:r>
+              <w:rPr>
+                <w:rFonts w:ascii="Arial" w:hAnsi="Arial"/>
+                <w:sz w:val="16"/>
+              </w:rPr>
+              <w:t>Gestión de stock y dispensación</w:t>
+            </w:r>
+          </w:p>
+        </w:tc>
+      </w:tr>
+      <w:tr>
+        <w:tc>
+          <w:tcPr>
+            <w:tcW w:type="dxa" w:w="1134"/>
+          </w:tcPr>
+          <w:p>
+            <w:pPr>
+              <w:spacing w:after="40" w:line="240" w:lineRule="auto"/>
+              <w:jc w:val="left"/>
+            </w:pPr>
+            <w:r/>
+            <w:r>
+              <w:rPr>
+                <w:rFonts w:ascii="Arial" w:hAnsi="Arial"/>
+                <w:sz w:val="16"/>
+              </w:rPr>
+              <w:t>S3</w:t>
+              <w:br/>
+              <w:t>25-29 may</w:t>
+            </w:r>
+          </w:p>
+        </w:tc>
+        <w:tc>
+          <w:tcPr>
+            <w:tcW w:type="dxa" w:w="1474"/>
+          </w:tcPr>
+          <w:p>
+            <w:pPr>
+              <w:spacing w:after="40" w:line="240" w:lineRule="auto"/>
+              <w:jc w:val="left"/>
+            </w:pPr>
+            <w:r/>
+            <w:r>
+              <w:rPr>
+                <w:rFonts w:ascii="Arial" w:hAnsi="Arial"/>
+                <w:sz w:val="16"/>
+              </w:rPr>
+              <w:t>Entrega a domicilio; apoyo a adulto mayor</w:t>
+            </w:r>
+          </w:p>
+        </w:tc>
+        <w:tc>
+          <w:tcPr>
+            <w:tcW w:type="dxa" w:w="1474"/>
+          </w:tcPr>
+          <w:p>
+            <w:pPr>
+              <w:spacing w:after="40" w:line="240" w:lineRule="auto"/>
+              <w:jc w:val="left"/>
+            </w:pPr>
+            <w:r/>
+            <w:r>
+              <w:rPr>
+                <w:rFonts w:ascii="Arial" w:hAnsi="Arial"/>
+                <w:sz w:val="16"/>
+              </w:rPr>
+              <w:t>Entrega a domicilio; objetivos del seminario</w:t>
+            </w:r>
+          </w:p>
+        </w:tc>
+        <w:tc>
+          <w:tcPr>
+            <w:tcW w:type="dxa" w:w="1474"/>
+          </w:tcPr>
+          <w:p>
+            <w:pPr>
+              <w:spacing w:after="40" w:line="240" w:lineRule="auto"/>
+              <w:jc w:val="left"/>
+            </w:pPr>
+            <w:r/>
+            <w:r>
+              <w:rPr>
+                <w:rFonts w:ascii="Arial" w:hAnsi="Arial"/>
+                <w:sz w:val="16"/>
+              </w:rPr>
+              <w:t>Clase de bibliografía (Mendeley)</w:t>
+            </w:r>
+          </w:p>
+        </w:tc>
+        <w:tc>
+          <w:tcPr>
+            <w:tcW w:type="dxa" w:w="1474"/>
+          </w:tcPr>
+          <w:p>
+            <w:pPr>
+              <w:spacing w:after="40" w:line="240" w:lineRule="auto"/>
+              <w:jc w:val="left"/>
+            </w:pPr>
+            <w:r/>
+            <w:r>
+              <w:rPr>
+                <w:rFonts w:ascii="Arial" w:hAnsi="Arial"/>
+                <w:sz w:val="16"/>
+              </w:rPr>
+              <w:t>Dispensación; ubicación de medicamentos</w:t>
+            </w:r>
+          </w:p>
+        </w:tc>
+        <w:tc>
+          <w:tcPr>
+            <w:tcW w:type="dxa" w:w="1474"/>
+          </w:tcPr>
+          <w:p>
+            <w:pPr>
+              <w:spacing w:after="40" w:line="240" w:lineRule="auto"/>
+              <w:jc w:val="left"/>
+            </w:pPr>
+            <w:r/>
+            <w:r>
+              <w:rPr>
+                <w:rFonts w:ascii="Arial" w:hAnsi="Arial"/>
+                <w:sz w:val="16"/>
+              </w:rPr>
+              <w:t>Dispensación</w:t>
+            </w:r>
+          </w:p>
+        </w:tc>
+      </w:tr>
+      <w:tr>
+        <w:tc>
+          <w:tcPr>
+            <w:tcW w:type="dxa" w:w="1134"/>
+          </w:tcPr>
+          <w:p>
+            <w:pPr>
+              <w:spacing w:after="40" w:line="240" w:lineRule="auto"/>
+              <w:jc w:val="left"/>
+            </w:pPr>
+            <w:r/>
+            <w:r>
+              <w:rPr>
+                <w:rFonts w:ascii="Arial" w:hAnsi="Arial"/>
+                <w:sz w:val="16"/>
+              </w:rPr>
+              <w:t>S4</w:t>
+              <w:br/>
+              <w:t>01-05 jun</w:t>
+            </w:r>
+          </w:p>
+        </w:tc>
+        <w:tc>
+          <w:tcPr>
+            <w:tcW w:type="dxa" w:w="1474"/>
+          </w:tcPr>
+          <w:p>
+            <w:pPr>
+              <w:spacing w:after="40" w:line="240" w:lineRule="auto"/>
+              <w:jc w:val="left"/>
+            </w:pPr>
+            <w:r/>
+            <w:r>
+              <w:rPr>
+                <w:rFonts w:ascii="Arial" w:hAnsi="Arial"/>
+                <w:sz w:val="16"/>
+              </w:rPr>
+              <w:t>Préstamos por vencimiento</w:t>
+            </w:r>
+          </w:p>
+        </w:tc>
+        <w:tc>
+          <w:tcPr>
+            <w:tcW w:type="dxa" w:w="1474"/>
+          </w:tcPr>
+          <w:p>
+            <w:pPr>
+              <w:spacing w:after="40" w:line="240" w:lineRule="auto"/>
+              <w:jc w:val="left"/>
+            </w:pPr>
+            <w:r/>
+            <w:r>
+              <w:rPr>
+                <w:rFonts w:ascii="Arial" w:hAnsi="Arial"/>
+                <w:sz w:val="16"/>
+              </w:rPr>
+              <w:t>Plantilla de despacho de mayo</w:t>
+            </w:r>
+          </w:p>
+        </w:tc>
+        <w:tc>
+          <w:tcPr>
+            <w:tcW w:type="dxa" w:w="1474"/>
+          </w:tcPr>
+          <w:p>
+            <w:pPr>
+              <w:spacing w:after="40" w:line="240" w:lineRule="auto"/>
+              <w:jc w:val="left"/>
+            </w:pPr>
+            <w:r/>
+            <w:r>
+              <w:rPr>
+                <w:rFonts w:ascii="Arial" w:hAnsi="Arial"/>
+                <w:sz w:val="16"/>
+              </w:rPr>
+              <w:t>Gestión de stock y reportes</w:t>
+            </w:r>
+          </w:p>
+        </w:tc>
+        <w:tc>
+          <w:tcPr>
+            <w:tcW w:type="dxa" w:w="1474"/>
+          </w:tcPr>
+          <w:p>
+            <w:pPr>
+              <w:spacing w:after="40" w:line="240" w:lineRule="auto"/>
+              <w:jc w:val="left"/>
+            </w:pPr>
+            <w:r/>
+            <w:r>
+              <w:rPr>
+                <w:rFonts w:ascii="Arial" w:hAnsi="Arial"/>
+                <w:sz w:val="16"/>
+              </w:rPr>
+              <w:t>Supervisión del Servicio de Salud; inducción; metodología del seminario</w:t>
+            </w:r>
+          </w:p>
+        </w:tc>
+        <w:tc>
+          <w:tcPr>
+            <w:tcW w:type="dxa" w:w="1474"/>
+          </w:tcPr>
+          <w:p>
+            <w:pPr>
+              <w:spacing w:after="40" w:line="240" w:lineRule="auto"/>
+              <w:jc w:val="left"/>
+            </w:pPr>
+            <w:r/>
+            <w:r>
+              <w:rPr>
+                <w:rFonts w:ascii="Arial" w:hAnsi="Arial"/>
+                <w:sz w:val="16"/>
+              </w:rPr>
+              <w:t>Indicador y atención farmacéutica</w:t>
+            </w:r>
+          </w:p>
+        </w:tc>
+      </w:tr>
+      <w:tr>
+        <w:tc>
+          <w:tcPr>
+            <w:tcW w:type="dxa" w:w="1134"/>
+          </w:tcPr>
+          <w:p>
+            <w:pPr>
+              <w:spacing w:after="40" w:line="240" w:lineRule="auto"/>
+              <w:jc w:val="left"/>
+            </w:pPr>
+            <w:r/>
+            <w:r>
+              <w:rPr>
+                <w:rFonts w:ascii="Arial" w:hAnsi="Arial"/>
+                <w:sz w:val="16"/>
+              </w:rPr>
+              <w:t>S5</w:t>
+              <w:br/>
+              <w:t>08-12 jun</w:t>
+            </w:r>
+          </w:p>
+        </w:tc>
+        <w:tc>
+          <w:tcPr>
+            <w:tcW w:type="dxa" w:w="1474"/>
+          </w:tcPr>
+          <w:p>
+            <w:pPr>
+              <w:spacing w:after="40" w:line="240" w:lineRule="auto"/>
+              <w:jc w:val="left"/>
+            </w:pPr>
+            <w:r/>
+            <w:r>
+              <w:rPr>
+                <w:rFonts w:ascii="Arial" w:hAnsi="Arial"/>
+                <w:sz w:val="16"/>
+              </w:rPr>
+              <w:t>Rutina de farmacia y dispensación</w:t>
+            </w:r>
+          </w:p>
+        </w:tc>
+        <w:tc>
+          <w:tcPr>
+            <w:tcW w:type="dxa" w:w="1474"/>
+          </w:tcPr>
+          <w:p>
+            <w:pPr>
+              <w:spacing w:after="40" w:line="240" w:lineRule="auto"/>
+              <w:jc w:val="left"/>
+            </w:pPr>
+            <w:r/>
+            <w:r>
+              <w:rPr>
+                <w:rFonts w:ascii="Arial" w:hAnsi="Arial"/>
+                <w:sz w:val="16"/>
+              </w:rPr>
+              <w:t>Inventario y ordenamiento de bodega</w:t>
+            </w:r>
+          </w:p>
+        </w:tc>
+        <w:tc>
+          <w:tcPr>
+            <w:tcW w:type="dxa" w:w="1474"/>
+          </w:tcPr>
+          <w:p>
+            <w:pPr>
+              <w:spacing w:after="40" w:line="240" w:lineRule="auto"/>
+              <w:jc w:val="left"/>
+            </w:pPr>
+            <w:r/>
+            <w:r>
+              <w:rPr>
+                <w:rFonts w:ascii="Arial" w:hAnsi="Arial"/>
+                <w:sz w:val="16"/>
+              </w:rPr>
+              <w:t>Inspección del Servicio de Salud; avance del seminario</w:t>
+            </w:r>
+          </w:p>
+        </w:tc>
+        <w:tc>
+          <w:tcPr>
+            <w:tcW w:type="dxa" w:w="1474"/>
+          </w:tcPr>
+          <w:p>
+            <w:pPr>
+              <w:spacing w:after="40" w:line="240" w:lineRule="auto"/>
+              <w:jc w:val="left"/>
+            </w:pPr>
+            <w:r/>
+            <w:r>
+              <w:rPr>
+                <w:rFonts w:ascii="Arial" w:hAnsi="Arial"/>
+                <w:sz w:val="16"/>
+              </w:rPr>
+              <w:t>Fraccionamiento y dispensación</w:t>
+            </w:r>
+          </w:p>
+        </w:tc>
+        <w:tc>
+          <w:tcPr>
+            <w:tcW w:type="dxa" w:w="1474"/>
+          </w:tcPr>
+          <w:p>
+            <w:pPr>
+              <w:spacing w:after="40" w:line="240" w:lineRule="auto"/>
+              <w:jc w:val="left"/>
+            </w:pPr>
+            <w:r/>
+            <w:r>
+              <w:rPr>
+                <w:rFonts w:ascii="Arial" w:hAnsi="Arial"/>
+                <w:sz w:val="16"/>
+              </w:rPr>
+              <w:t>Bolsas fraccionadas; visita domiciliaria</w:t>
+            </w:r>
+          </w:p>
+        </w:tc>
+      </w:tr>
+      <w:tr>
+        <w:tc>
+          <w:tcPr>
+            <w:tcW w:type="dxa" w:w="1134"/>
+          </w:tcPr>
+          <w:p>
+            <w:pPr>
+              <w:spacing w:after="40" w:line="240" w:lineRule="auto"/>
+              <w:jc w:val="left"/>
+            </w:pPr>
+            <w:r/>
+            <w:r>
+              <w:rPr>
+                <w:rFonts w:ascii="Arial" w:hAnsi="Arial"/>
+                <w:sz w:val="16"/>
+              </w:rPr>
+              <w:t>S6</w:t>
+              <w:br/>
+              <w:t>15-19 jun</w:t>
+            </w:r>
+          </w:p>
+        </w:tc>
+        <w:tc>
+          <w:tcPr>
+            <w:tcW w:type="dxa" w:w="1474"/>
+          </w:tcPr>
+          <w:p>
+            <w:pPr>
+              <w:spacing w:after="40" w:line="240" w:lineRule="auto"/>
+              <w:jc w:val="left"/>
+            </w:pPr>
+            <w:r/>
+            <w:r>
+              <w:rPr>
+                <w:rFonts w:ascii="Arial" w:hAnsi="Arial"/>
+                <w:sz w:val="16"/>
+              </w:rPr>
+              <w:t>Llega docente supervisora; envío del avance</w:t>
+            </w:r>
+          </w:p>
+        </w:tc>
+        <w:tc>
+          <w:tcPr>
+            <w:tcW w:type="dxa" w:w="1474"/>
+          </w:tcPr>
+          <w:p>
+            <w:pPr>
+              <w:spacing w:after="40" w:line="240" w:lineRule="auto"/>
+              <w:jc w:val="left"/>
+            </w:pPr>
+            <w:r/>
+            <w:r>
+              <w:rPr>
+                <w:rFonts w:ascii="Arial" w:hAnsi="Arial"/>
+                <w:sz w:val="16"/>
+              </w:rPr>
+              <w:t>Despacho a domicilio y farmacia</w:t>
+            </w:r>
+          </w:p>
+        </w:tc>
+        <w:tc>
+          <w:tcPr>
+            <w:tcW w:type="dxa" w:w="1474"/>
+          </w:tcPr>
+          <w:p>
+            <w:pPr>
+              <w:spacing w:after="40" w:line="240" w:lineRule="auto"/>
+              <w:jc w:val="left"/>
+            </w:pPr>
+            <w:r/>
+            <w:r>
+              <w:rPr>
+                <w:rFonts w:ascii="Arial" w:hAnsi="Arial"/>
+                <w:sz w:val="16"/>
+              </w:rPr>
+              <w:t>Despacho a domicilio y farmacia</w:t>
+            </w:r>
+          </w:p>
+        </w:tc>
+        <w:tc>
+          <w:tcPr>
+            <w:tcW w:type="dxa" w:w="1474"/>
+          </w:tcPr>
+          <w:p>
+            <w:pPr>
+              <w:spacing w:after="40" w:line="240" w:lineRule="auto"/>
+              <w:jc w:val="left"/>
+            </w:pPr>
+            <w:r/>
+            <w:r>
+              <w:rPr>
+                <w:rFonts w:ascii="Arial" w:hAnsi="Arial"/>
+                <w:sz w:val="16"/>
+              </w:rPr>
+              <w:t>Despacho a domicilio y farmacia</w:t>
+            </w:r>
+          </w:p>
+        </w:tc>
+        <w:tc>
+          <w:tcPr>
+            <w:tcW w:type="dxa" w:w="1474"/>
+          </w:tcPr>
+          <w:p>
+            <w:pPr>
+              <w:spacing w:after="40" w:line="240" w:lineRule="auto"/>
+              <w:jc w:val="left"/>
+            </w:pPr>
+            <w:r/>
+            <w:r>
+              <w:rPr>
+                <w:rFonts w:ascii="Arial" w:hAnsi="Arial"/>
+                <w:sz w:val="16"/>
+              </w:rPr>
+              <w:t>Atención farmacéutica</w:t>
+            </w:r>
+          </w:p>
+        </w:tc>
+      </w:tr>
+      <w:tr>
+        <w:tc>
+          <w:tcPr>
+            <w:tcW w:type="dxa" w:w="1134"/>
+          </w:tcPr>
+          <w:p>
+            <w:pPr>
+              <w:spacing w:after="40" w:line="240" w:lineRule="auto"/>
+              <w:jc w:val="left"/>
+            </w:pPr>
+            <w:r/>
+            <w:r>
+              <w:rPr>
+                <w:rFonts w:ascii="Arial" w:hAnsi="Arial"/>
+                <w:sz w:val="16"/>
+              </w:rPr>
+              <w:t>S7</w:t>
+              <w:br/>
+              <w:t>22-26 jun</w:t>
+            </w:r>
+          </w:p>
+        </w:tc>
+        <w:tc>
+          <w:tcPr>
+            <w:tcW w:type="dxa" w:w="1474"/>
+          </w:tcPr>
+          <w:p>
+            <w:pPr>
+              <w:spacing w:after="40" w:line="240" w:lineRule="auto"/>
+              <w:jc w:val="left"/>
+            </w:pPr>
+            <w:r/>
+            <w:r>
+              <w:rPr>
+                <w:rFonts w:ascii="Arial" w:hAnsi="Arial"/>
+                <w:sz w:val="16"/>
+              </w:rPr>
+              <w:t>Tareas generales de farmacia</w:t>
+            </w:r>
+          </w:p>
+        </w:tc>
+        <w:tc>
+          <w:tcPr>
+            <w:tcW w:type="dxa" w:w="1474"/>
+          </w:tcPr>
+          <w:p>
+            <w:pPr>
+              <w:spacing w:after="40" w:line="240" w:lineRule="auto"/>
+              <w:jc w:val="left"/>
+            </w:pPr>
+            <w:r/>
+            <w:r>
+              <w:rPr>
+                <w:rFonts w:ascii="Arial" w:hAnsi="Arial"/>
+                <w:sz w:val="16"/>
+              </w:rPr>
+              <w:t>Tareas generales de farmacia</w:t>
+            </w:r>
+          </w:p>
+        </w:tc>
+        <w:tc>
+          <w:tcPr>
+            <w:tcW w:type="dxa" w:w="1474"/>
+          </w:tcPr>
+          <w:p>
+            <w:pPr>
+              <w:spacing w:after="40" w:line="240" w:lineRule="auto"/>
+              <w:jc w:val="left"/>
+            </w:pPr>
+            <w:r/>
+            <w:r>
+              <w:rPr>
+                <w:rFonts w:ascii="Arial" w:hAnsi="Arial"/>
+                <w:sz w:val="16"/>
+              </w:rPr>
+              <w:t>Fraccionamiento y farmacia</w:t>
+            </w:r>
+          </w:p>
+        </w:tc>
+        <w:tc>
+          <w:tcPr>
+            <w:tcW w:type="dxa" w:w="1474"/>
+          </w:tcPr>
+          <w:p>
+            <w:pPr>
+              <w:spacing w:after="40" w:line="240" w:lineRule="auto"/>
+              <w:jc w:val="left"/>
+            </w:pPr>
+            <w:r/>
+            <w:r>
+              <w:rPr>
+                <w:rFonts w:ascii="Arial" w:hAnsi="Arial"/>
+                <w:sz w:val="16"/>
+              </w:rPr>
+              <w:t>Tareas generales de farmacia</w:t>
+            </w:r>
+          </w:p>
+        </w:tc>
+        <w:tc>
+          <w:tcPr>
+            <w:tcW w:type="dxa" w:w="1474"/>
+          </w:tcPr>
+          <w:p>
+            <w:pPr>
+              <w:spacing w:after="40" w:line="240" w:lineRule="auto"/>
+              <w:jc w:val="left"/>
+            </w:pPr>
+            <w:r/>
+            <w:r>
+              <w:rPr>
+                <w:rFonts w:ascii="Arial" w:hAnsi="Arial"/>
+                <w:sz w:val="16"/>
+              </w:rPr>
+              <w:t>Taller de uso racional de medicamentos</w:t>
+            </w:r>
+          </w:p>
+        </w:tc>
+      </w:tr>
+      <w:tr>
+        <w:tc>
+          <w:tcPr>
+            <w:tcW w:type="dxa" w:w="1134"/>
+          </w:tcPr>
+          <w:p>
+            <w:pPr>
+              <w:spacing w:after="40" w:line="240" w:lineRule="auto"/>
+              <w:jc w:val="left"/>
+            </w:pPr>
+            <w:r/>
+            <w:r>
+              <w:rPr>
+                <w:rFonts w:ascii="Arial" w:hAnsi="Arial"/>
+                <w:sz w:val="16"/>
+              </w:rPr>
+              <w:t>S8</w:t>
+              <w:br/>
+              <w:t>29 jun-03 jul</w:t>
+            </w:r>
+          </w:p>
+        </w:tc>
+        <w:tc>
+          <w:tcPr>
+            <w:tcW w:type="dxa" w:w="1474"/>
+          </w:tcPr>
+          <w:p>
+            <w:pPr>
+              <w:spacing w:after="40" w:line="240" w:lineRule="auto"/>
+              <w:jc w:val="left"/>
+            </w:pPr>
+            <w:r/>
+            <w:r>
+              <w:rPr>
+                <w:rFonts w:ascii="Arial" w:hAnsi="Arial"/>
+                <w:sz w:val="16"/>
+              </w:rPr>
+              <w:t>Rutina de farmacia</w:t>
+            </w:r>
+          </w:p>
+        </w:tc>
+        <w:tc>
+          <w:tcPr>
+            <w:tcW w:type="dxa" w:w="1474"/>
+          </w:tcPr>
+          <w:p>
+            <w:pPr>
+              <w:spacing w:after="40" w:line="240" w:lineRule="auto"/>
+              <w:jc w:val="left"/>
+            </w:pPr>
+            <w:r/>
+            <w:r>
+              <w:rPr>
+                <w:rFonts w:ascii="Arial" w:hAnsi="Arial"/>
+                <w:sz w:val="16"/>
+              </w:rPr>
+              <w:t>Jornada vespertina; cierre de farmacia</w:t>
+            </w:r>
+          </w:p>
+        </w:tc>
+        <w:tc>
+          <w:tcPr>
+            <w:tcW w:type="dxa" w:w="1474"/>
+          </w:tcPr>
+          <w:p>
+            <w:pPr>
+              <w:spacing w:after="40" w:line="240" w:lineRule="auto"/>
+              <w:jc w:val="left"/>
+            </w:pPr>
+            <w:r/>
+            <w:r>
+              <w:rPr>
+                <w:rFonts w:ascii="Arial" w:hAnsi="Arial"/>
+                <w:sz w:val="16"/>
+              </w:rPr>
+              <w:t>Rutina de farmacia</w:t>
+            </w:r>
+          </w:p>
+        </w:tc>
+        <w:tc>
+          <w:tcPr>
+            <w:tcW w:type="dxa" w:w="1474"/>
+          </w:tcPr>
+          <w:p>
+            <w:pPr>
+              <w:spacing w:after="40" w:line="240" w:lineRule="auto"/>
+              <w:jc w:val="left"/>
+            </w:pPr>
+            <w:r/>
+            <w:r>
+              <w:rPr>
+                <w:rFonts w:ascii="Arial" w:hAnsi="Arial"/>
+                <w:sz w:val="16"/>
+              </w:rPr>
+              <w:t>Salida a terreno para dejar medicamentos</w:t>
+            </w:r>
+          </w:p>
+        </w:tc>
+        <w:tc>
+          <w:tcPr>
+            <w:tcW w:type="dxa" w:w="1474"/>
+          </w:tcPr>
+          <w:p>
+            <w:pPr>
+              <w:spacing w:after="40" w:line="240" w:lineRule="auto"/>
+              <w:jc w:val="left"/>
+            </w:pPr>
+            <w:r/>
+            <w:r>
+              <w:rPr>
+                <w:rFonts w:ascii="Arial" w:hAnsi="Arial"/>
+                <w:sz w:val="16"/>
+              </w:rPr>
+              <w:t>Avance del seminario</w:t>
+            </w:r>
+          </w:p>
+        </w:tc>
+      </w:tr>
+      <w:tr>
+        <w:tc>
+          <w:tcPr>
+            <w:tcW w:type="dxa" w:w="1134"/>
+          </w:tcPr>
+          <w:p>
+            <w:pPr>
+              <w:spacing w:after="40" w:line="240" w:lineRule="auto"/>
+              <w:jc w:val="left"/>
+            </w:pPr>
+            <w:r/>
+            <w:r>
+              <w:rPr>
+                <w:rFonts w:ascii="Arial" w:hAnsi="Arial"/>
+                <w:sz w:val="16"/>
+              </w:rPr>
+              <w:t>S9</w:t>
+              <w:br/>
+              <w:t>06-10 jul</w:t>
+            </w:r>
+          </w:p>
+        </w:tc>
+        <w:tc>
+          <w:tcPr>
+            <w:tcW w:type="dxa" w:w="1474"/>
+          </w:tcPr>
+          <w:p>
+            <w:pPr>
+              <w:spacing w:after="40" w:line="240" w:lineRule="auto"/>
+              <w:jc w:val="left"/>
+            </w:pPr>
+            <w:r/>
+            <w:r>
+              <w:rPr>
+                <w:rFonts w:ascii="Arial" w:hAnsi="Arial"/>
+                <w:sz w:val="16"/>
+              </w:rPr>
+              <w:t>Entrega a domicilio</w:t>
+            </w:r>
+          </w:p>
+        </w:tc>
+        <w:tc>
+          <w:tcPr>
+            <w:tcW w:type="dxa" w:w="1474"/>
+          </w:tcPr>
+          <w:p>
+            <w:pPr>
+              <w:spacing w:after="40" w:line="240" w:lineRule="auto"/>
+              <w:jc w:val="left"/>
+            </w:pPr>
+            <w:r/>
+            <w:r>
+              <w:rPr>
+                <w:rFonts w:ascii="Arial" w:hAnsi="Arial"/>
+                <w:sz w:val="16"/>
+              </w:rPr>
+              <w:t>Entrega a domicilio</w:t>
+            </w:r>
+          </w:p>
+        </w:tc>
+        <w:tc>
+          <w:tcPr>
+            <w:tcW w:type="dxa" w:w="1474"/>
+          </w:tcPr>
+          <w:p>
+            <w:pPr>
+              <w:spacing w:after="40" w:line="240" w:lineRule="auto"/>
+              <w:jc w:val="left"/>
+            </w:pPr>
+            <w:r/>
+            <w:r>
+              <w:rPr>
+                <w:rFonts w:ascii="Arial" w:hAnsi="Arial"/>
+                <w:sz w:val="16"/>
+              </w:rPr>
+              <w:t>Entrega a domicilio</w:t>
+            </w:r>
+          </w:p>
+        </w:tc>
+        <w:tc>
+          <w:tcPr>
+            <w:tcW w:type="dxa" w:w="1474"/>
+          </w:tcPr>
+          <w:p>
+            <w:pPr>
+              <w:spacing w:after="40" w:line="240" w:lineRule="auto"/>
+              <w:jc w:val="left"/>
+            </w:pPr>
+            <w:r/>
+            <w:r>
+              <w:rPr>
+                <w:rFonts w:ascii="Arial" w:hAnsi="Arial"/>
+                <w:sz w:val="16"/>
+              </w:rPr>
+              <w:t>Farmacia y fraccionamiento</w:t>
+            </w:r>
+          </w:p>
+        </w:tc>
+        <w:tc>
+          <w:tcPr>
+            <w:tcW w:type="dxa" w:w="1474"/>
+          </w:tcPr>
+          <w:p>
+            <w:pPr>
+              <w:spacing w:after="40" w:line="240" w:lineRule="auto"/>
+              <w:jc w:val="left"/>
+            </w:pPr>
+            <w:r/>
+            <w:r>
+              <w:rPr>
+                <w:rFonts w:ascii="Arial" w:hAnsi="Arial"/>
+                <w:sz w:val="16"/>
+              </w:rPr>
+              <w:t>Atención farmacéutica con Q.F. especialista</w:t>
+            </w:r>
+          </w:p>
+        </w:tc>
+      </w:tr>
+    </w:tbl>
+    <w:p>
+      <w:pPr>
+        <w:jc w:val="both"/>
+      </w:pPr>
       <w:r>
         <w:rPr>
+          <w:rFonts w:ascii="Arial" w:hAnsi="Arial"/>
           <w:b w:val="0"/>
           <w:i w:val="0"/>
+          <w:sz w:val="24"/>
         </w:rPr>
-        <w:t>Respecto de las actividades no realizadas, la participación en el Comité de Farmacia y Terapéutica no pudo concretarse porque el comité no sesionó durante el periodo de la rotación, de modo que su contenido se abordó de manera indirecta a través de la revisión de los criterios de selección del arsenal y de los cambios de medicamentos informados por el Servicio de Salud. Las actividades formales de farmacovigilancia se limitaron a conocer el circuito de notificación y el algoritmo utilizado, sin que se presentara un caso que ameritara notificar durante la estadía.</w:t>
+        <w:t>Respecto de las actividades no realizadas, la participación en el Comité de Farmacia y Terapéutica no pudo concretarse porque el comité no sesionó durante el periodo de la rotación, de modo que su contenido se abordó de manera indirecta a través de la revisión de los criterios de selección del arsenal y de los cambios de medicamentos informados por el Servicio de Salud. Las actividades formales de farmacovigilancia se limitaron a conocer el circuito de notificación, sin que se presentara un caso que ameritara notificar durante la estadía.</w:t>
       </w:r>
     </w:p>
     <w:p>
@@ -2317,7 +3800,7 @@
         <w:pStyle w:val="Heading2"/>
       </w:pPr>
       <w:r>
-        <w:t>Descripción de las actividades realizadas</w:t>
+        <w:t>2.3 Descripción de las actividades realizadas</w:t>
       </w:r>
     </w:p>
     <w:p>
@@ -2325,16 +3808,21 @@
         <w:pStyle w:val="Heading3"/>
       </w:pPr>
       <w:r>
-        <w:t>Inducción y conocimiento del centro y de la unidad de farmacia</w:t>
+        <w:t>2.3.1 Inducción y conocimiento del centro y de la unidad de farmacia</w:t>
       </w:r>
     </w:p>
     <w:p>
+      <w:pPr>
+        <w:jc w:val="both"/>
+      </w:pPr>
       <w:r>
         <w:rPr>
+          <w:rFonts w:ascii="Arial" w:hAnsi="Arial"/>
           <w:b w:val="0"/>
           <w:i w:val="0"/>
+          <w:sz w:val="24"/>
         </w:rPr>
-        <w:t>Durante la primera semana se realizó la presentación al equipo de trabajo y se recorrieron las dependencias del CESFAM y de la unidad de farmacia. El equipo explicó la organización de la unidad, la ubicación física de los medicamentos, el flujo de trabajo diario y el uso de los sistemas de registro. Se revisaron los protocolos internos del establecimiento, incluidos los de emergencia, como el código rojo y la reanimación cardiopulmonar ante un paro cardiorrespiratorio, y el manejo inicial de situaciones críticas como la reacción alérgica, la hemorragia masiva y la convulsión. También se conocieron los programas computacionales de apoyo y la ficha clínica electrónica del establecimiento (SINET Sur), utilizada para consultar antecedentes y dejar constancia de las atenciones.</w:t>
+        <w:t>Durante la primera semana se realizó la presentación al equipo de trabajo y se recorrieron las dependencias del CESFAM y de la unidad de farmacia. El equipo explicó la organización de la unidad, la ubicación física de los medicamentos, el flujo de trabajo diario y el uso de los sistemas de registro. Se revisaron los protocolos internos del establecimiento, incluidos los de emergencia, como el código rojo y la reanimación cardiopulmonar ante un paro cardiorrespiratorio, y el manejo inicial de situaciones críticas como la reacción alérgica, la hemorragia masiva y la convulsión. También se conocieron los programas computacionales de apoyo y la ficha clínica electrónica del establecimiento (SINET Sur), utilizada para consultar antecedentes y dejar constancia de las atenciones. Esta actividad responde al primer objetivo específico.</w:t>
       </w:r>
     </w:p>
     <w:p>
@@ -2342,16 +3830,21 @@
         <w:pStyle w:val="Heading3"/>
       </w:pPr>
       <w:r>
-        <w:t>Recepción, almacenamiento y gestión del stock</w:t>
+        <w:t>2.3.2 Recepción, almacenamiento y gestión del stock</w:t>
       </w:r>
     </w:p>
     <w:p>
+      <w:pPr>
+        <w:jc w:val="both"/>
+      </w:pPr>
       <w:r>
         <w:rPr>
+          <w:rFonts w:ascii="Arial" w:hAnsi="Arial"/>
           <w:b w:val="0"/>
           <w:i w:val="0"/>
+          <w:sz w:val="24"/>
         </w:rPr>
-        <w:t>Se participó en la recepción y el almacenamiento de los medicamentos que llegan a la unidad, que se adquieren principalmente a través de la Central de Abastecimiento (CENABAST) y que se ordenan resguardando las condiciones de conservación. Se colaboró en la gestión del stock, con especial atención al control de los medicamentos próximos a vencer, que se marcaban y se controlaban para evitar pérdidas. Cuando un medicamento estaba por vencer y no alcanzaba a utilizarse, se gestionaban préstamos o canjes con otros centros de la red, y las existencias que no se podían aprovechar se reportaban y se redistribuían hacia otros CESFAM, de manera de dar un uso eficiente a los recursos y reducir las mermas. Se conoció además el proceso de programación anual de las necesidades de medicamentos, que se planifica según la demanda y las metas del establecimiento.</w:t>
+        <w:t>Se participó en la recepción y el almacenamiento de los medicamentos que llegan a la unidad, que se adquieren principalmente a través de la Central de Abastecimiento (CENABAST) y que se ordenan resguardando las condiciones de conservación. Se colaboró en la gestión del stock, con especial atención al control de los medicamentos próximos a vencer, que se marcaban y se controlaban para evitar pérdidas. Cuando un medicamento estaba por vencer y no alcanzaba a utilizarse, se gestionaban préstamos o canjes con otros centros de la red, y las existencias que no se podían aprovechar se reportaban y se redistribuían hacia otros CESFAM, de manera de dar un uso eficiente a los recursos y reducir las mermas. Se conoció además el proceso de programación anual de las necesidades de medicamentos, que se planifica según la demanda y las metas del establecimiento. Esta actividad responde al segundo objetivo específico.</w:t>
       </w:r>
     </w:p>
     <w:p>
@@ -2359,16 +3852,21 @@
         <w:pStyle w:val="Heading3"/>
       </w:pPr>
       <w:r>
-        <w:t>Fraccionamiento y reenvasado de medicamentos</w:t>
+        <w:t>2.3.3 Fraccionamiento y reenvasado de medicamentos</w:t>
       </w:r>
     </w:p>
     <w:p>
+      <w:pPr>
+        <w:jc w:val="both"/>
+      </w:pPr>
       <w:r>
         <w:rPr>
+          <w:rFonts w:ascii="Arial" w:hAnsi="Arial"/>
           <w:b w:val="0"/>
           <w:i w:val="0"/>
+          <w:sz w:val="24"/>
         </w:rPr>
-        <w:t>El fraccionamiento y el reenvasado fueron tareas frecuentes a lo largo del internado. El trabajo consistió en acondicionar los medicamentos en la cantidad correspondiente a cada paciente y preparar las bolsas de tratamiento, rotulando cada envase con el nombre del medicamento, la indicación, la cantidad, la fecha de vencimiento y la serie o lote, de manera de asegurar la trazabilidad del producto hasta el usuario. Este proceso permitió comprender la importancia del rotulado correcto y del resguardo de la información para la seguridad del paciente, sobre todo en personas con polifarmacia que retiran varios medicamentos a la vez.</w:t>
+        <w:t>El fraccionamiento y el reenvasado fueron tareas frecuentes a lo largo del internado. El trabajo consistió en acondicionar los medicamentos en la cantidad correspondiente a cada paciente y preparar las bolsas de tratamiento, rotulando cada envase con el nombre del medicamento, la indicación, la cantidad, la fecha de vencimiento y la serie o lote, de manera de asegurar la trazabilidad del producto hasta el usuario. Este proceso permitió comprender la importancia del rotulado correcto y del resguardo de la información para la seguridad del paciente, sobre todo en personas con polifarmacia que retiran varios medicamentos a la vez. Responde al segundo objetivo específico.</w:t>
       </w:r>
     </w:p>
     <w:p>
@@ -2376,16 +3874,21 @@
         <w:pStyle w:val="Heading3"/>
       </w:pPr>
       <w:r>
-        <w:t>Dispensación informada de medicamentos</w:t>
+        <w:t>2.3.4 Dispensación informada de medicamentos</w:t>
       </w:r>
     </w:p>
     <w:p>
+      <w:pPr>
+        <w:jc w:val="both"/>
+      </w:pPr>
       <w:r>
         <w:rPr>
+          <w:rFonts w:ascii="Arial" w:hAnsi="Arial"/>
           <w:b w:val="0"/>
           <w:i w:val="0"/>
+          <w:sz w:val="24"/>
         </w:rPr>
-        <w:t>Se apoyó la dispensación de medicamentos a los usuarios, con lo que se reforzaron el reconocimiento de los principios activos, las presentaciones y su ubicación dentro de la unidad, y las buenas prácticas de entrega. La dispensación se acompañó de la información necesaria para el uso correcto de la terapia, verificando la indicación y resolviendo dudas de los pacientes. También se conocieron los criterios de manejo de los medicamentos sujetos a control legal y la forma de registrar su entrega.</w:t>
+        <w:t>Se apoyó la dispensación de medicamentos a los usuarios, con lo que se reforzaron el reconocimiento de los principios activos, las presentaciones y su ubicación dentro de la unidad, y las buenas prácticas de entrega. La dispensación se acompañó de la información necesaria para el uso correcto de la terapia, verificando la indicación y resolviendo dudas de los pacientes. También se conocieron los criterios de manejo de los medicamentos sujetos a control legal y la forma de registrar su entrega. Responde al segundo objetivo específico.</w:t>
       </w:r>
     </w:p>
     <w:p>
@@ -2393,16 +3896,21 @@
         <w:pStyle w:val="Heading3"/>
       </w:pPr>
       <w:r>
-        <w:t>Atención farmacéutica y visitas domiciliarias</w:t>
+        <w:t>2.3.5 Atención farmacéutica y visitas domiciliarias</w:t>
       </w:r>
     </w:p>
     <w:p>
+      <w:pPr>
+        <w:jc w:val="both"/>
+      </w:pPr>
       <w:r>
         <w:rPr>
+          <w:rFonts w:ascii="Arial" w:hAnsi="Arial"/>
           <w:b w:val="0"/>
           <w:i w:val="0"/>
+          <w:sz w:val="24"/>
         </w:rPr>
-        <w:t>La atención farmacéutica fue una de las actividades más significativas del internado. Se acompañó al químico farmacéutico en la atención de los usuarios del Programa de Salud Cardiovascular, tanto en box como en el domicilio, y se participó en la entrega de medicamentos a domicilio para pacientes con dificultades para acudir al centro. En estas visitas se revisaba la medicación que el paciente realmente utilizaba, se conciliaba con la que tenía indicada, se resolvían dudas sobre horarios y formas de administración, y se reforzaba la adherencia. En una de las salidas a terreno se prestó apoyo a un adulto mayor para regresar a su hogar, situación que reflejó el componente humano y comunitario del trabajo en la atención primaria. Durante una jornada vespertina se observó, además, el funcionamiento de la farmacia en el horario de la tarde y el procedimiento de cierre de la unidad.</w:t>
+        <w:t>La atención farmacéutica fue una de las actividades más significativas del internado. Se acompañó al químico farmacéutico en la atención de los usuarios del Programa de Salud Cardiovascular, tanto en box como en el domicilio, y se participó en la entrega de medicamentos a domicilio para pacientes con dificultades para acudir al centro. En estas visitas se revisaba la medicación que el paciente realmente utilizaba, se conciliaba con la que tenía indicada, se resolvían dudas sobre horarios y formas de administración, y se reforzaba la adherencia. Durante una jornada vespertina se observó, además, el funcionamiento de la farmacia en el horario de la tarde y el procedimiento de cierre de la unidad. Esta actividad responde al tercer objetivo específico.</w:t>
       </w:r>
     </w:p>
     <w:p>
@@ -2410,16 +3918,21 @@
         <w:pStyle w:val="Heading3"/>
       </w:pPr>
       <w:r>
-        <w:t>Control de indicadores y registros de despacho</w:t>
+        <w:t>2.3.6 Educación sanitaria y promoción del uso racional de medicamentos</w:t>
       </w:r>
     </w:p>
     <w:p>
+      <w:pPr>
+        <w:jc w:val="both"/>
+      </w:pPr>
       <w:r>
         <w:rPr>
+          <w:rFonts w:ascii="Arial" w:hAnsi="Arial"/>
           <w:b w:val="0"/>
           <w:i w:val="0"/>
+          <w:sz w:val="24"/>
         </w:rPr>
-        <w:t>Se colaboró en el registro y el control de los indicadores de la unidad. Entre ellos, se trabajó en el indicador de porcentaje de despacho de medicamentos realizado según el protocolo de atención farmacéutica, desagregado por sector, y se completó la plantilla mensual de despacho correspondiente al mes de mayo. Estas tareas permitieron comprender cómo la unidad mide su actividad, justifica el uso de los recursos y respalda la toma de decisiones y la rendición ante el Servicio de Salud.</w:t>
+        <w:t>Se participó en un taller grupal de uso racional de medicamentos dirigido a los usuarios del CESFAM. La actividad se realizó junto al químico farmacéutico y consistió en conversar con los pacientes, entregar material educativo en forma de trípticos y desarrollar una dinámica participativa con paletas de respuesta, en la que los asistentes respondían situaciones sobre el uso correcto de los medicamentos y recibían pequeños incentivos por participar. La instancia favoreció la educación sanitaria y acercó el rol del farmacéutico a la comunidad. Responde al tercer objetivo específico.</w:t>
       </w:r>
     </w:p>
     <w:p>
@@ -2427,33 +3940,43 @@
         <w:pStyle w:val="Heading3"/>
       </w:pPr>
       <w:r>
-        <w:t>Inventario y ordenamiento de bodega</w:t>
+        <w:t>2.3.7 Control de indicadores, inventario y supervisiones</w:t>
       </w:r>
     </w:p>
     <w:p>
+      <w:pPr>
+        <w:jc w:val="both"/>
+      </w:pPr>
       <w:r>
         <w:rPr>
+          <w:rFonts w:ascii="Arial" w:hAnsi="Arial"/>
           <w:b w:val="0"/>
           <w:i w:val="0"/>
+          <w:sz w:val="24"/>
         </w:rPr>
-        <w:t>Se participó en las tareas de inventario y en el ordenamiento de la bodega de la unidad, cuidando que las existencias quedaran correctamente ubicadas y que no permanecieran cajas en el piso, tanto por seguridad como por buenas prácticas de almacenamiento. Esta actividad reforzó la importancia del orden y de la conservación adecuada de los medicamentos.</w:t>
+        <w:t>Se colaboró en el registro y el control de los indicadores de la unidad. Entre ellos, se trabajó en el indicador de porcentaje de despacho de medicamentos realizado según el protocolo de atención farmacéutica, desagregado por sector, y se completó la plantilla mensual de despacho correspondiente al mes de mayo. También se participó en las tareas de inventario y en el ordenamiento de la bodega, cuidando que las existencias quedaran correctamente ubicadas y que no permanecieran cajas en el piso. Durante el internado el establecimiento recibió supervisiones e inspecciones del Servicio de Salud, en cuya preparación se acompañó al equipo, lo que permitió conocer los aspectos que se evalúan en la unidad de farmacia y la relevancia de mantener los registros al día. Además, en una salida a terreno se prestó apoyo a un adulto mayor para regresar a su hogar, situación que reflejó el componente humano y comunitario del trabajo en la atención primaria.</w:t>
       </w:r>
     </w:p>
     <w:p>
       <w:pPr>
-        <w:pStyle w:val="Heading3"/>
+        <w:pStyle w:val="Heading2"/>
       </w:pPr>
       <w:r>
-        <w:t>Apoyo en supervisiones del Servicio de Salud</w:t>
+        <w:t>2.4 Seminario de título</w:t>
       </w:r>
     </w:p>
     <w:p>
+      <w:pPr>
+        <w:jc w:val="both"/>
+      </w:pPr>
       <w:r>
         <w:rPr>
+          <w:rFonts w:ascii="Arial" w:hAnsi="Arial"/>
           <w:b w:val="0"/>
           <w:i w:val="0"/>
+          <w:sz w:val="24"/>
         </w:rPr>
-        <w:t>Durante el internado el establecimiento recibió supervisiones e inspecciones del Servicio de Salud. Se acompañó al equipo en la preparación y atención de estas instancias, lo que permitió conocer los aspectos que se evalúan en la unidad de farmacia y la relevancia de mantener los registros y los procesos al día. En paralelo, en algunas de estas jornadas se dispuso de tiempo para avanzar en el trabajo de investigación.</w:t>
+        <w:t>El seminario de título se desarrolló en paralelo a las actividades de farmacia y corresponde al cuarto objetivo específico del internado. Consistió en el diseño de un protocolo de atención farmacéutica domiciliaria basado en el Modelo CMO para los pacientes del Programa de Salud Cardiovascular del CESFAM Villa Nonguén, bajo la guía del profesor Diego Ignacio Jorquera Pereira y con el apoyo del químico farmacéutico tutor del centro. A continuación se describe cómo se realizó.</w:t>
       </w:r>
     </w:p>
     <w:p>
@@ -2461,33 +3984,43 @@
         <w:pStyle w:val="Heading3"/>
       </w:pPr>
       <w:r>
-        <w:t>Educación sanitaria y promoción del uso racional de medicamentos</w:t>
+        <w:t>2.4.1 Objetivos del seminario</w:t>
       </w:r>
     </w:p>
     <w:p>
+      <w:pPr>
+        <w:jc w:val="both"/>
+      </w:pPr>
       <w:r>
         <w:rPr>
+          <w:rFonts w:ascii="Arial" w:hAnsi="Arial"/>
           <w:b w:val="0"/>
           <w:i w:val="0"/>
+          <w:sz w:val="24"/>
         </w:rPr>
-        <w:t>Se participó en un taller grupal de uso racional de medicamentos dirigido a los usuarios del CESFAM. La actividad se realizó junto al químico farmacéutico y consistió en conversar con los pacientes, entregar material educativo en forma de trípticos y desarrollar una dinámica participativa con paletas de respuesta, en la que los asistentes respondían situaciones sobre el uso correcto de los medicamentos y recibían pequeños incentivos por participar. La instancia favoreció la educación sanitaria y permitió acercar el rol del farmacéutico a la comunidad.</w:t>
+        <w:t>El objetivo general del seminario fue diseñar un protocolo de atención farmacéutica domiciliaria basado en el Modelo CMO para los pacientes del Programa de Salud Cardiovascular del CESFAM Villa Nonguén. Para alcanzarlo se plantearon tres objetivos específicos: diagnosticar las brechas del programa de visitas domiciliarias que se realizaba en el centro; definir el flujograma de la visita y los criterios para priorizar a los pacientes según los pilares del Modelo CMO; y diseñar los instrumentos y herramientas clínicas necesarias para aplicar el protocolo, referidas a la adherencia, a los PRM y RNM y al registro de la atención.</w:t>
       </w:r>
     </w:p>
     <w:p>
       <w:pPr>
-        <w:pStyle w:val="Heading2"/>
+        <w:pStyle w:val="Heading3"/>
       </w:pPr>
       <w:r>
-        <w:t>Trabajo de investigación del internado</w:t>
+        <w:t>2.4.2 Tipo de estudio y desarrollo</w:t>
       </w:r>
     </w:p>
     <w:p>
+      <w:pPr>
+        <w:jc w:val="both"/>
+      </w:pPr>
       <w:r>
         <w:rPr>
+          <w:rFonts w:ascii="Arial" w:hAnsi="Arial"/>
           <w:b w:val="0"/>
           <w:i w:val="0"/>
+          <w:sz w:val="24"/>
         </w:rPr>
-        <w:t>Como parte del internado, y bajo la supervisión del químico farmacéutico tutor, se desarrolló un trabajo de investigación consistente en el diseño de un protocolo de atención farmacéutica domiciliaria basado en el Modelo CMO para los pacientes del Programa de Salud Cardiovascular del CESFAM Villa Nonguén. El trabajo se enmarca en la necesidad de ordenar y estandarizar la visita domiciliaria del farmacéutico, que en el centro se realizaba con criterio clínico y registro en la ficha, pero sin un procedimiento escrito y común que la hiciera trazable y comparable entre profesionales.</w:t>
+        <w:t>El seminario correspondió a un trabajo de desarrollo metodológico. No se realizó un experimento ni se recogieron datos clínicos de pacientes con fines de investigación, sino que se diseñó un protocolo a partir de la revisión de la literatura, del análisis de la normativa del Ministerio de Salud y de la adaptación de herramientas ya utilizadas en la atención primaria, ajustadas a lo observado en el propio centro. El trabajo se desarrolló durante los meses del internado, en el CESFAM Villa Nonguén y su territorio. La revisión bibliográfica se realizó en bases de datos como PubMed, SciELO y Google Scholar, junto con la normativa y las guías del Ministerio de Salud, y las referencias se ordenaron con el gestor bibliográfico Mendeley. Como apoyo para la información de medicamentos se consultaron fuentes de referencia como UpToDate, Medscape y Drugs.com.</w:t>
       </w:r>
     </w:p>
     <w:p>
@@ -2495,33 +4028,21 @@
         <w:pStyle w:val="Heading3"/>
       </w:pPr>
       <w:r>
-        <w:t>Tipo de estudio y periodo</w:t>
+        <w:t>2.4.3 Diagnóstico de brechas, población y criterios</w:t>
       </w:r>
     </w:p>
     <w:p>
+      <w:pPr>
+        <w:jc w:val="both"/>
+      </w:pPr>
       <w:r>
         <w:rPr>
+          <w:rFonts w:ascii="Arial" w:hAnsi="Arial"/>
           <w:b w:val="0"/>
           <w:i w:val="0"/>
+          <w:sz w:val="24"/>
         </w:rPr>
-        <w:t>Correspondió a un trabajo de desarrollo metodológico. No se realizó un experimento ni se recogieron datos clínicos de pacientes con fines de investigación, sino que se diseñó un protocolo a partir de la revisión de la literatura, del análisis de la normativa del Ministerio de Salud y de la adaptación de herramientas ya utilizadas en la atención primaria, ajustadas a lo observado en el propio centro. El trabajo se desarrolló durante los meses del internado, entre mayo y julio de 2026, en el CESFAM Villa Nonguén y su territorio.</w:t>
-      </w:r>
-    </w:p>
-    <w:p>
-      <w:pPr>
-        <w:pStyle w:val="Heading3"/>
-      </w:pPr>
-      <w:r>
-        <w:t>Diagnóstico, población y criterios</w:t>
-      </w:r>
-    </w:p>
-    <w:p>
-      <w:r>
-        <w:rPr>
-          <w:b w:val="0"/>
-          <w:i w:val="0"/>
-        </w:rPr>
-        <w:t>En una primera etapa se diagnosticaron las brechas del programa de visitas domiciliarias vigente, comparando la práctica del centro con las orientaciones técnicas del Programa de Salud Cardiovascular y del Fondo de Farmacia, la Guía de Atención Farmacéutica y Seguimiento Farmacoterapéutico en APS y los tres pilares del Modelo CMO. La Tabla 3 resume las brechas detectadas. El protocolo se orientó a las personas adultas y mayores del Programa de Salud Cardiovascular, con prioridad en quienes toman muchos medicamentos, dependen de un cuidador, se descompensan con frecuencia o tienen dificultades para acudir al centro. Se definieron criterios de inclusión, usuarios del programa mayores de 18 años, descompensados o con control inestable y en seguimiento activo, y criterios de exclusión, como las barreras de comunicación que impiden la entrevista, el deterioro cognitivo importante sin cuidador de apoyo, la residencia fuera del territorio y la inasistencia a controles por más de seis meses.</w:t>
+        <w:t>En una primera etapa se diagnosticaron las brechas del programa de visitas domiciliarias vigente, comparando la práctica del centro con las orientaciones técnicas del Programa de Salud Cardiovascular y del Fondo de Farmacia, la Guía de Atención Farmacéutica y Seguimiento Farmacoterapéutico en APS (Ministerio de Salud de Chile, 2018a) y los tres pilares del Modelo CMO. Como referencia se utilizó también la evaluación previa del mismo programa, que había seguido a veinte usuarios y encontrado que todos tenían al menos un problema relacionado con sus medicamentos y que solo el 15% era adherente al inicio del seguimiento (Faúndez Navarrete, 2020). La Tabla 4 resume las brechas detectadas. El protocolo se orientó a las personas adultas y mayores del programa, con prioridad en quienes toman muchos medicamentos, dependen de un cuidador, se descompensan con frecuencia o tienen dificultades para acudir al centro, y se definieron criterios de inclusión y de exclusión para ordenar el ingreso al seguimiento.</w:t>
       </w:r>
     </w:p>
     <w:p>
@@ -2652,7 +4173,7 @@
           </w:tcPr>
           <w:p>
             <w:pPr>
-              <w:spacing w:after="40"/>
+              <w:spacing w:after="40" w:line="240" w:lineRule="auto"/>
               <w:jc w:val="left"/>
             </w:pPr>
             <w:r/>
@@ -2671,7 +4192,7 @@
           </w:tcPr>
           <w:p>
             <w:pPr>
-              <w:spacing w:after="40"/>
+              <w:spacing w:after="40" w:line="240" w:lineRule="auto"/>
               <w:jc w:val="left"/>
             </w:pPr>
             <w:r/>
@@ -2680,7 +4201,7 @@
                 <w:rFonts w:ascii="Arial" w:hAnsi="Arial"/>
                 <w:sz w:val="18"/>
               </w:rPr>
-              <w:t>Priorizar la visita según el riesgo y la complejidad del paciente.</w:t>
+              <w:t>Priorizar la visita según el riesgo y la complejidad.</w:t>
             </w:r>
           </w:p>
         </w:tc>
@@ -2690,7 +4211,7 @@
           </w:tcPr>
           <w:p>
             <w:pPr>
-              <w:spacing w:after="40"/>
+              <w:spacing w:after="40" w:line="240" w:lineRule="auto"/>
               <w:jc w:val="left"/>
             </w:pPr>
             <w:r/>
@@ -2709,7 +4230,7 @@
           </w:tcPr>
           <w:p>
             <w:pPr>
-              <w:spacing w:after="40"/>
+              <w:spacing w:after="40" w:line="240" w:lineRule="auto"/>
               <w:jc w:val="left"/>
             </w:pPr>
             <w:r/>
@@ -2730,7 +4251,7 @@
           </w:tcPr>
           <w:p>
             <w:pPr>
-              <w:spacing w:after="40"/>
+              <w:spacing w:after="40" w:line="240" w:lineRule="auto"/>
               <w:jc w:val="left"/>
             </w:pPr>
             <w:r/>
@@ -2749,7 +4270,7 @@
           </w:tcPr>
           <w:p>
             <w:pPr>
-              <w:spacing w:after="40"/>
+              <w:spacing w:after="40" w:line="240" w:lineRule="auto"/>
               <w:jc w:val="left"/>
             </w:pPr>
             <w:r/>
@@ -2768,7 +4289,7 @@
           </w:tcPr>
           <w:p>
             <w:pPr>
-              <w:spacing w:after="40"/>
+              <w:spacing w:after="40" w:line="240" w:lineRule="auto"/>
               <w:jc w:val="left"/>
             </w:pPr>
             <w:r/>
@@ -2787,7 +4308,7 @@
           </w:tcPr>
           <w:p>
             <w:pPr>
-              <w:spacing w:after="40"/>
+              <w:spacing w:after="40" w:line="240" w:lineRule="auto"/>
               <w:jc w:val="left"/>
             </w:pPr>
             <w:r/>
@@ -2808,7 +4329,7 @@
           </w:tcPr>
           <w:p>
             <w:pPr>
-              <w:spacing w:after="40"/>
+              <w:spacing w:after="40" w:line="240" w:lineRule="auto"/>
               <w:jc w:val="left"/>
             </w:pPr>
             <w:r/>
@@ -2827,7 +4348,7 @@
           </w:tcPr>
           <w:p>
             <w:pPr>
-              <w:spacing w:after="40"/>
+              <w:spacing w:after="40" w:line="240" w:lineRule="auto"/>
               <w:jc w:val="left"/>
             </w:pPr>
             <w:r/>
@@ -2846,7 +4367,7 @@
           </w:tcPr>
           <w:p>
             <w:pPr>
-              <w:spacing w:after="40"/>
+              <w:spacing w:after="40" w:line="240" w:lineRule="auto"/>
               <w:jc w:val="left"/>
             </w:pPr>
             <w:r/>
@@ -2855,7 +4376,7 @@
                 <w:rFonts w:ascii="Arial" w:hAnsi="Arial"/>
                 <w:sz w:val="18"/>
               </w:rPr>
-              <w:t>Registro en la ficha clínica electrónica (SINET Sur); frecuencia según disponibilidad.</w:t>
+              <w:t>Registro en la ficha clínica (SINET Sur) y en hojas de apoyo personales.</w:t>
             </w:r>
           </w:p>
         </w:tc>
@@ -2865,7 +4386,7 @@
           </w:tcPr>
           <w:p>
             <w:pPr>
-              <w:spacing w:after="40"/>
+              <w:spacing w:after="40" w:line="240" w:lineRule="auto"/>
               <w:jc w:val="left"/>
             </w:pPr>
             <w:r/>
@@ -2874,7 +4395,7 @@
                 <w:rFonts w:ascii="Arial" w:hAnsi="Arial"/>
                 <w:sz w:val="18"/>
               </w:rPr>
-              <w:t>Falta un registro propio de la atención farmacéutica y una pauta común de seguimiento.</w:t>
+              <w:t>Falta un instrumento de registro propio de la atención farmacéutica.</w:t>
             </w:r>
           </w:p>
         </w:tc>
@@ -2885,99 +4406,85 @@
         <w:pStyle w:val="Heading3"/>
       </w:pPr>
       <w:r>
-        <w:t>Intervenciones, instrumentos y fuentes de información</w:t>
+        <w:t>2.4.4 Instrumentos diseñados y consideraciones éticas</w:t>
       </w:r>
     </w:p>
     <w:p>
+      <w:pPr>
+        <w:jc w:val="both"/>
+      </w:pPr>
       <w:r>
         <w:rPr>
+          <w:rFonts w:ascii="Arial" w:hAnsi="Arial"/>
           <w:b w:val="0"/>
           <w:i w:val="0"/>
+          <w:sz w:val="24"/>
         </w:rPr>
-        <w:t>El protocolo tradujo los tres pilares del Modelo CMO en pasos concretos. La Capacidad se abordó mediante la priorización de los pacientes y la revisión del botiquín del hogar para conciliar la medicación; la Motivación, mediante la entrevista motivacional orientada a trabajar las creencias y las barreras de adherencia; y la Oportunidad, mediante la continuidad del seguimiento por vía telefónica y el refuerzo del vínculo con la farmacia. Para su aplicación se seleccionaron y adaptaron instrumentos sencillos, compatibles con la rutina del CESFAM, entre ellos el test de Morisky-Green-Levine para la adherencia, la clasificación de los PRM y RNM según el Consenso de Granada, una ficha de conciliación, una ficha de seguimiento farmacoterapéutico, una hoja con el esquema de horarios y un protocolo de llamada telefónica para agendar la visita. La revisión bibliográfica que sustentó estas decisiones se realizó en bases de datos como PubMed, SciELO y Google Scholar, junto con la normativa y las guías del Ministerio de Salud. Como apoyo para la información de medicamentos se consultaron fuentes de referencia como UpToDate, Medscape y Drugs.com.</w:t>
+        <w:t>El protocolo tradujo los tres pilares del Modelo CMO en pasos concretos. La Capacidad se abordó mediante la priorización de los pacientes y la revisión del botiquín del hogar para conciliar la medicación (Delgado et al., 2007); la Motivación, mediante la entrevista motivacional orientada a trabajar las creencias y barreras de adherencia; y la Oportunidad, mediante la continuidad del seguimiento por vía telefónica y el refuerzo del vínculo con la farmacia. Para su aplicación se diseñaron y adaptaron instrumentos sencillos, compatibles con la rutina del CESFAM: una ficha de conciliación, una ficha de seguimiento farmacoterapéutico, el test de Morisky-Green-Levine para la adherencia, la clasificación de los PRM y RNM según el Consenso de Granada, una hoja con el esquema de horarios y un protocolo de llamada telefónica para agendar la visita (ver Anexos). Al tratarse del diseño de un protocolo y no de un estudio con pacientes, el trabajo no contempló intervenciones experimentales ni la recolección de datos clínicos sensibles con fines de investigación, y se resguardaron los principios de confidencialidad y de uso responsable de la información clínica. La propuesta quedó a disposición de los químicos farmacéuticos del establecimiento para su revisión y eventual incorporación a la práctica.</w:t>
       </w:r>
     </w:p>
     <w:p>
       <w:pPr>
-        <w:pStyle w:val="Heading3"/>
+        <w:pStyle w:val="Heading1"/>
       </w:pPr>
       <w:r>
-        <w:t>Consideraciones éticas</w:t>
+        <w:t>3. DISCUSIÓN Y CONCLUSIONES</w:t>
       </w:r>
     </w:p>
     <w:p>
+      <w:pPr>
+        <w:pStyle w:val="Heading2"/>
+      </w:pPr>
       <w:r>
-        <w:rPr>
-          <w:b w:val="0"/>
-          <w:i w:val="0"/>
-        </w:rPr>
-        <w:t>Al tratarse del diseño de un protocolo y no de un estudio con pacientes, el trabajo no contempló intervenciones experimentales ni la recolección de datos clínicos sensibles con fines de investigación. Su elaboración se basó en la literatura, en la normativa vigente y en la observación de los procesos habituales del centro. Se resguardaron los principios de confidencialidad y de uso responsable de la información clínica, sin registrar datos que permitieran identificar a pacientes ni modificar tratamientos fuera del trabajo habitual del equipo de salud. La propuesta quedó a disposición de los químicos farmacéuticos del establecimiento para su revisión y eventual incorporación a la práctica.</w:t>
+        <w:t>3.1 Alcances y cumplimiento de los objetivos</w:t>
       </w:r>
     </w:p>
     <w:p>
       <w:pPr>
-        <w:pStyle w:val="Heading1"/>
+        <w:jc w:val="both"/>
       </w:pPr>
       <w:r>
-        <w:t>DISCUSIÓN Y CONCLUSIONES</w:t>
+        <w:rPr>
+          <w:rFonts w:ascii="Arial" w:hAnsi="Arial"/>
+          <w:b w:val="0"/>
+          <w:i w:val="0"/>
+          <w:sz w:val="24"/>
+        </w:rPr>
+        <w:t>El internado permitió conocer de manera directa el funcionamiento de una unidad de farmacia de atención primaria y participar en la mayoría de sus procesos, desde la gestión del arsenal hasta la atención farmacéutica en el domicilio. El primer objetivo específico se cumplió al reconocer la estructura, las funciones del equipo y los procesos de la unidad, tal como se describe en la sección 1 y en el organigrama. El segundo se alcanzó mediante la participación sostenida en la recepción, el almacenamiento, la gestión de stock, el fraccionamiento, el reenvasado y la dispensación, resguardando la trazabilidad a través del rotulado. El tercero se desarrolló a través de la atención farmacéutica, las visitas domiciliarias y el taller de uso racional de medicamentos. Y el cuarto se materializó en el diseño del protocolo de atención farmacéutica domiciliaria basado en el Modelo CMO, presentado como seminario de título. En conjunto, estas actividades permitieron cumplir el objetivo general del internado.</w:t>
       </w:r>
     </w:p>
     <w:p>
       <w:pPr>
-        <w:pStyle w:val="Heading2"/>
+        <w:jc w:val="both"/>
       </w:pPr>
       <w:r>
-        <w:t>Alcances de las actividades realizadas</w:t>
+        <w:rPr>
+          <w:rFonts w:ascii="Arial" w:hAnsi="Arial"/>
+          <w:b w:val="0"/>
+          <w:i w:val="0"/>
+          <w:sz w:val="24"/>
+        </w:rPr>
+        <w:t>Los resultados observados en terreno concuerdan con lo descrito en la literatura reciente. La evidencia muestra que las intervenciones farmacéuticas domiciliarias mejoran la adherencia y el conocimiento de los pacientes sobre su tratamiento, sobre todo en personas mayores y con polifarmacia (Ahn et al., 2024), y que el acompañamiento sostenido en el tiempo produce mejores resultados de adherencia en pacientes crónicos (Lambert et al., 2024). En el ámbito cardiovascular, la falta de adherencia sigue siendo una de las principales barreras para el control de la hipertensión, la diabetes y la dislipidemia, y las estrategias más eficaces combinan la comunicación con el paciente, la continuidad de la atención y la participación del farmacéutico (Espinosa García et al., 2023). Asimismo, las experiencias de aplicación del Modelo CMO en distintos grupos de pacientes crónicos han mostrado mejoras en la adherencia, en los objetivos farmacoterapéuticos y en la experiencia del usuario (Cantillana-Suárez et al., 2021; Sánchez-Yáñez et al., 2023), aunque su adopción todavía enfrenta barreras organizacionales que conviene anticipar (Álvarez-Díaz et al., 2025; Morillo-Verdugo et al., 2022). Estos antecedentes respaldan la pertinencia del protocolo diseñado durante el internado.</w:t>
       </w:r>
     </w:p>
     <w:p>
+      <w:pPr>
+        <w:pStyle w:val="Heading2"/>
+      </w:pPr>
       <w:r>
-        <w:rPr>
-          <w:b w:val="0"/>
-          <w:i w:val="0"/>
-        </w:rPr>
-        <w:t>El internado permitió conocer de manera directa el funcionamiento de una unidad de farmacia de atención primaria y participar en la mayoría de sus procesos, desde la gestión del arsenal hasta la atención farmacéutica en el domicilio. Las actividades realizadas cubrieron los objetivos planteados y abarcaron tanto tareas de gestión y logística como tareas clínicas y educativas, lo que entregó una visión completa del rol del químico farmacéutico en este nivel de atención. La experiencia confirmó que el trabajo del farmacéutico en la atención primaria no se agota en la entrega del medicamento, sino que se extiende al uso seguro y racional de la terapia, al seguimiento del paciente y a la vinculación con la comunidad.</w:t>
+        <w:t>3.2 Fortalezas y debilidades del centro</w:t>
       </w:r>
     </w:p>
     <w:p>
       <w:pPr>
-        <w:pStyle w:val="Heading2"/>
-      </w:pPr>
-      <w:r>
-        <w:t>Cumplimiento de los objetivos</w:t>
-      </w:r>
-    </w:p>
-    <w:p>
+        <w:jc w:val="both"/>
+      </w:pPr>
       <w:r>
         <w:rPr>
+          <w:rFonts w:ascii="Arial" w:hAnsi="Arial"/>
           <w:b w:val="0"/>
           <w:i w:val="0"/>
-        </w:rPr>
-        <w:t>El primer objetivo específico se cumplió al conocer la estructura, las funciones del equipo y los procesos de la unidad de farmacia, tal como se describe en la introducción y en el organigrama. El segundo se alcanzó mediante la participación sostenida en la recepción, el almacenamiento, la gestión de stock, el fraccionamiento, el reenvasado y la dispensación, resguardando la trazabilidad a través del rotulado. El tercero se desarrolló a través de la atención farmacéutica, las visitas domiciliarias y el taller de uso racional de medicamentos. El cuarto objetivo se materializó en el diseño del protocolo de atención farmacéutica domiciliaria basado en el Modelo CMO.</w:t>
-      </w:r>
-    </w:p>
-    <w:p>
-      <w:r>
-        <w:rPr>
-          <w:b w:val="0"/>
-          <w:i w:val="0"/>
-        </w:rPr>
-        <w:t>Los resultados observados en terreno concuerdan con lo descrito en la literatura reciente. La evidencia muestra que las intervenciones farmacéuticas domiciliarias mejoran la adherencia y el conocimiento de los pacientes sobre su tratamiento, sobre todo en personas mayores y con polifarmacia (Ahn et al., 2024), y que el acompañamiento sostenido en el tiempo produce mejores resultados de adherencia en pacientes crónicos (Lambert et al., 2024). En el ámbito cardiovascular, la falta de adherencia sigue siendo una de las principales barreras para el control de la hipertensión, la diabetes y la dislipidemia, y las estrategias más eficaces combinan la comunicación con el paciente, la continuidad de la atención y la participación del farmacéutico (Espinosa García et al., 2023). Asimismo, las experiencias de aplicación del Modelo CMO en distintos grupos de pacientes crónicos han mostrado mejoras en la adherencia, en los objetivos farmacoterapéuticos y en la experiencia del usuario (Cantillana Suárez et al., 2021; Sánchez Yáñez et al., 2023), aunque su adopción todavía enfrenta barreras organizacionales que conviene anticipar (Álvarez Díaz et al., 2025). Estos antecedentes respaldan la pertinencia del protocolo diseñado durante el internado.</w:t>
-      </w:r>
-    </w:p>
-    <w:p>
-      <w:pPr>
-        <w:pStyle w:val="Heading2"/>
-      </w:pPr>
-      <w:r>
-        <w:t>Fortalezas y debilidades del centro</w:t>
-      </w:r>
-    </w:p>
-    <w:p>
-      <w:r>
-        <w:rPr>
-          <w:b w:val="0"/>
-          <w:i w:val="0"/>
+          <w:sz w:val="24"/>
         </w:rPr>
         <w:t>Entre las fortalezas del CESFAM Villa Nonguén destacan su condición de centro pionero en el Modelo de Salud Familiar, un equipo de farmacia consolidado que ya realiza atención farmacéutica en box y en el domicilio, y una cultura de trabajo orientada a la comunidad. La sectorización del territorio y la existencia de indicadores de despacho facilitan la organización de la atención y el uso eficiente de los recursos. Como aspecto por mejorar, se observó que la visita domiciliaria del farmacéutico se realizaba sin un procedimiento escrito y estandarizado, y que el registro se apoyaba en hojas personales además de la ficha clínica electrónica, lo que dificultaba la comparación entre profesionales y el seguimiento en el tiempo. La carga de trabajo y la disponibilidad de tiempo también limitaban la frecuencia de las visitas.</w:t>
       </w:r>
@@ -2987,7 +4494,7 @@
         <w:pStyle w:val="Heading2"/>
       </w:pPr>
       <w:r>
-        <w:t>Sugerencias y propuestas de mejora</w:t>
+        <w:t>3.3 Sugerencias y propuestas de mejora</w:t>
       </w:r>
     </w:p>
     <w:p>
@@ -3013,7 +4520,7 @@
           <w:rFonts w:ascii="Arial" w:hAnsi="Arial"/>
           <w:sz w:val="24"/>
         </w:rPr>
-        <w:t>Estandarizar el registro de la atención farmacéutica mediante fichas de conciliación y de seguimiento comunes, que luego se traspasen a la ficha clínica electrónica, de modo de mejorar la trazabilidad y la continuidad.</w:t>
+        <w:t>Estandarizar el registro de la atención farmacéutica mediante fichas de conciliación y de seguimiento comunes, que luego se traspasen a la ficha clínica electrónica, para mejorar la trazabilidad y la continuidad.</w:t>
       </w:r>
     </w:p>
     <w:p>
@@ -3047,7 +4554,7 @@
         <w:pStyle w:val="Heading2"/>
       </w:pPr>
       <w:r>
-        <w:t>Conclusiones</w:t>
+        <w:t>3.4 Conclusiones</w:t>
       </w:r>
     </w:p>
     <w:p>
@@ -3073,7 +4580,7 @@
           <w:rFonts w:ascii="Arial" w:hAnsi="Arial"/>
           <w:sz w:val="24"/>
         </w:rPr>
-        <w:t>Se conocieron y se aplicaron los procesos técnicos y administrativos de la unidad de farmacia, con especial énfasis en el fraccionamiento, el reenvasado, la dispensación y la gestión del stock, resguardando la trazabilidad y el uso eficiente de los recursos.</w:t>
+        <w:t>Se reconocieron la estructura y los procesos de la unidad de farmacia, y se participó en las tareas de recepción, almacenamiento, gestión de stock, fraccionamiento, reenvasado y dispensación, resguardando la trazabilidad y el uso eficiente de los recursos.</w:t>
       </w:r>
     </w:p>
     <w:p>
@@ -3086,7 +4593,7 @@
           <w:rFonts w:ascii="Arial" w:hAnsi="Arial"/>
           <w:sz w:val="24"/>
         </w:rPr>
-        <w:t>Se participó de manera activa en la atención farmacéutica, las visitas domiciliarias y la promoción del uso racional de los medicamentos, lo que evidenció el aporte clínico y comunitario del farmacéutico en este nivel de atención.</w:t>
+        <w:t>Se ejecutaron actividades de atención farmacéutica, visitas domiciliarias y promoción del uso racional de los medicamentos, lo que evidenció el aporte clínico y comunitario del farmacéutico en este nivel de atención.</w:t>
       </w:r>
     </w:p>
     <w:p>
@@ -3099,7 +4606,7 @@
           <w:rFonts w:ascii="Arial" w:hAnsi="Arial"/>
           <w:sz w:val="24"/>
         </w:rPr>
-        <w:t>Se diseñó un protocolo de atención farmacéutica domiciliaria basado en el Modelo CMO para el Programa de Salud Cardiovascular, que aporta una herramienta concreta para ordenar, estandarizar y hacer trazable la visita domiciliaria en el establecimiento.</w:t>
+        <w:t>Se diseñó, como seminario de título, un protocolo de atención farmacéutica domiciliaria basado en el Modelo CMO, que aporta una herramienta concreta para ordenar, estandarizar y hacer trazable la visita domiciliaria en el establecimiento.</w:t>
       </w:r>
     </w:p>
     <w:p>
@@ -3316,7 +4823,35 @@
           <w:rFonts w:ascii="Arial" w:hAnsi="Arial"/>
           <w:sz w:val="24"/>
         </w:rPr>
-        <w:t>Ministerio de Salud de Chile. (2017). Orientación técnica Programa de Salud Cardiovascular. Gobierno de Chile.</w:t>
+        <w:t>Martín Alfonso, L. (2004). Acerca del concepto de adherencia terapéutica. Revista Cubana de Salud Pública, 30(4).</w:t>
+      </w:r>
+    </w:p>
+    <w:p>
+      <w:pPr>
+        <w:spacing w:line="360" w:lineRule="auto" w:after="160"/>
+        <w:ind w:left="567" w:hanging="567"/>
+        <w:jc w:val="both"/>
+      </w:pPr>
+      <w:r>
+        <w:rPr>
+          <w:rFonts w:ascii="Arial" w:hAnsi="Arial"/>
+          <w:sz w:val="24"/>
+        </w:rPr>
+        <w:t>Ministerio de Salud de Chile. (2017a). Encuesta Nacional de Salud 2016-2017. Gobierno de Chile.</w:t>
+      </w:r>
+    </w:p>
+    <w:p>
+      <w:pPr>
+        <w:spacing w:line="360" w:lineRule="auto" w:after="160"/>
+        <w:ind w:left="567" w:hanging="567"/>
+        <w:jc w:val="both"/>
+      </w:pPr>
+      <w:r>
+        <w:rPr>
+          <w:rFonts w:ascii="Arial" w:hAnsi="Arial"/>
+          <w:sz w:val="24"/>
+        </w:rPr>
+        <w:t>Ministerio de Salud de Chile. (2017b). Orientación técnica Programa de Salud Cardiovascular. Gobierno de Chile.</w:t>
       </w:r>
     </w:p>
     <w:p>
@@ -3426,12 +4961,17 @@
       </w:r>
     </w:p>
     <w:p>
+      <w:pPr>
+        <w:jc w:val="both"/>
+      </w:pPr>
       <w:r>
         <w:rPr>
+          <w:rFonts w:ascii="Arial" w:hAnsi="Arial"/>
           <w:b w:val="0"/>
           <w:i w:val="0"/>
+          <w:sz w:val="24"/>
         </w:rPr>
-        <w:t>Los anexos reúnen los principales instrumentos de apoyo que acompañan al protocolo de atención farmacéutica domiciliaria diseñado durante el internado. Son formatos de trabajo pensados para usarse durante la visita y el seguimiento en el CESFAM, y pueden ajustarse a los registros propios del establecimiento.</w:t>
+        <w:t>Los anexos reúnen los principales instrumentos de apoyo diseñados para el protocolo de atención farmacéutica domiciliaria del seminario de título. Son formatos de trabajo pensados para usarse durante la visita y el seguimiento en el CESFAM, y pueden ajustarse a los registros propios del establecimiento.</w:t>
       </w:r>
     </w:p>
     <w:p>
@@ -3549,7 +5089,7 @@
           </w:tcPr>
           <w:p>
             <w:pPr>
-              <w:spacing w:after="40"/>
+              <w:spacing w:after="40" w:line="240" w:lineRule="auto"/>
               <w:jc w:val="left"/>
             </w:pPr>
             <w:r/>
@@ -3568,7 +5108,7 @@
           </w:tcPr>
           <w:p>
             <w:pPr>
-              <w:spacing w:after="40"/>
+              <w:spacing w:after="40" w:line="240" w:lineRule="auto"/>
               <w:jc w:val="left"/>
             </w:pPr>
             <w:r/>
@@ -3587,7 +5127,7 @@
           </w:tcPr>
           <w:p>
             <w:pPr>
-              <w:spacing w:after="40"/>
+              <w:spacing w:after="40" w:line="240" w:lineRule="auto"/>
               <w:jc w:val="left"/>
             </w:pPr>
             <w:r/>
@@ -3608,7 +5148,7 @@
           </w:tcPr>
           <w:p>
             <w:pPr>
-              <w:spacing w:after="40"/>
+              <w:spacing w:after="40" w:line="240" w:lineRule="auto"/>
               <w:jc w:val="left"/>
             </w:pPr>
             <w:r/>
@@ -3627,7 +5167,7 @@
           </w:tcPr>
           <w:p>
             <w:pPr>
-              <w:spacing w:after="40"/>
+              <w:spacing w:after="40" w:line="240" w:lineRule="auto"/>
               <w:jc w:val="left"/>
             </w:pPr>
             <w:r/>
@@ -3646,7 +5186,7 @@
           </w:tcPr>
           <w:p>
             <w:pPr>
-              <w:spacing w:after="40"/>
+              <w:spacing w:after="40" w:line="240" w:lineRule="auto"/>
               <w:jc w:val="left"/>
             </w:pPr>
             <w:r/>
@@ -3667,7 +5207,7 @@
           </w:tcPr>
           <w:p>
             <w:pPr>
-              <w:spacing w:after="40"/>
+              <w:spacing w:after="40" w:line="240" w:lineRule="auto"/>
               <w:jc w:val="left"/>
             </w:pPr>
             <w:r/>
@@ -3686,7 +5226,7 @@
           </w:tcPr>
           <w:p>
             <w:pPr>
-              <w:spacing w:after="40"/>
+              <w:spacing w:after="40" w:line="240" w:lineRule="auto"/>
               <w:jc w:val="left"/>
             </w:pPr>
             <w:r/>
@@ -3705,7 +5245,7 @@
           </w:tcPr>
           <w:p>
             <w:pPr>
-              <w:spacing w:after="40"/>
+              <w:spacing w:after="40" w:line="240" w:lineRule="auto"/>
               <w:jc w:val="left"/>
             </w:pPr>
             <w:r/>
@@ -3726,7 +5266,7 @@
           </w:tcPr>
           <w:p>
             <w:pPr>
-              <w:spacing w:after="40"/>
+              <w:spacing w:after="40" w:line="240" w:lineRule="auto"/>
               <w:jc w:val="left"/>
             </w:pPr>
             <w:r/>
@@ -3745,7 +5285,7 @@
           </w:tcPr>
           <w:p>
             <w:pPr>
-              <w:spacing w:after="40"/>
+              <w:spacing w:after="40" w:line="240" w:lineRule="auto"/>
               <w:jc w:val="left"/>
             </w:pPr>
             <w:r/>
@@ -3764,7 +5304,7 @@
           </w:tcPr>
           <w:p>
             <w:pPr>
-              <w:spacing w:after="40"/>
+              <w:spacing w:after="40" w:line="240" w:lineRule="auto"/>
               <w:jc w:val="left"/>
             </w:pPr>
             <w:r/>
@@ -3780,8 +5320,12 @@
       </w:tr>
     </w:tbl>
     <w:p>
+      <w:pPr>
+        <w:jc w:val="both"/>
+      </w:pPr>
       <w:r>
         <w:rPr>
+          <w:rFonts w:ascii="Arial" w:hAnsi="Arial"/>
           <w:b w:val="0"/>
           <w:i w:val="0"/>
           <w:sz w:val="22"/>
@@ -3904,7 +5448,7 @@
           </w:tcPr>
           <w:p>
             <w:pPr>
-              <w:spacing w:after="40"/>
+              <w:spacing w:after="40" w:line="240" w:lineRule="auto"/>
               <w:jc w:val="left"/>
             </w:pPr>
             <w:r/>
@@ -3923,7 +5467,7 @@
           </w:tcPr>
           <w:p>
             <w:pPr>
-              <w:spacing w:after="40"/>
+              <w:spacing w:after="40" w:line="240" w:lineRule="auto"/>
               <w:jc w:val="left"/>
             </w:pPr>
             <w:r/>
@@ -3942,7 +5486,7 @@
           </w:tcPr>
           <w:p>
             <w:pPr>
-              <w:spacing w:after="40"/>
+              <w:spacing w:after="40" w:line="240" w:lineRule="auto"/>
               <w:jc w:val="left"/>
             </w:pPr>
             <w:r/>
@@ -3963,7 +5507,7 @@
           </w:tcPr>
           <w:p>
             <w:pPr>
-              <w:spacing w:after="40"/>
+              <w:spacing w:after="40" w:line="240" w:lineRule="auto"/>
               <w:jc w:val="left"/>
             </w:pPr>
             <w:r/>
@@ -3982,7 +5526,7 @@
           </w:tcPr>
           <w:p>
             <w:pPr>
-              <w:spacing w:after="40"/>
+              <w:spacing w:after="40" w:line="240" w:lineRule="auto"/>
               <w:jc w:val="left"/>
             </w:pPr>
             <w:r/>
@@ -4001,7 +5545,7 @@
           </w:tcPr>
           <w:p>
             <w:pPr>
-              <w:spacing w:after="40"/>
+              <w:spacing w:after="40" w:line="240" w:lineRule="auto"/>
               <w:jc w:val="left"/>
             </w:pPr>
             <w:r/>
@@ -4022,7 +5566,7 @@
           </w:tcPr>
           <w:p>
             <w:pPr>
-              <w:spacing w:after="40"/>
+              <w:spacing w:after="40" w:line="240" w:lineRule="auto"/>
               <w:jc w:val="left"/>
             </w:pPr>
             <w:r/>
@@ -4041,7 +5585,7 @@
           </w:tcPr>
           <w:p>
             <w:pPr>
-              <w:spacing w:after="40"/>
+              <w:spacing w:after="40" w:line="240" w:lineRule="auto"/>
               <w:jc w:val="left"/>
             </w:pPr>
             <w:r/>
@@ -4060,7 +5604,7 @@
           </w:tcPr>
           <w:p>
             <w:pPr>
-              <w:spacing w:after="40"/>
+              <w:spacing w:after="40" w:line="240" w:lineRule="auto"/>
               <w:jc w:val="left"/>
             </w:pPr>
             <w:r/>
@@ -4136,7 +5680,7 @@
       </w:r>
     </w:p>
     <w:sectPr>
-      <w:footerReference w:type="default" r:id="rId10"/>
+      <w:footerReference w:type="default" r:id="rId11"/>
       <w:pgSz w:w="12240" w:h="15840"/>
       <w:pgMar w:top="1417" w:right="1417" w:bottom="1417" w:left="2268" w:header="720" w:footer="720" w:gutter="0"/>
       <w:cols w:space="720"/>
@@ -4152,14 +5696,19 @@
   <w:p>
     <w:pPr>
       <w:pStyle w:val="Footer"/>
+    </w:pPr>
+    <w:r/>
+  </w:p>
+</w:ftr>
+</file>
+
+<file path=word/footer2.xml><?xml version="1.0" encoding="utf-8"?>
+<w:ftr xmlns:m="http://schemas.openxmlformats.org/officeDocument/2006/math" xmlns:mc="http://schemas.openxmlformats.org/markup-compatibility/2006" xmlns:mo="http://schemas.microsoft.com/office/mac/office/2008/main" xmlns:mv="urn:schemas-microsoft-com:mac:vml" xmlns:o="urn:schemas-microsoft-com:office:office" xmlns:r="http://schemas.openxmlformats.org/officeDocument/2006/relationships" xmlns:v="urn:schemas-microsoft-com:vml" xmlns:w10="urn:schemas-microsoft-com:office:word" xmlns:w14="http://schemas.microsoft.com/office/word/2010/wordml" xmlns:w="http://schemas.openxmlformats.org/wordprocessingml/2006/main" xmlns:wne="http://schemas.microsoft.com/office/word/2006/wordml" xmlns:wp14="http://schemas.microsoft.com/office/word/2010/wordprocessingDrawing" xmlns:wp="http://schemas.openxmlformats.org/drawingml/2006/wordprocessingDrawing" xmlns:wpc="http://schemas.microsoft.com/office/word/2010/wordprocessingCanvas" xmlns:wpg="http://schemas.microsoft.com/office/word/2010/wordprocessingGroup" xmlns:wpi="http://schemas.microsoft.com/office/word/2010/wordprocessingInk" xmlns:wps="http://schemas.microsoft.com/office/word/2010/wordprocessingShape" mc:Ignorable="w14 wp14">
+  <w:p>
+    <w:pPr>
+      <w:pStyle w:val="Footer"/>
       <w:jc w:val="center"/>
     </w:pPr>
-    <w:r>
-      <w:rPr>
-        <w:rFonts w:ascii="Arial" w:hAnsi="Arial"/>
-        <w:sz w:val="22"/>
-      </w:rPr>
-    </w:r>
     <w:r>
       <w:rPr>
         <w:rFonts w:ascii="Arial" w:hAnsi="Arial"/>
@@ -4199,7 +5748,7 @@
 </w:ftr>
 </file>
 
-<file path=word/footer2.xml><?xml version="1.0" encoding="utf-8"?>
+<file path=word/footer3.xml><?xml version="1.0" encoding="utf-8"?>
 <w:ftr xmlns:m="http://schemas.openxmlformats.org/officeDocument/2006/math" xmlns:mc="http://schemas.openxmlformats.org/markup-compatibility/2006" xmlns:mo="http://schemas.microsoft.com/office/mac/office/2008/main" xmlns:mv="urn:schemas-microsoft-com:mac:vml" xmlns:o="urn:schemas-microsoft-com:office:office" xmlns:r="http://schemas.openxmlformats.org/officeDocument/2006/relationships" xmlns:v="urn:schemas-microsoft-com:vml" xmlns:w10="urn:schemas-microsoft-com:office:word" xmlns:w14="http://schemas.microsoft.com/office/word/2010/wordml" xmlns:w="http://schemas.openxmlformats.org/wordprocessingml/2006/main" xmlns:wne="http://schemas.microsoft.com/office/word/2006/wordml" xmlns:wp14="http://schemas.microsoft.com/office/word/2010/wordprocessingDrawing" xmlns:wp="http://schemas.openxmlformats.org/drawingml/2006/wordprocessingDrawing" xmlns:wpc="http://schemas.microsoft.com/office/word/2010/wordprocessingCanvas" xmlns:wpg="http://schemas.microsoft.com/office/word/2010/wordprocessingGroup" xmlns:wpi="http://schemas.microsoft.com/office/word/2010/wordprocessingInk" xmlns:wps="http://schemas.microsoft.com/office/word/2010/wordprocessingShape" mc:Ignorable="w14 wp14">
   <w:p>
     <w:pPr>
@@ -4672,7 +6221,7 @@
     <w:pPr>
       <w:keepNext/>
       <w:keepLines/>
-      <w:spacing w:before="360" w:after="240" w:line="360" w:lineRule="auto"/>
+      <w:spacing w:before="320" w:after="200" w:line="360" w:lineRule="auto"/>
       <w:jc w:val="center"/>
       <w:outlineLvl w:val="0"/>
     </w:pPr>
@@ -4680,7 +6229,7 @@
       <w:rFonts w:asciiTheme="majorHAnsi" w:eastAsiaTheme="majorEastAsia" w:hAnsiTheme="majorHAnsi" w:cstheme="majorBidi" w:ascii="Arial" w:hAnsi="Arial" w:eastAsia="Arial"/>
       <w:b/>
       <w:bCs/>
-      <w:color w:val="000000"/>
+      <w:color w:val="1F3B5C"/>
       <w:sz w:val="24"/>
       <w:szCs w:val="28"/>
     </w:rPr>
@@ -4705,7 +6254,7 @@
       <w:rFonts w:asciiTheme="majorHAnsi" w:eastAsiaTheme="majorEastAsia" w:hAnsiTheme="majorHAnsi" w:cstheme="majorBidi" w:ascii="Arial" w:hAnsi="Arial" w:eastAsia="Arial"/>
       <w:b/>
       <w:bCs/>
-      <w:color w:val="000000"/>
+      <w:color w:val="1F3B5C"/>
       <w:sz w:val="24"/>
       <w:szCs w:val="26"/>
     </w:rPr>
@@ -4730,7 +6279,7 @@
       <w:rFonts w:asciiTheme="majorHAnsi" w:eastAsiaTheme="majorEastAsia" w:hAnsiTheme="majorHAnsi" w:cstheme="majorBidi" w:ascii="Arial" w:hAnsi="Arial" w:eastAsia="Arial"/>
       <w:b/>
       <w:bCs/>
-      <w:color w:val="000000"/>
+      <w:color w:val="1F3B5C"/>
       <w:sz w:val="24"/>
     </w:rPr>
   </w:style>

</xml_diff>

<commit_message>
Agrega el logo institucional USS en la portada del informe
</commit_message>
<xml_diff>
--- a/Informe de Internado - Farmacia Asistencial y APS - CESFAM Villa Nonguen.docx
+++ b/Informe de Internado - Farmacia Asistencial y APS - CESFAM Villa Nonguen.docx
@@ -4,34 +4,42 @@
   <w:body>
     <w:p>
       <w:pPr>
-        <w:spacing w:line="360" w:lineRule="auto" w:after="320" w:before="120"/>
+        <w:spacing w:before="120" w:after="360"/>
         <w:jc w:val="center"/>
       </w:pPr>
       <w:r>
-        <w:rPr>
-          <w:rFonts w:ascii="Arial" w:hAnsi="Arial"/>
-          <w:b w:val="0"/>
-          <w:i/>
-          <w:color w:val="000000"/>
-          <w:sz w:val="22"/>
-        </w:rPr>
-        <w:t>[Insertar logo institucional actualizado de la USS]</w:t>
-      </w:r>
-    </w:p>
-    <w:p>
-      <w:pPr>
-        <w:spacing w:line="360" w:lineRule="auto" w:after="120" w:before="0"/>
-        <w:jc w:val="center"/>
-      </w:pPr>
-      <w:r>
-        <w:rPr>
-          <w:rFonts w:ascii="Arial" w:hAnsi="Arial"/>
-          <w:b/>
-          <w:i w:val="0"/>
-          <w:color w:val="000000"/>
-          <w:sz w:val="28"/>
-        </w:rPr>
-        <w:t>UNIVERSIDAD SAN SEBASTIÁN</w:t>
+        <w:drawing>
+          <wp:inline xmlns:a="http://schemas.openxmlformats.org/drawingml/2006/main" xmlns:pic="http://schemas.openxmlformats.org/drawingml/2006/picture">
+            <wp:extent cx="2700000" cy="918557"/>
+            <wp:docPr id="1" name="Picture 1"/>
+            <wp:cNvGraphicFramePr>
+              <a:graphicFrameLocks noChangeAspect="1"/>
+            </wp:cNvGraphicFramePr>
+            <a:graphic>
+              <a:graphicData uri="http://schemas.openxmlformats.org/drawingml/2006/picture">
+                <pic:pic>
+                  <pic:nvPicPr>
+                    <pic:cNvPr id="0" name="logo_uss.jpeg"/>
+                    <pic:cNvPicPr/>
+                  </pic:nvPicPr>
+                  <pic:blipFill>
+                    <a:blip r:embed="rId9"/>
+                    <a:stretch>
+                      <a:fillRect/>
+                    </a:stretch>
+                  </pic:blipFill>
+                  <pic:spPr>
+                    <a:xfrm>
+                      <a:off x="0" y="0"/>
+                      <a:ext cx="2700000" cy="918557"/>
+                    </a:xfrm>
+                    <a:prstGeom prst="rect"/>
+                  </pic:spPr>
+                </pic:pic>
+              </a:graphicData>
+            </a:graphic>
+          </wp:inline>
+        </w:drawing>
       </w:r>
     </w:p>
     <w:p>
@@ -213,7 +221,7 @@
     <w:p>
       <w:pPr>
         <w:sectPr>
-          <w:footerReference w:type="default" r:id="rId9"/>
+          <w:footerReference w:type="default" r:id="rId10"/>
           <w:pgSz w:w="12240" w:h="15840"/>
           <w:pgMar w:top="1417" w:right="1417" w:bottom="1417" w:left="2268" w:header="720" w:footer="720" w:gutter="0"/>
           <w:cols w:space="720"/>
@@ -677,7 +685,7 @@
     <w:p>
       <w:pPr>
         <w:sectPr>
-          <w:footerReference w:type="default" r:id="rId10"/>
+          <w:footerReference w:type="default" r:id="rId11"/>
           <w:pgSz w:w="12240" w:h="15840"/>
           <w:pgMar w:top="1417" w:right="1417" w:bottom="1417" w:left="2268" w:header="720" w:footer="720" w:gutter="0"/>
           <w:cols w:space="720"/>
@@ -1818,7 +1826,7 @@
         <w:drawing>
           <wp:inline xmlns:a="http://schemas.openxmlformats.org/drawingml/2006/main" xmlns:pic="http://schemas.openxmlformats.org/drawingml/2006/picture">
             <wp:extent cx="5400000" cy="3552632"/>
-            <wp:docPr id="1" name="Picture 1"/>
+            <wp:docPr id="2" name="Picture 2"/>
             <wp:cNvGraphicFramePr>
               <a:graphicFrameLocks noChangeAspect="1"/>
             </wp:cNvGraphicFramePr>
@@ -1830,7 +1838,7 @@
                     <pic:cNvPicPr/>
                   </pic:nvPicPr>
                   <pic:blipFill>
-                    <a:blip r:embed="rId12"/>
+                    <a:blip r:embed="rId13"/>
                     <a:stretch>
                       <a:fillRect/>
                     </a:stretch>
@@ -2410,7 +2418,7 @@
         <w:drawing>
           <wp:inline xmlns:a="http://schemas.openxmlformats.org/drawingml/2006/main" xmlns:pic="http://schemas.openxmlformats.org/drawingml/2006/picture">
             <wp:extent cx="5580000" cy="2984651"/>
-            <wp:docPr id="2" name="Picture 2"/>
+            <wp:docPr id="3" name="Picture 3"/>
             <wp:cNvGraphicFramePr>
               <a:graphicFrameLocks noChangeAspect="1"/>
             </wp:cNvGraphicFramePr>
@@ -2422,7 +2430,7 @@
                     <pic:cNvPicPr/>
                   </pic:nvPicPr>
                   <pic:blipFill>
-                    <a:blip r:embed="rId13"/>
+                    <a:blip r:embed="rId14"/>
                     <a:stretch>
                       <a:fillRect/>
                     </a:stretch>
@@ -2498,7 +2506,7 @@
         <w:drawing>
           <wp:inline xmlns:a="http://schemas.openxmlformats.org/drawingml/2006/main" xmlns:pic="http://schemas.openxmlformats.org/drawingml/2006/picture">
             <wp:extent cx="5400000" cy="7039594"/>
-            <wp:docPr id="3" name="Picture 3"/>
+            <wp:docPr id="4" name="Picture 4"/>
             <wp:cNvGraphicFramePr>
               <a:graphicFrameLocks noChangeAspect="1"/>
             </wp:cNvGraphicFramePr>
@@ -2510,7 +2518,7 @@
                     <pic:cNvPicPr/>
                   </pic:nvPicPr>
                   <pic:blipFill>
-                    <a:blip r:embed="rId14"/>
+                    <a:blip r:embed="rId15"/>
                     <a:stretch>
                       <a:fillRect/>
                     </a:stretch>
@@ -5680,7 +5688,7 @@
       </w:r>
     </w:p>
     <w:sectPr>
-      <w:footerReference w:type="default" r:id="rId11"/>
+      <w:footerReference w:type="default" r:id="rId12"/>
       <w:pgSz w:w="12240" w:h="15840"/>
       <w:pgMar w:top="1417" w:right="1417" w:bottom="1417" w:left="2268" w:header="720" w:footer="720" w:gutter="0"/>
       <w:cols w:space="720"/>

</xml_diff>

<commit_message>
Alinea el informe al formato de la memoria: capitalizacion de terminos clave, seccion Resumen y verbo del objetivo del seminario
</commit_message>
<xml_diff>
--- a/Informe de Internado - Farmacia Asistencial y APS - CESFAM Villa Nonguen.docx
+++ b/Informe de Internado - Farmacia Asistencial y APS - CESFAM Villa Nonguen.docx
@@ -399,7 +399,7 @@
           <w:rFonts w:ascii="Arial" w:hAnsi="Arial"/>
           <w:sz w:val="24"/>
         </w:rPr>
-        <w:t>Capacidad, Motivación y Oportunidad (modelo de atención farmacéutica)</w:t>
+        <w:t>Capacidad, Motivación y Oportunidad (modelo de Atención Farmacéutica)</w:t>
       </w:r>
     </w:p>
     <w:p>
@@ -683,6 +683,54 @@
       </w:r>
     </w:p>
     <w:p>
+      <w:r>
+        <w:br w:type="page"/>
+      </w:r>
+    </w:p>
+    <w:p>
+      <w:pPr>
+        <w:pStyle w:val="Heading1"/>
+      </w:pPr>
+      <w:r>
+        <w:t>RESUMEN</w:t>
+      </w:r>
+    </w:p>
+    <w:p>
+      <w:pPr>
+        <w:jc w:val="both"/>
+      </w:pPr>
+      <w:r>
+        <w:rPr>
+          <w:rFonts w:ascii="Arial" w:hAnsi="Arial"/>
+          <w:b w:val="0"/>
+          <w:i w:val="0"/>
+          <w:sz w:val="24"/>
+        </w:rPr>
+        <w:t>El presente informe da cuenta del Internado en Farmacia Asistencial y Atención Primaria de Salud realizado en la unidad de farmacia del CESFAM Villa Nonguén, entre el 11 de mayo y el 10 de julio de 2026. Durante nueve semanas el interno se integró al equipo de farmacia y participó en los procesos de recepción, almacenamiento, gestión de stock, fraccionamiento, reenvasado y dispensación de medicamentos, además de actividades de Atención Farmacéutica, visitas domiciliarias y educación sanitaria orientadas al uso racional de los medicamentos. En paralelo se desarrolló el seminario de título, consistente en el diseño de un protocolo de Atención Farmacéutica domiciliaria basado en el Modelo CMO para los pacientes del Programa de Salud Cardiovascular del centro. El informe describe el establecimiento y su unidad de farmacia, detalla las actividades realizadas mediante una carta Gantt y su descripción, presenta el desarrollo del seminario de título y discute el cumplimiento de los objetivos a la luz de la evidencia, junto con las fortalezas, debilidades y propuestas de mejora identificadas durante la experiencia.</w:t>
+      </w:r>
+    </w:p>
+    <w:p>
+      <w:pPr>
+        <w:spacing w:line="360" w:lineRule="auto"/>
+        <w:jc w:val="both"/>
+      </w:pPr>
+      <w:r>
+        <w:rPr>
+          <w:rFonts w:ascii="Arial" w:hAnsi="Arial"/>
+          <w:b/>
+          <w:sz w:val="24"/>
+        </w:rPr>
+        <w:t xml:space="preserve">Palabras clave: </w:t>
+      </w:r>
+      <w:r>
+        <w:rPr>
+          <w:rFonts w:ascii="Arial" w:hAnsi="Arial"/>
+          <w:sz w:val="24"/>
+        </w:rPr>
+        <w:t>Atención Farmacéutica; Atención Primaria de Salud; Modelo CMO; adherencia; uso racional de medicamentos.</w:t>
+      </w:r>
+    </w:p>
+    <w:p>
       <w:pPr>
         <w:sectPr>
           <w:footerReference w:type="default" r:id="rId11"/>
@@ -713,7 +761,7 @@
           <w:i w:val="0"/>
           <w:sz w:val="24"/>
         </w:rPr>
-        <w:t>El presente informe reúne la experiencia desarrollada durante el Internado en Farmacia Asistencial y Atención Primaria de Salud, realizado en la unidad de farmacia del Centro de Salud Familiar (CESFAM) Villa Nonguén, en la comuna de Concepción, Región del Biobío, entre el 11 de mayo y el 10 de julio de 2026. El internado corresponde a una actividad obligatoria del plan de estudios de la carrera de Química y Farmacia, cuyo propósito es que el estudiante adquiera experiencia directa del quehacer profesional del químico farmacéutico en un establecimiento de ejercicio real, bajo la supervisión de un profesional del área. La atención primaria constituye la puerta de entrada al sistema público de salud y, dentro de ella, la farmacia cumple un rol central en el acceso a los medicamentos y en el uso seguro y racional de la farmacoterapia por parte de la población (Ministerio de Salud de Chile, 2018b).</w:t>
+        <w:t>El presente informe reúne la experiencia desarrollada durante el Internado en Farmacia Asistencial y Atención Primaria de Salud, realizado en la unidad de farmacia del Centro de Salud Familiar (CESFAM) Villa Nonguén, en la comuna de Concepción, Región del Biobío, entre el 11 de mayo y el 10 de julio de 2026. El internado corresponde a una actividad obligatoria del plan de estudios de la carrera de Química y Farmacia, cuyo propósito es que el estudiante adquiera experiencia directa del quehacer profesional del Químico Farmacéutico en un establecimiento de ejercicio real, bajo la supervisión de un profesional del área. La Atención Primaria constituye la puerta de entrada al sistema público de salud y, dentro de ella, la farmacia cumple un rol central en el acceso a los medicamentos y en el uso seguro y racional de la farmacoterapia por parte de la población (Ministerio de Salud de Chile, 2018b).</w:t>
       </w:r>
     </w:p>
     <w:p>
@@ -1405,7 +1453,7 @@
                 <w:rFonts w:ascii="Arial" w:hAnsi="Arial"/>
                 <w:sz w:val="20"/>
               </w:rPr>
-              <w:t>Químico farmacéutico</w:t>
+              <w:t>Químico Farmacéutico</w:t>
             </w:r>
           </w:p>
         </w:tc>
@@ -1814,7 +1862,7 @@
           <w:i w:val="0"/>
           <w:sz w:val="24"/>
         </w:rPr>
-        <w:t>La unidad de farmacia se organiza bajo la responsabilidad de un químico farmacéutico que ejerce la dirección técnica y responde por el funcionamiento general de la unidad, el cumplimiento normativo y la gestión del arsenal farmacoterapéutico. Un segundo químico farmacéutico se dedica de manera preferente a la atención farmacéutica, tanto en box como en las visitas domiciliarias del Programa de Salud Cardiovascular, y un equipo permanente de cuatro técnicos en enfermería de nivel superior (TENS) apoya las tareas de recepción, almacenamiento, fraccionamiento, reenvasado y dispensación. El interno de Química y Farmacia se integró a este equipo durante toda la rotación. La Figura 1 presenta el organigrama de la unidad, con los químicos farmacéuticos y los técnicos que componen el equipo.</w:t>
+        <w:t>La unidad de farmacia se organiza bajo la responsabilidad de un Químico Farmacéutico que ejerce la dirección técnica y responde por el funcionamiento general de la unidad, el cumplimiento normativo y la gestión del arsenal farmacoterapéutico. Un segundo Químico Farmacéutico se dedica de manera preferente a la Atención Farmacéutica, tanto en box como en las visitas domiciliarias del Programa de Salud Cardiovascular, y un equipo permanente de cuatro técnicos en enfermería de nivel superior (TENS) apoya las tareas de recepción, almacenamiento, fraccionamiento, reenvasado y dispensación. El interno de Química y Farmacia se integró a este equipo durante toda la rotación. La Figura 1 presenta el organigrama de la unidad, con los Químicos Farmacéuticos y los técnicos que componen el equipo.</w:t>
       </w:r>
     </w:p>
     <w:p>
@@ -1916,7 +1964,7 @@
           <w:i w:val="0"/>
           <w:sz w:val="24"/>
         </w:rPr>
-        <w:t>La unidad de farmacia participa de manera transversal en estos programas a través de la entrega de medicamentos, el fraccionamiento y reenvasado según las indicaciones, el control del arsenal y de los medicamentos sujetos a control legal, y la atención farmacéutica orientada al uso seguro y racional de la terapia. Dentro del Programa de Salud Cardiovascular, el químico farmacéutico acompaña a los usuarios en box y en su domicilio, con seguimiento farmacoterapéutico, educación y revisión de la medicación, y participa en la gestión del Fondo de Farmacia (FOFAR), que financia su presencia en la atención primaria y el acceso a los medicamentos para la hipertensión, la diabetes y la dislipidemia (Ministerio de Salud de Chile, 2020).</w:t>
+        <w:t>La unidad de farmacia participa de manera transversal en estos programas a través de la entrega de medicamentos, el fraccionamiento y reenvasado según las indicaciones, el control del arsenal y de los medicamentos sujetos a control legal, y la Atención Farmacéutica orientada al uso seguro y racional de la terapia. Dentro del Programa de Salud Cardiovascular, el Químico Farmacéutico acompaña a los usuarios en box y en su domicilio, con seguimiento farmacoterapéutico, educación y revisión de la medicación, y participa en la gestión del Fondo de Farmacia (FOFAR), que financia su presencia en la Atención Primaria y el acceso a los medicamentos para la hipertensión, la diabetes y la dislipidemia (Ministerio de Salud de Chile, 2020).</w:t>
       </w:r>
     </w:p>
     <w:p>
@@ -1938,7 +1986,7 @@
           <w:i w:val="0"/>
           <w:sz w:val="24"/>
         </w:rPr>
-        <w:t>La atención farmacéutica se entiende hoy como la participación del farmacéutico en el cuidado de la persona para aprovechar mejor sus medicamentos y mejorar sus resultados en salud. Bonal y colaboradores la describen como el proceso por el cual el farmacéutico coopera con el paciente y con el resto del equipo en el diseño, la ejecución y el seguimiento de un plan terapéutico orientado a metas concretas (Bonal et al., 2003). Este enfoque supone un cambio respecto del modelo clásico, centrado en entregar el medicamento, hacia otro que se preocupa de lo que ocurre con ese medicamento una vez que el paciente lo lleva a su casa.</w:t>
+        <w:t>La Atención Farmacéutica se entiende hoy como la participación del farmacéutico en el cuidado de la persona para aprovechar mejor sus medicamentos y mejorar sus resultados en salud. Bonal y colaboradores la describen como el proceso por el cual el farmacéutico coopera con el paciente y con el resto del equipo en el diseño, la ejecución y el seguimiento de un plan terapéutico orientado a metas concretas (Bonal et al., 2003). Este enfoque supone un cambio respecto del modelo clásico, centrado en entregar el medicamento, hacia otro que se preocupa de lo que ocurre con ese medicamento una vez que el paciente lo lleva a su casa.</w:t>
       </w:r>
     </w:p>
     <w:p>
@@ -1952,7 +2000,7 @@
           <w:i w:val="0"/>
           <w:sz w:val="24"/>
         </w:rPr>
-        <w:t>En la atención primaria chilena, la incorporación del químico farmacéutico a los equipos ha permitido acercar esta labor a la comunidad, con especial relevancia en las enfermedades crónicas. La Encuesta Nacional de Salud estimó que cerca del 27,6% de la población tiene sospecha de hipertensión, un 12,3% diabetes tipo 2 y alrededor del 60% algún grado de dislipidemia (Ministerio de Salud de Chile, 2017a), condiciones que se atienden principalmente a través del Programa de Salud Cardiovascular. Ahora bien, que un tratamiento esté indicado no asegura que el paciente lo tome como corresponde. La adherencia, entendida como el grado en que la persona sigue las indicaciones acordadas con el equipo de salud, es uno de los factores que más influye en el control de estas enfermedades y suele ser baja en quienes usan varios medicamentos a la vez (Haynes et al., 1979; Martín Alfonso, 2004). Para medirla de forma sencilla se utilizan instrumentos como el test de Morisky-Green-Levine (Morisky et al., 1986), y para clasificar los problemas detectados se recurre al Tercer Consenso de Granada, que ordena los resultados negativos asociados a la medicación según si el tratamiento es necesario, efectivo y seguro (Comité de Consenso de Granada, 2007).</w:t>
+        <w:t>En la Atención Primaria chilena, la incorporación del Químico Farmacéutico a los equipos ha permitido acercar esta labor a la comunidad, con especial relevancia en las enfermedades crónicas. La Encuesta Nacional de Salud estimó que cerca del 27,6% de la población tiene sospecha de hipertensión, un 12,3% diabetes tipo 2 y alrededor del 60% algún grado de dislipidemia (Ministerio de Salud de Chile, 2017a), condiciones que se atienden principalmente a través del Programa de Salud Cardiovascular. Ahora bien, que un tratamiento esté indicado no asegura que el paciente lo tome como corresponde. La adherencia, entendida como el grado en que la persona sigue las indicaciones acordadas con el equipo de salud, es uno de los factores que más influye en el control de estas enfermedades y suele ser baja en quienes usan varios medicamentos a la vez (Haynes et al., 1979; Martín Alfonso, 2004). Para medirla de forma sencilla se utilizan instrumentos como el test de Morisky-Green-Levine (Morisky et al., 1986), y para clasificar los problemas detectados se recurre al Tercer Consenso de Granada, que ordena los resultados negativos asociados a la medicación según si el tratamiento es necesario, efectivo y seguro (Comité de Consenso de Granada, 2007).</w:t>
       </w:r>
     </w:p>
     <w:p>
@@ -1966,7 +2014,7 @@
           <w:i w:val="0"/>
           <w:sz w:val="24"/>
         </w:rPr>
-        <w:t>El marco que hoy se usa como referencia para modernizar la atención farmacéutica es el Modelo CMO, sigla de Capacidad, Motivación y Oportunidad, desarrollado en España y validado por su sociedad de farmacia hospitalaria (Calleja Hernández &amp; Morillo Verdugo, 2016). Su valor está en que ordena la atención en torno a tres ideas que pueden llevarse al domicilio del paciente. La Capacidad tiene que ver con priorizar, es decir, concentrar el tiempo en los pacientes que más lo necesitan según criterios de riesgo y complejidad (Manzano García &amp; Morillo Verdugo, 2018). La Motivación pone el foco en la relación con el paciente y en su adherencia, trabajando mediante la entrevista motivacional las creencias y dificultades que llevan a no tomar bien el tratamiento. La Oportunidad, por último, busca llegar al paciente más allá del box, en su casa o por teléfono, para resolver a tiempo lo que vaya surgiendo. Estos tres pilares son los que dan forma al protocolo desarrollado como seminario de título durante el internado, descrito en la sección 2.4.</w:t>
+        <w:t>El marco que hoy se usa como referencia para modernizar la Atención Farmacéutica es el Modelo CMO, sigla de Capacidad, Motivación y Oportunidad, desarrollado en España y validado por su sociedad de farmacia hospitalaria (Calleja Hernández &amp; Morillo Verdugo, 2016). Su valor está en que ordena la atención en torno a tres ideas que pueden llevarse al domicilio del paciente. La Capacidad tiene que ver con priorizar, es decir, concentrar el tiempo en los pacientes que más lo necesitan según criterios de riesgo y complejidad (Manzano García &amp; Morillo Verdugo, 2018). La Motivación pone el foco en la relación con el paciente y en su adherencia, trabajando mediante la entrevista motivacional las creencias y dificultades que llevan a no tomar bien el tratamiento. La Oportunidad, por último, busca llegar al paciente más allá del box, en su casa o por teléfono, para resolver a tiempo lo que vaya surgiendo. Estos tres pilares son los que dan forma al protocolo desarrollado como seminario de título durante el internado, descrito en la sección 2.4.</w:t>
       </w:r>
     </w:p>
     <w:p>
@@ -2144,7 +2192,7 @@
           <w:i w:val="0"/>
           <w:sz w:val="24"/>
         </w:rPr>
-        <w:t>Desarrollar las competencias profesionales del químico farmacéutico en el ámbito de la farmacia asistencial y la atención primaria de salud durante el internado en el CESFAM Villa Nonguén.</w:t>
+        <w:t>Desarrollar las competencias profesionales del Químico Farmacéutico en el ámbito de la farmacia asistencial y la Atención Primaria de Salud durante el internado en el CESFAM Villa Nonguén.</w:t>
       </w:r>
     </w:p>
     <w:p>
@@ -2191,7 +2239,7 @@
           <w:rFonts w:ascii="Arial" w:hAnsi="Arial"/>
           <w:sz w:val="24"/>
         </w:rPr>
-        <w:t>Ejecutar actividades de atención farmacéutica, visitas domiciliarias y educación sanitaria orientadas al uso racional de los medicamentos.</w:t>
+        <w:t>Ejecutar actividades de Atención Farmacéutica, visitas domiciliarias y educación sanitaria orientadas al uso racional de los medicamentos.</w:t>
       </w:r>
     </w:p>
     <w:p>
@@ -2204,7 +2252,7 @@
           <w:rFonts w:ascii="Arial" w:hAnsi="Arial"/>
           <w:sz w:val="24"/>
         </w:rPr>
-        <w:t>Diseñar un protocolo de atención farmacéutica domiciliaria basado en el Modelo CMO para el Programa de Salud Cardiovascular del CESFAM Villa Nonguén.</w:t>
+        <w:t>Diseñar un protocolo de Atención Farmacéutica domiciliaria basado en el Modelo CMO para el Programa de Salud Cardiovascular del CESFAM Villa Nonguén.</w:t>
       </w:r>
     </w:p>
     <w:p>
@@ -2319,7 +2367,7 @@
           <w:rFonts w:ascii="Arial" w:hAnsi="Arial"/>
           <w:sz w:val="24"/>
         </w:rPr>
-        <w:t>Atención farmacéutica y visitas domiciliarias.</w:t>
+        <w:t>Atención Farmacéutica y visitas domiciliarias.</w:t>
       </w:r>
     </w:p>
     <w:p>
@@ -2384,7 +2432,7 @@
           <w:rFonts w:ascii="Arial" w:hAnsi="Arial"/>
           <w:sz w:val="24"/>
         </w:rPr>
-        <w:t>Seminario de título: diseño de un protocolo de atención farmacéutica domiciliaria.</w:t>
+        <w:t>Seminario de título: diseño de un protocolo de Atención Farmacéutica domiciliaria.</w:t>
       </w:r>
     </w:p>
     <w:p>
@@ -2494,7 +2542,7 @@
           <w:i w:val="0"/>
           <w:sz w:val="24"/>
         </w:rPr>
-        <w:t>La Figura 3 muestra las actividades efectivamente desarrolladas, con detalle por día y por semana. En términos generales, la ejecución siguió lo planificado, con algunos ajustes propios de la dinámica del establecimiento. El fraccionamiento, la dispensación y la atención farmacéutica se extendieron durante casi todo el periodo, ya que constituyen tareas habituales de la unidad, y se sumaron actividades no previstas al inicio, como el apoyo durante las supervisiones del Servicio de Salud y una situación de vinculación con el medio surgida en terreno. La Tabla 3 complementa la figura con el detalle diario de lo realizado.</w:t>
+        <w:t>La Figura 3 muestra las actividades efectivamente desarrolladas, con detalle por día y por semana. En términos generales, la ejecución siguió lo planificado, con algunos ajustes propios de la dinámica del establecimiento. El fraccionamiento, la dispensación y la Atención Farmacéutica se extendieron durante casi todo el periodo, ya que constituyen tareas habituales de la unidad, y se sumaron actividades no previstas al inicio, como el apoyo durante las supervisiones del Servicio de Salud y una situación de vinculación con el medio surgida en terreno. La Tabla 3 complementa la figura con el detalle diario de lo realizado.</w:t>
       </w:r>
     </w:p>
     <w:p>
@@ -2820,7 +2868,7 @@
                 <w:rFonts w:ascii="Arial" w:hAnsi="Arial"/>
                 <w:sz w:val="16"/>
               </w:rPr>
-              <w:t>Envasado; protocolos de emergencia; llegada de pedido; atención farmacéutica</w:t>
+              <w:t>Envasado; protocolos de emergencia; llegada de pedido; Atención Farmacéutica</w:t>
             </w:r>
           </w:p>
         </w:tc>
@@ -3193,7 +3241,7 @@
                 <w:rFonts w:ascii="Arial" w:hAnsi="Arial"/>
                 <w:sz w:val="16"/>
               </w:rPr>
-              <w:t>Indicador y atención farmacéutica</w:t>
+              <w:t>Indicador y Atención Farmacéutica</w:t>
             </w:r>
           </w:p>
         </w:tc>
@@ -3429,7 +3477,7 @@
                 <w:rFonts w:ascii="Arial" w:hAnsi="Arial"/>
                 <w:sz w:val="16"/>
               </w:rPr>
-              <w:t>Atención farmacéutica</w:t>
+              <w:t>Atención Farmacéutica</w:t>
             </w:r>
           </w:p>
         </w:tc>
@@ -3783,7 +3831,7 @@
                 <w:rFonts w:ascii="Arial" w:hAnsi="Arial"/>
                 <w:sz w:val="16"/>
               </w:rPr>
-              <w:t>Atención farmacéutica con Q.F. especialista</w:t>
+              <w:t>Atención Farmacéutica con Q.F. especialista</w:t>
             </w:r>
           </w:p>
         </w:tc>
@@ -3904,7 +3952,7 @@
         <w:pStyle w:val="Heading3"/>
       </w:pPr>
       <w:r>
-        <w:t>2.3.5 Atención farmacéutica y visitas domiciliarias</w:t>
+        <w:t>2.3.5 Atención Farmacéutica y visitas domiciliarias</w:t>
       </w:r>
     </w:p>
     <w:p>
@@ -3918,7 +3966,7 @@
           <w:i w:val="0"/>
           <w:sz w:val="24"/>
         </w:rPr>
-        <w:t>La atención farmacéutica fue una de las actividades más significativas del internado. Se acompañó al químico farmacéutico en la atención de los usuarios del Programa de Salud Cardiovascular, tanto en box como en el domicilio, y se participó en la entrega de medicamentos a domicilio para pacientes con dificultades para acudir al centro. En estas visitas se revisaba la medicación que el paciente realmente utilizaba, se conciliaba con la que tenía indicada, se resolvían dudas sobre horarios y formas de administración, y se reforzaba la adherencia. Durante una jornada vespertina se observó, además, el funcionamiento de la farmacia en el horario de la tarde y el procedimiento de cierre de la unidad. Esta actividad responde al tercer objetivo específico.</w:t>
+        <w:t>La Atención Farmacéutica fue una de las actividades más significativas del internado. Se acompañó al Químico Farmacéutico en la atención de los usuarios del Programa de Salud Cardiovascular, tanto en box como en el domicilio, y se participó en la entrega de medicamentos a domicilio para pacientes con dificultades para acudir al centro. En estas visitas se revisaba la medicación que el paciente realmente utilizaba, se conciliaba con la que tenía indicada, se resolvían dudas sobre horarios y formas de administración, y se reforzaba la adherencia. Durante una jornada vespertina se observó, además, el funcionamiento de la farmacia en el horario de la tarde y el procedimiento de cierre de la unidad. Esta actividad responde al tercer objetivo específico.</w:t>
       </w:r>
     </w:p>
     <w:p>
@@ -3940,7 +3988,7 @@
           <w:i w:val="0"/>
           <w:sz w:val="24"/>
         </w:rPr>
-        <w:t>Se participó en un taller grupal de uso racional de medicamentos dirigido a los usuarios del CESFAM. La actividad se realizó junto al químico farmacéutico y consistió en conversar con los pacientes, entregar material educativo en forma de trípticos y desarrollar una dinámica participativa con paletas de respuesta, en la que los asistentes respondían situaciones sobre el uso correcto de los medicamentos y recibían pequeños incentivos por participar. La instancia favoreció la educación sanitaria y acercó el rol del farmacéutico a la comunidad. Responde al tercer objetivo específico.</w:t>
+        <w:t>Se participó en un taller grupal de uso racional de medicamentos dirigido a los usuarios del CESFAM. La actividad se realizó junto al Químico Farmacéutico y consistió en conversar con los pacientes, entregar material educativo en forma de trípticos y desarrollar una dinámica participativa con paletas de respuesta, en la que los asistentes respondían situaciones sobre el uso correcto de los medicamentos y recibían pequeños incentivos por participar. La instancia favoreció la educación sanitaria y acercó el rol del farmacéutico a la comunidad. Responde al tercer objetivo específico.</w:t>
       </w:r>
     </w:p>
     <w:p>
@@ -3962,7 +4010,7 @@
           <w:i w:val="0"/>
           <w:sz w:val="24"/>
         </w:rPr>
-        <w:t>Se colaboró en el registro y el control de los indicadores de la unidad. Entre ellos, se trabajó en el indicador de porcentaje de despacho de medicamentos realizado según el protocolo de atención farmacéutica, desagregado por sector, y se completó la plantilla mensual de despacho correspondiente al mes de mayo. También se participó en las tareas de inventario y en el ordenamiento de la bodega, cuidando que las existencias quedaran correctamente ubicadas y que no permanecieran cajas en el piso. Durante el internado el establecimiento recibió supervisiones e inspecciones del Servicio de Salud, en cuya preparación se acompañó al equipo, lo que permitió conocer los aspectos que se evalúan en la unidad de farmacia y la relevancia de mantener los registros al día. Además, en una salida a terreno se prestó apoyo a un adulto mayor para regresar a su hogar, situación que reflejó el componente humano y comunitario del trabajo en la atención primaria.</w:t>
+        <w:t>Se colaboró en el registro y el control de los indicadores de la unidad. Entre ellos, se trabajó en el indicador de porcentaje de despacho de medicamentos realizado según el protocolo de Atención Farmacéutica, desagregado por sector, y se completó la plantilla mensual de despacho correspondiente al mes de mayo. También se participó en las tareas de inventario y en el ordenamiento de la bodega, cuidando que las existencias quedaran correctamente ubicadas y que no permanecieran cajas en el piso. Durante el internado el establecimiento recibió supervisiones e inspecciones del Servicio de Salud, en cuya preparación se acompañó al equipo, lo que permitió conocer los aspectos que se evalúan en la unidad de farmacia y la relevancia de mantener los registros al día. Además, en una salida a terreno se prestó apoyo a un adulto mayor para regresar a su hogar, situación que reflejó el componente humano y comunitario del trabajo en la Atención Primaria.</w:t>
       </w:r>
     </w:p>
     <w:p>
@@ -3984,7 +4032,7 @@
           <w:i w:val="0"/>
           <w:sz w:val="24"/>
         </w:rPr>
-        <w:t>El seminario de título se desarrolló en paralelo a las actividades de farmacia y corresponde al cuarto objetivo específico del internado. Consistió en el diseño de un protocolo de atención farmacéutica domiciliaria basado en el Modelo CMO para los pacientes del Programa de Salud Cardiovascular del CESFAM Villa Nonguén, bajo la guía del profesor Diego Ignacio Jorquera Pereira y con el apoyo del químico farmacéutico tutor del centro. A continuación se describe cómo se realizó.</w:t>
+        <w:t>El seminario de título se desarrolló en paralelo a las actividades de farmacia y corresponde al cuarto objetivo específico del internado. Consistió en el diseño de un protocolo de Atención Farmacéutica domiciliaria basado en el Modelo CMO para los pacientes del Programa de Salud Cardiovascular del CESFAM Villa Nonguén, bajo la guía del profesor Diego Ignacio Jorquera Pereira y con el apoyo del Químico Farmacéutico tutor del centro. A continuación se describe cómo se realizó.</w:t>
       </w:r>
     </w:p>
     <w:p>
@@ -4006,7 +4054,7 @@
           <w:i w:val="0"/>
           <w:sz w:val="24"/>
         </w:rPr>
-        <w:t>El objetivo general del seminario fue diseñar un protocolo de atención farmacéutica domiciliaria basado en el Modelo CMO para los pacientes del Programa de Salud Cardiovascular del CESFAM Villa Nonguén. Para alcanzarlo se plantearon tres objetivos específicos: diagnosticar las brechas del programa de visitas domiciliarias que se realizaba en el centro; definir el flujograma de la visita y los criterios para priorizar a los pacientes según los pilares del Modelo CMO; y diseñar los instrumentos y herramientas clínicas necesarias para aplicar el protocolo, referidas a la adherencia, a los PRM y RNM y al registro de la atención.</w:t>
+        <w:t>El objetivo general del seminario fue diseñar un protocolo de Atención Farmacéutica domiciliaria basado en el Modelo CMO para los pacientes del Programa de Salud Cardiovascular del CESFAM Villa Nonguén. Para alcanzarlo se plantearon tres objetivos específicos: identificar las brechas del programa de visitas domiciliarias que se realizaba en el centro; definir el flujograma de la visita y los criterios para priorizar a los pacientes según los pilares del Modelo CMO; y diseñar los instrumentos y herramientas clínicas necesarias para aplicar el protocolo, referidas a la adherencia, a los PRM y RNM y al registro de la atención.</w:t>
       </w:r>
     </w:p>
     <w:p>
@@ -4028,7 +4076,7 @@
           <w:i w:val="0"/>
           <w:sz w:val="24"/>
         </w:rPr>
-        <w:t>El seminario correspondió a un trabajo de desarrollo metodológico. No se realizó un experimento ni se recogieron datos clínicos de pacientes con fines de investigación, sino que se diseñó un protocolo a partir de la revisión de la literatura, del análisis de la normativa del Ministerio de Salud y de la adaptación de herramientas ya utilizadas en la atención primaria, ajustadas a lo observado en el propio centro. El trabajo se desarrolló durante los meses del internado, en el CESFAM Villa Nonguén y su territorio. La revisión bibliográfica se realizó en bases de datos como PubMed, SciELO y Google Scholar, junto con la normativa y las guías del Ministerio de Salud, y las referencias se ordenaron con el gestor bibliográfico Mendeley. Como apoyo para la información de medicamentos se consultaron fuentes de referencia como UpToDate, Medscape y Drugs.com.</w:t>
+        <w:t>El seminario correspondió a un trabajo de desarrollo metodológico. No se realizó un experimento ni se recogieron datos clínicos de pacientes con fines de investigación, sino que se diseñó un protocolo a partir de la revisión de la literatura, del análisis de la normativa del Ministerio de Salud y de la adaptación de herramientas ya utilizadas en la Atención Primaria, ajustadas a lo observado en el propio centro. El trabajo se desarrolló durante los meses del internado, en el CESFAM Villa Nonguén y su territorio. La revisión bibliográfica se realizó en bases de datos como PubMed, SciELO y Google Scholar, junto con la normativa y las guías del Ministerio de Salud, y las referencias se ordenaron con el gestor bibliográfico Mendeley. Como apoyo para la información de medicamentos se consultaron fuentes de referencia como UpToDate, Medscape y Drugs.com.</w:t>
       </w:r>
     </w:p>
     <w:p>
@@ -4403,7 +4451,7 @@
                 <w:rFonts w:ascii="Arial" w:hAnsi="Arial"/>
                 <w:sz w:val="18"/>
               </w:rPr>
-              <w:t>Falta un instrumento de registro propio de la atención farmacéutica.</w:t>
+              <w:t>Falta un instrumento de registro propio de la Atención Farmacéutica.</w:t>
             </w:r>
           </w:p>
         </w:tc>
@@ -4428,7 +4476,7 @@
           <w:i w:val="0"/>
           <w:sz w:val="24"/>
         </w:rPr>
-        <w:t>El protocolo tradujo los tres pilares del Modelo CMO en pasos concretos. La Capacidad se abordó mediante la priorización de los pacientes y la revisión del botiquín del hogar para conciliar la medicación (Delgado et al., 2007); la Motivación, mediante la entrevista motivacional orientada a trabajar las creencias y barreras de adherencia; y la Oportunidad, mediante la continuidad del seguimiento por vía telefónica y el refuerzo del vínculo con la farmacia. Para su aplicación se diseñaron y adaptaron instrumentos sencillos, compatibles con la rutina del CESFAM: una ficha de conciliación, una ficha de seguimiento farmacoterapéutico, el test de Morisky-Green-Levine para la adherencia, la clasificación de los PRM y RNM según el Consenso de Granada, una hoja con el esquema de horarios y un protocolo de llamada telefónica para agendar la visita (ver Anexos). Al tratarse del diseño de un protocolo y no de un estudio con pacientes, el trabajo no contempló intervenciones experimentales ni la recolección de datos clínicos sensibles con fines de investigación, y se resguardaron los principios de confidencialidad y de uso responsable de la información clínica. La propuesta quedó a disposición de los químicos farmacéuticos del establecimiento para su revisión y eventual incorporación a la práctica.</w:t>
+        <w:t>El protocolo tradujo los tres pilares del Modelo CMO en pasos concretos. La Capacidad se abordó mediante la priorización de los pacientes y la revisión del botiquín del hogar para conciliar la medicación (Delgado et al., 2007); la Motivación, mediante la entrevista motivacional orientada a trabajar las creencias y barreras de adherencia; y la Oportunidad, mediante la continuidad del seguimiento por vía telefónica y el refuerzo del vínculo con la farmacia. Para su aplicación se diseñaron y adaptaron instrumentos sencillos, compatibles con la rutina del CESFAM: una ficha de conciliación, una ficha de seguimiento farmacoterapéutico, el test de Morisky-Green-Levine para la adherencia, la clasificación de los PRM y RNM según el Consenso de Granada, una hoja con el esquema de horarios y un protocolo de llamada telefónica para agendar la visita (ver Anexos). Al tratarse del diseño de un protocolo y no de un estudio con pacientes, el trabajo no contempló intervenciones experimentales ni la recolección de datos clínicos sensibles con fines de investigación, y se resguardaron los principios de confidencialidad y de uso responsable de la información clínica. La propuesta quedó a disposición de los Químicos Farmacéuticos del establecimiento para su revisión y eventual incorporación a la práctica.</w:t>
       </w:r>
     </w:p>
     <w:p>
@@ -4458,7 +4506,7 @@
           <w:i w:val="0"/>
           <w:sz w:val="24"/>
         </w:rPr>
-        <w:t>El internado permitió conocer de manera directa el funcionamiento de una unidad de farmacia de atención primaria y participar en la mayoría de sus procesos, desde la gestión del arsenal hasta la atención farmacéutica en el domicilio. El primer objetivo específico se cumplió al reconocer la estructura, las funciones del equipo y los procesos de la unidad, tal como se describe en la sección 1 y en el organigrama. El segundo se alcanzó mediante la participación sostenida en la recepción, el almacenamiento, la gestión de stock, el fraccionamiento, el reenvasado y la dispensación, resguardando la trazabilidad a través del rotulado. El tercero se desarrolló a través de la atención farmacéutica, las visitas domiciliarias y el taller de uso racional de medicamentos. Y el cuarto se materializó en el diseño del protocolo de atención farmacéutica domiciliaria basado en el Modelo CMO, presentado como seminario de título. En conjunto, estas actividades permitieron cumplir el objetivo general del internado.</w:t>
+        <w:t>El internado permitió conocer de manera directa el funcionamiento de una unidad de farmacia de Atención Primaria y participar en la mayoría de sus procesos, desde la gestión del arsenal hasta la Atención Farmacéutica en el domicilio. El primer objetivo específico se cumplió al reconocer la estructura, las funciones del equipo y los procesos de la unidad, tal como se describe en la sección 1 y en el organigrama. El segundo se alcanzó mediante la participación sostenida en la recepción, el almacenamiento, la gestión de stock, el fraccionamiento, el reenvasado y la dispensación, resguardando la trazabilidad a través del rotulado. El tercero se desarrolló a través de la Atención Farmacéutica, las visitas domiciliarias y el taller de uso racional de medicamentos. Y el cuarto se materializó en el diseño del protocolo de Atención Farmacéutica domiciliaria basado en el Modelo CMO, presentado como seminario de título. En conjunto, estas actividades permitieron cumplir el objetivo general del internado.</w:t>
       </w:r>
     </w:p>
     <w:p>
@@ -4494,7 +4542,7 @@
           <w:i w:val="0"/>
           <w:sz w:val="24"/>
         </w:rPr>
-        <w:t>Entre las fortalezas del CESFAM Villa Nonguén destacan su condición de centro pionero en el Modelo de Salud Familiar, un equipo de farmacia consolidado que ya realiza atención farmacéutica en box y en el domicilio, y una cultura de trabajo orientada a la comunidad. La sectorización del territorio y la existencia de indicadores de despacho facilitan la organización de la atención y el uso eficiente de los recursos. Como aspecto por mejorar, se observó que la visita domiciliaria del farmacéutico se realizaba sin un procedimiento escrito y estandarizado, y que el registro se apoyaba en hojas personales además de la ficha clínica electrónica, lo que dificultaba la comparación entre profesionales y el seguimiento en el tiempo. La carga de trabajo y la disponibilidad de tiempo también limitaban la frecuencia de las visitas.</w:t>
+        <w:t>Entre las fortalezas del CESFAM Villa Nonguén destacan su condición de centro pionero en el Modelo de Salud Familiar, un equipo de farmacia consolidado que ya realiza Atención Farmacéutica en box y en el domicilio, y una cultura de trabajo orientada a la comunidad. La sectorización del territorio y la existencia de indicadores de despacho facilitan la organización de la atención y el uso eficiente de los recursos. Como aspecto por mejorar, se observó que la visita domiciliaria del farmacéutico se realizaba sin un procedimiento escrito y estandarizado, y que el registro se apoyaba en hojas personales además de la ficha clínica electrónica, lo que dificultaba la comparación entre profesionales y el seguimiento en el tiempo. La carga de trabajo y la disponibilidad de tiempo también limitaban la frecuencia de las visitas.</w:t>
       </w:r>
     </w:p>
     <w:p>
@@ -4515,7 +4563,7 @@
           <w:rFonts w:ascii="Arial" w:hAnsi="Arial"/>
           <w:sz w:val="24"/>
         </w:rPr>
-        <w:t>Incorporar de manera formal el protocolo de atención farmacéutica domiciliaria basado en el Modelo CMO, con criterios de priorización propios del farmacéutico, para ordenar el ingreso de los pacientes al seguimiento.</w:t>
+        <w:t>Incorporar de manera formal el protocolo de Atención Farmacéutica domiciliaria basado en el Modelo CMO, con criterios de priorización propios del farmacéutico, para ordenar el ingreso de los pacientes al seguimiento.</w:t>
       </w:r>
     </w:p>
     <w:p>
@@ -4528,7 +4576,7 @@
           <w:rFonts w:ascii="Arial" w:hAnsi="Arial"/>
           <w:sz w:val="24"/>
         </w:rPr>
-        <w:t>Estandarizar el registro de la atención farmacéutica mediante fichas de conciliación y de seguimiento comunes, que luego se traspasen a la ficha clínica electrónica, para mejorar la trazabilidad y la continuidad.</w:t>
+        <w:t>Estandarizar el registro de la Atención Farmacéutica mediante fichas de conciliación y de seguimiento comunes, que luego se traspasen a la ficha clínica electrónica, para mejorar la trazabilidad y la continuidad.</w:t>
       </w:r>
     </w:p>
     <w:p>
@@ -4575,7 +4623,7 @@
           <w:rFonts w:ascii="Arial" w:hAnsi="Arial"/>
           <w:sz w:val="24"/>
         </w:rPr>
-        <w:t>El internado en el CESFAM Villa Nonguén permitió desarrollar las competencias del químico farmacéutico en el ámbito de la farmacia asistencial y la atención primaria, cumpliendo el objetivo general planteado.</w:t>
+        <w:t>El internado en el CESFAM Villa Nonguén permitió desarrollar las competencias del Químico Farmacéutico en el ámbito de la farmacia asistencial y la Atención Primaria, cumpliendo el objetivo general planteado.</w:t>
       </w:r>
     </w:p>
     <w:p>
@@ -4601,7 +4649,7 @@
           <w:rFonts w:ascii="Arial" w:hAnsi="Arial"/>
           <w:sz w:val="24"/>
         </w:rPr>
-        <w:t>Se ejecutaron actividades de atención farmacéutica, visitas domiciliarias y promoción del uso racional de los medicamentos, lo que evidenció el aporte clínico y comunitario del farmacéutico en este nivel de atención.</w:t>
+        <w:t>Se ejecutaron actividades de Atención Farmacéutica, visitas domiciliarias y promoción del uso racional de los medicamentos, lo que evidenció el aporte clínico y comunitario del farmacéutico en este nivel de atención.</w:t>
       </w:r>
     </w:p>
     <w:p>
@@ -4614,7 +4662,7 @@
           <w:rFonts w:ascii="Arial" w:hAnsi="Arial"/>
           <w:sz w:val="24"/>
         </w:rPr>
-        <w:t>Se diseñó, como seminario de título, un protocolo de atención farmacéutica domiciliaria basado en el Modelo CMO, que aporta una herramienta concreta para ordenar, estandarizar y hacer trazable la visita domiciliaria en el establecimiento.</w:t>
+        <w:t>Se diseñó, como seminario de título, un protocolo de Atención Farmacéutica domiciliaria basado en el Modelo CMO, que aporta una herramienta concreta para ordenar, estandarizar y hacer trazable la visita domiciliaria en el establecimiento.</w:t>
       </w:r>
     </w:p>
     <w:p>
@@ -4627,7 +4675,7 @@
           <w:rFonts w:ascii="Arial" w:hAnsi="Arial"/>
           <w:sz w:val="24"/>
         </w:rPr>
-        <w:t>La experiencia confirmó la relevancia de la atención primaria como puerta de entrada al sistema de salud y el valor de un ejercicio profesional basado en la evidencia, la seguridad del paciente y el trabajo en equipo.</w:t>
+        <w:t>La experiencia confirmó la relevancia de la Atención Primaria como puerta de entrada al sistema de salud y el valor de un ejercicio profesional basado en la evidencia, la seguridad del paciente y el trabajo en equipo.</w:t>
       </w:r>
     </w:p>
     <w:p>
@@ -4663,7 +4711,7 @@
           <w:rFonts w:ascii="Arial" w:hAnsi="Arial"/>
           <w:sz w:val="24"/>
         </w:rPr>
-        <w:t>Bonal, J., Alerany, C., Bassons, T., &amp; Gascón, P. (2003). Farmacia clínica y atención farmacéutica. Sociedad Española de Farmacia Hospitalaria.</w:t>
+        <w:t>Bonal, J., Alerany, C., Bassons, T., &amp; Gascón, P. (2003). Farmacia clínica y Atención Farmacéutica. Sociedad Española de Farmacia Hospitalaria.</w:t>
       </w:r>
     </w:p>
     <w:p>
@@ -4761,7 +4809,7 @@
           <w:rFonts w:ascii="Arial" w:hAnsi="Arial"/>
           <w:sz w:val="24"/>
         </w:rPr>
-        <w:t>Espinosa García, J., Prados Torres, J. D., Leiva Fernández, F., &amp; Barnestein Fonseca, P. (2023). Adherencia terapéutica de los pacientes con riesgo cardiovascular en atención primaria. Proyecto REAAP. Medicina de Familia. SEMERGEN, 49(6), 102016.</w:t>
+        <w:t>Espinosa García, J., Prados Torres, J. D., Leiva Fernández, F., &amp; Barnestein Fonseca, P. (2023). Adherencia terapéutica de los pacientes con riesgo cardiovascular en Atención Primaria. Proyecto REAAP. Medicina de Familia. SEMERGEN, 49(6), 102016.</w:t>
       </w:r>
     </w:p>
     <w:p>
@@ -4775,7 +4823,7 @@
           <w:rFonts w:ascii="Arial" w:hAnsi="Arial"/>
           <w:sz w:val="24"/>
         </w:rPr>
-        <w:t>Faúndez Navarrete, P. A. (2020). Evaluación del programa de atención farmacéutica del CESFAM Villa Nonguén [Memoria de título, Universidad de Concepción].</w:t>
+        <w:t>Faúndez Navarrete, P. A. (2020). Evaluación del programa de Atención Farmacéutica del CESFAM Villa Nonguén [Memoria de título, Universidad de Concepción].</w:t>
       </w:r>
     </w:p>
     <w:p>
@@ -4817,7 +4865,7 @@
           <w:rFonts w:ascii="Arial" w:hAnsi="Arial"/>
           <w:sz w:val="24"/>
         </w:rPr>
-        <w:t>Manzano García, M., &amp; Morillo Verdugo, R. (2018). Aprendizaje y aplicación del modelo de atención farmacéutica CMO para residentes de farmacia hospitalaria. Sociedad Española de Farmacia Hospitalaria.</w:t>
+        <w:t>Manzano García, M., &amp; Morillo Verdugo, R. (2018). Aprendizaje y aplicación del modelo de Atención Farmacéutica CMO para residentes de farmacia hospitalaria. Sociedad Española de Farmacia Hospitalaria.</w:t>
       </w:r>
     </w:p>
     <w:p>
@@ -4873,7 +4921,7 @@
           <w:rFonts w:ascii="Arial" w:hAnsi="Arial"/>
           <w:sz w:val="24"/>
         </w:rPr>
-        <w:t>Ministerio de Salud de Chile. (2018a). Guía de atención farmacéutica y seguimiento farmacoterapéutico en APS. Gobierno de Chile.</w:t>
+        <w:t>Ministerio de Salud de Chile. (2018a). Guía de Atención Farmacéutica y seguimiento farmacoterapéutico en APS. Gobierno de Chile.</w:t>
       </w:r>
     </w:p>
     <w:p>
@@ -4957,7 +5005,7 @@
           <w:rFonts w:ascii="Arial" w:hAnsi="Arial"/>
           <w:sz w:val="24"/>
         </w:rPr>
-        <w:t>Álvarez-Díaz, A. M., Morillo-Verdugo, R., &amp; Fernández-Llamazares, C. M. (2025). Estudio cualitativo sobre la adopción y potenciación del modelo capacidad-motivación-oportunidad para la atención farmacéutica en consultas externas de farmacia en España. Farmacia Hospitalaria, 49(6), 384-391.</w:t>
+        <w:t>Álvarez-Díaz, A. M., Morillo-Verdugo, R., &amp; Fernández-Llamazares, C. M. (2025). Estudio cualitativo sobre la adopción y potenciación del modelo capacidad-motivación-oportunidad para la Atención Farmacéutica en consultas externas de farmacia en España. Farmacia Hospitalaria, 49(6), 384-391.</w:t>
       </w:r>
     </w:p>
     <w:p>
@@ -4979,7 +5027,7 @@
           <w:i w:val="0"/>
           <w:sz w:val="24"/>
         </w:rPr>
-        <w:t>Los anexos reúnen los principales instrumentos de apoyo diseñados para el protocolo de atención farmacéutica domiciliaria del seminario de título. Son formatos de trabajo pensados para usarse durante la visita y el seguimiento en el CESFAM, y pueden ajustarse a los registros propios del establecimiento.</w:t>
+        <w:t>Los anexos reúnen los principales instrumentos de apoyo diseñados para el protocolo de Atención Farmacéutica domiciliaria del seminario de título. Son formatos de trabajo pensados para usarse durante la visita y el seguimiento en el CESFAM, y pueden ajustarse a los registros propios del establecimiento.</w:t>
       </w:r>
     </w:p>
     <w:p>

</xml_diff>

<commit_message>
Mejora formato informe: logo en encabezado 1a pagina, FACULTAD alineado izq, numeracion romana desde i, cartas Gantt como marcadores + subseccion arsenal/GES; regenera Gantt en alta calidad (PNG 400dpi + PDF)
</commit_message>
<xml_diff>
--- a/Informe de Internado - Farmacia Asistencial y APS - CESFAM Villa Nonguen.docx
+++ b/Informe de Internado - Farmacia Asistencial y APS - CESFAM Villa Nonguen.docx
@@ -4,47 +4,49 @@
   <w:body>
     <w:p>
       <w:pPr>
-        <w:spacing w:before="120" w:after="360"/>
-        <w:jc w:val="center"/>
+        <w:spacing w:line="360" w:lineRule="auto" w:after="80" w:before="200"/>
+        <w:jc w:val="left"/>
       </w:pPr>
       <w:r>
-        <w:drawing>
-          <wp:inline xmlns:a="http://schemas.openxmlformats.org/drawingml/2006/main" xmlns:pic="http://schemas.openxmlformats.org/drawingml/2006/picture">
-            <wp:extent cx="2700000" cy="918557"/>
-            <wp:docPr id="1" name="Picture 1"/>
-            <wp:cNvGraphicFramePr>
-              <a:graphicFrameLocks noChangeAspect="1"/>
-            </wp:cNvGraphicFramePr>
-            <a:graphic>
-              <a:graphicData uri="http://schemas.openxmlformats.org/drawingml/2006/picture">
-                <pic:pic>
-                  <pic:nvPicPr>
-                    <pic:cNvPr id="0" name="logo_uss.jpeg"/>
-                    <pic:cNvPicPr/>
-                  </pic:nvPicPr>
-                  <pic:blipFill>
-                    <a:blip r:embed="rId9"/>
-                    <a:stretch>
-                      <a:fillRect/>
-                    </a:stretch>
-                  </pic:blipFill>
-                  <pic:spPr>
-                    <a:xfrm>
-                      <a:off x="0" y="0"/>
-                      <a:ext cx="2700000" cy="918557"/>
-                    </a:xfrm>
-                    <a:prstGeom prst="rect"/>
-                  </pic:spPr>
-                </pic:pic>
-              </a:graphicData>
-            </a:graphic>
-          </wp:inline>
-        </w:drawing>
+        <w:rPr>
+          <w:rFonts w:ascii="Arial" w:hAnsi="Arial"/>
+          <w:b/>
+          <w:sz w:val="28"/>
+        </w:rPr>
+        <w:t>FACULTAD DE CIENCIAS</w:t>
       </w:r>
     </w:p>
     <w:p>
       <w:pPr>
-        <w:spacing w:line="360" w:lineRule="auto" w:after="120" w:before="0"/>
+        <w:spacing w:line="360" w:lineRule="auto" w:after="80" w:before="0"/>
+        <w:jc w:val="left"/>
+      </w:pPr>
+      <w:r>
+        <w:rPr>
+          <w:rFonts w:ascii="Arial" w:hAnsi="Arial"/>
+          <w:b/>
+          <w:sz w:val="28"/>
+        </w:rPr>
+        <w:t>ESCUELA DE QUÍMICA Y FARMACIA</w:t>
+      </w:r>
+    </w:p>
+    <w:p>
+      <w:pPr>
+        <w:spacing w:line="360" w:lineRule="auto" w:after="80" w:before="0"/>
+        <w:jc w:val="left"/>
+      </w:pPr>
+      <w:r>
+        <w:rPr>
+          <w:rFonts w:ascii="Arial" w:hAnsi="Arial"/>
+          <w:b/>
+          <w:sz w:val="28"/>
+        </w:rPr>
+        <w:t>SEDE CONCEPCIÓN</w:t>
+      </w:r>
+    </w:p>
+    <w:p>
+      <w:pPr>
+        <w:spacing w:line="360" w:lineRule="auto" w:after="1080" w:before="2400"/>
         <w:jc w:val="center"/>
       </w:pPr>
       <w:r>
@@ -54,54 +56,6 @@
           <w:i w:val="0"/>
           <w:color w:val="000000"/>
           <w:sz w:val="28"/>
-        </w:rPr>
-        <w:t>FACULTAD DE CIENCIAS</w:t>
-      </w:r>
-    </w:p>
-    <w:p>
-      <w:pPr>
-        <w:spacing w:line="360" w:lineRule="auto" w:after="120" w:before="0"/>
-        <w:jc w:val="center"/>
-      </w:pPr>
-      <w:r>
-        <w:rPr>
-          <w:rFonts w:ascii="Arial" w:hAnsi="Arial"/>
-          <w:b/>
-          <w:i w:val="0"/>
-          <w:color w:val="000000"/>
-          <w:sz w:val="28"/>
-        </w:rPr>
-        <w:t>ESCUELA DE QUÍMICA Y FARMACIA</w:t>
-      </w:r>
-    </w:p>
-    <w:p>
-      <w:pPr>
-        <w:spacing w:line="360" w:lineRule="auto" w:after="1080" w:before="0"/>
-        <w:jc w:val="center"/>
-      </w:pPr>
-      <w:r>
-        <w:rPr>
-          <w:rFonts w:ascii="Arial" w:hAnsi="Arial"/>
-          <w:b/>
-          <w:i w:val="0"/>
-          <w:color w:val="000000"/>
-          <w:sz w:val="28"/>
-        </w:rPr>
-        <w:t>SEDE CONCEPCIÓN</w:t>
-      </w:r>
-    </w:p>
-    <w:p>
-      <w:pPr>
-        <w:spacing w:line="360" w:lineRule="auto" w:after="960" w:before="0"/>
-        <w:jc w:val="center"/>
-      </w:pPr>
-      <w:r>
-        <w:rPr>
-          <w:rFonts w:ascii="Arial" w:hAnsi="Arial"/>
-          <w:b/>
-          <w:i w:val="0"/>
-          <w:color w:val="000000"/>
-          <w:sz w:val="26"/>
         </w:rPr>
         <w:t>Informe de Internado en Farmacia Asistencial y Atención Primaria de Salud</w:t>
       </w:r>
@@ -221,10 +175,13 @@
     <w:p>
       <w:pPr>
         <w:sectPr>
-          <w:footerReference w:type="default" r:id="rId10"/>
+          <w:headerReference w:type="first" r:id="rId9"/>
+          <w:headerReference w:type="default" r:id="rId10"/>
+          <w:footerReference w:type="default" r:id="rId11"/>
           <w:pgSz w:w="12240" w:h="15840"/>
-          <w:pgMar w:top="1417" w:right="1417" w:bottom="1417" w:left="2268" w:header="720" w:footer="720" w:gutter="0"/>
+          <w:pgMar w:top="1417" w:right="1417" w:bottom="1417" w:left="2268" w:header="709" w:footer="720" w:gutter="0"/>
           <w:cols w:space="720"/>
+          <w:titlePg/>
           <w:docGrid w:linePitch="360"/>
         </w:sectPr>
       </w:pPr>
@@ -733,12 +690,13 @@
     <w:p>
       <w:pPr>
         <w:sectPr>
-          <w:footerReference w:type="default" r:id="rId11"/>
+          <w:footerReference w:type="default" r:id="rId12"/>
           <w:pgSz w:w="12240" w:h="15840"/>
-          <w:pgMar w:top="1417" w:right="1417" w:bottom="1417" w:left="2268" w:header="720" w:footer="720" w:gutter="0"/>
+          <w:pgMar w:top="1417" w:right="1417" w:bottom="1417" w:left="2268" w:header="709" w:footer="720" w:gutter="0"/>
           <w:cols w:space="720"/>
+          <w:titlePg/>
           <w:docGrid w:linePitch="360"/>
-          <w:pgNumType w:fmt="lowerRoman" w:start="2"/>
+          <w:pgNumType w:fmt="lowerRoman" w:start="1"/>
         </w:sectPr>
       </w:pPr>
     </w:p>
@@ -1874,7 +1832,7 @@
         <w:drawing>
           <wp:inline xmlns:a="http://schemas.openxmlformats.org/drawingml/2006/main" xmlns:pic="http://schemas.openxmlformats.org/drawingml/2006/picture">
             <wp:extent cx="5400000" cy="3552632"/>
-            <wp:docPr id="2" name="Picture 2"/>
+            <wp:docPr id="1" name="Picture 1"/>
             <wp:cNvGraphicFramePr>
               <a:graphicFrameLocks noChangeAspect="1"/>
             </wp:cNvGraphicFramePr>
@@ -1886,7 +1844,7 @@
                     <pic:cNvPicPr/>
                   </pic:nvPicPr>
                   <pic:blipFill>
-                    <a:blip r:embed="rId13"/>
+                    <a:blip r:embed="rId14"/>
                     <a:stretch>
                       <a:fillRect/>
                     </a:stretch>
@@ -2419,6 +2377,19 @@
           <w:rFonts w:ascii="Arial" w:hAnsi="Arial"/>
           <w:sz w:val="24"/>
         </w:rPr>
+        <w:t>Conocimiento del arsenal farmacoterapéutico, los programas ministeriales (GES) y las fuentes de información de medicamentos.</w:t>
+      </w:r>
+    </w:p>
+    <w:p>
+      <w:pPr>
+        <w:pStyle w:val="ListNumber"/>
+        <w:spacing w:line="360" w:lineRule="auto"/>
+      </w:pPr>
+      <w:r>
+        <w:rPr>
+          <w:rFonts w:ascii="Arial" w:hAnsi="Arial"/>
+          <w:sz w:val="24"/>
+        </w:rPr>
         <w:t>Vinculación con el medio.</w:t>
       </w:r>
     </w:p>
@@ -2459,42 +2430,38 @@
     </w:p>
     <w:p>
       <w:pPr>
-        <w:spacing w:before="120" w:after="40"/>
+        <w:spacing w:before="360" w:after="120"/>
         <w:jc w:val="center"/>
+        <w:pBdr>
+          <w:top w:val="dashed" w:sz="6" w:space="16" w:color="1F3B5C"/>
+          <w:bottom w:val="dashed" w:sz="6" w:space="16" w:color="1F3B5C"/>
+          <w:left w:val="dashed" w:sz="6" w:space="16" w:color="1F3B5C"/>
+          <w:right w:val="dashed" w:sz="6" w:space="16" w:color="1F3B5C"/>
+        </w:pBdr>
       </w:pPr>
       <w:r>
-        <w:drawing>
-          <wp:inline xmlns:a="http://schemas.openxmlformats.org/drawingml/2006/main" xmlns:pic="http://schemas.openxmlformats.org/drawingml/2006/picture">
-            <wp:extent cx="5580000" cy="2984651"/>
-            <wp:docPr id="3" name="Picture 3"/>
-            <wp:cNvGraphicFramePr>
-              <a:graphicFrameLocks noChangeAspect="1"/>
-            </wp:cNvGraphicFramePr>
-            <a:graphic>
-              <a:graphicData uri="http://schemas.openxmlformats.org/drawingml/2006/picture">
-                <pic:pic>
-                  <pic:nvPicPr>
-                    <pic:cNvPr id="0" name="fig_gantt_planificada.png"/>
-                    <pic:cNvPicPr/>
-                  </pic:nvPicPr>
-                  <pic:blipFill>
-                    <a:blip r:embed="rId14"/>
-                    <a:stretch>
-                      <a:fillRect/>
-                    </a:stretch>
-                  </pic:blipFill>
-                  <pic:spPr>
-                    <a:xfrm>
-                      <a:off x="0" y="0"/>
-                      <a:ext cx="5580000" cy="2984651"/>
-                    </a:xfrm>
-                    <a:prstGeom prst="rect"/>
-                  </pic:spPr>
-                </pic:pic>
-              </a:graphicData>
-            </a:graphic>
-          </wp:inline>
-        </w:drawing>
+        <w:rPr>
+          <w:rFonts w:ascii="Arial" w:hAnsi="Arial"/>
+          <w:i/>
+          <w:color w:val="1F3B5C"/>
+          <w:sz w:val="22"/>
+        </w:rPr>
+        <w:t>[ Espacio reservado para insertar aquí la Carta Gantt ]</w:t>
+        <w:br/>
+        <w:br/>
+        <w:br/>
+        <w:br/>
+        <w:br/>
+        <w:br/>
+      </w:r>
+      <w:r>
+        <w:rPr>
+          <w:rFonts w:ascii="Arial" w:hAnsi="Arial"/>
+          <w:i/>
+          <w:color w:val="1F3B5C"/>
+          <w:sz w:val="20"/>
+        </w:rPr>
+        <w:t>Archivo fig_gantt_planificada.png (alta resolución) o fig_gantt_planificada.pdf (vectorial)</w:t>
       </w:r>
     </w:p>
     <w:p>
@@ -2547,42 +2514,38 @@
     </w:p>
     <w:p>
       <w:pPr>
-        <w:spacing w:before="120" w:after="40"/>
+        <w:spacing w:before="360" w:after="120"/>
         <w:jc w:val="center"/>
+        <w:pBdr>
+          <w:top w:val="dashed" w:sz="6" w:space="16" w:color="1F3B5C"/>
+          <w:bottom w:val="dashed" w:sz="6" w:space="16" w:color="1F3B5C"/>
+          <w:left w:val="dashed" w:sz="6" w:space="16" w:color="1F3B5C"/>
+          <w:right w:val="dashed" w:sz="6" w:space="16" w:color="1F3B5C"/>
+        </w:pBdr>
       </w:pPr>
       <w:r>
-        <w:drawing>
-          <wp:inline xmlns:a="http://schemas.openxmlformats.org/drawingml/2006/main" xmlns:pic="http://schemas.openxmlformats.org/drawingml/2006/picture">
-            <wp:extent cx="5400000" cy="7039594"/>
-            <wp:docPr id="4" name="Picture 4"/>
-            <wp:cNvGraphicFramePr>
-              <a:graphicFrameLocks noChangeAspect="1"/>
-            </wp:cNvGraphicFramePr>
-            <a:graphic>
-              <a:graphicData uri="http://schemas.openxmlformats.org/drawingml/2006/picture">
-                <pic:pic>
-                  <pic:nvPicPr>
-                    <pic:cNvPr id="0" name="fig_gantt_desarrollada.png"/>
-                    <pic:cNvPicPr/>
-                  </pic:nvPicPr>
-                  <pic:blipFill>
-                    <a:blip r:embed="rId15"/>
-                    <a:stretch>
-                      <a:fillRect/>
-                    </a:stretch>
-                  </pic:blipFill>
-                  <pic:spPr>
-                    <a:xfrm>
-                      <a:off x="0" y="0"/>
-                      <a:ext cx="5400000" cy="7039594"/>
-                    </a:xfrm>
-                    <a:prstGeom prst="rect"/>
-                  </pic:spPr>
-                </pic:pic>
-              </a:graphicData>
-            </a:graphic>
-          </wp:inline>
-        </w:drawing>
+        <w:rPr>
+          <w:rFonts w:ascii="Arial" w:hAnsi="Arial"/>
+          <w:i/>
+          <w:color w:val="1F3B5C"/>
+          <w:sz w:val="22"/>
+        </w:rPr>
+        <w:t>[ Espacio reservado para insertar aquí la Carta Gantt ]</w:t>
+        <w:br/>
+        <w:br/>
+        <w:br/>
+        <w:br/>
+        <w:br/>
+        <w:br/>
+      </w:r>
+      <w:r>
+        <w:rPr>
+          <w:rFonts w:ascii="Arial" w:hAnsi="Arial"/>
+          <w:i/>
+          <w:color w:val="1F3B5C"/>
+          <w:sz w:val="20"/>
+        </w:rPr>
+        <w:t>Archivo fig_gantt_desarrollada.png (alta resolución) o fig_gantt_desarrollada.pdf (vectorial)</w:t>
       </w:r>
     </w:p>
     <w:p>
@@ -4015,6 +3978,28 @@
     </w:p>
     <w:p>
       <w:pPr>
+        <w:pStyle w:val="Heading3"/>
+      </w:pPr>
+      <w:r>
+        <w:t>2.3.8 Arsenal farmacoterapéutico, programas ministeriales y fuentes de información</w:t>
+      </w:r>
+    </w:p>
+    <w:p>
+      <w:pPr>
+        <w:jc w:val="both"/>
+      </w:pPr>
+      <w:r>
+        <w:rPr>
+          <w:rFonts w:ascii="Arial" w:hAnsi="Arial"/>
+          <w:b w:val="0"/>
+          <w:i w:val="0"/>
+          <w:sz w:val="24"/>
+        </w:rPr>
+        <w:t>A lo largo del internado se conoció el arsenal farmacoterapéutico de la unidad, es decir, el listado de medicamentos disponibles en el CESFAM según la canasta de la Atención Primaria y las orientaciones del Ministerio de Salud, junto con los criterios que definen qué medicamentos se incorporan o se retiran, como ocurrió con el reemplazo de la vildagliptina por otra alternativa dentro del mismo grupo. También se conoció el manejo de los medicamentos sujetos a control legal, con su registro y custodia diferenciados, y el circuito de notificación de farmacovigilancia frente a una sospecha de reacción adversa, aunque durante la estadía no se presentó un caso que ameritara notificar. Buena parte del trabajo de la unidad se articula con los programas ministeriales y las patologías con Garantías Explícitas en Salud (GES), como la epilepsia y la tuberculosis, cuyos tratamientos se dispensan y controlan de acuerdo con cada programa. Para resolver dudas sobre los medicamentos y apoyar la Atención Farmacéutica con evidencia, se recurrió a fuentes de información confiables y actualizadas, entre ellas UpToDate, Medscape y Drugs.com, además de la normativa y las guías del Ministerio de Salud. Esta actividad aporta al segundo y al tercer objetivo específico, ya que combina la gestión del arsenal con el uso seguro y racional de los medicamentos.</w:t>
+      </w:r>
+    </w:p>
+    <w:p>
+      <w:pPr>
         <w:pStyle w:val="Heading2"/>
       </w:pPr>
       <w:r>
@@ -5736,10 +5721,11 @@
       </w:r>
     </w:p>
     <w:sectPr>
-      <w:footerReference w:type="default" r:id="rId12"/>
+      <w:footerReference w:type="default" r:id="rId13"/>
       <w:pgSz w:w="12240" w:h="15840"/>
-      <w:pgMar w:top="1417" w:right="1417" w:bottom="1417" w:left="2268" w:header="720" w:footer="720" w:gutter="0"/>
+      <w:pgMar w:top="1417" w:right="1417" w:bottom="1417" w:left="2268" w:header="709" w:footer="720" w:gutter="0"/>
       <w:cols w:space="720"/>
+      <w:titlePg/>
       <w:docGrid w:linePitch="360"/>
       <w:pgNumType w:fmt="decimal" w:start="1"/>
     </w:sectPr>
@@ -5848,6 +5834,62 @@
     </w:r>
   </w:p>
 </w:ftr>
+</file>
+
+<file path=word/header1.xml><?xml version="1.0" encoding="utf-8"?>
+<w:hdr xmlns:m="http://schemas.openxmlformats.org/officeDocument/2006/math" xmlns:mc="http://schemas.openxmlformats.org/markup-compatibility/2006" xmlns:mo="http://schemas.microsoft.com/office/mac/office/2008/main" xmlns:mv="urn:schemas-microsoft-com:mac:vml" xmlns:o="urn:schemas-microsoft-com:office:office" xmlns:r="http://schemas.openxmlformats.org/officeDocument/2006/relationships" xmlns:v="urn:schemas-microsoft-com:vml" xmlns:w10="urn:schemas-microsoft-com:office:word" xmlns:w14="http://schemas.microsoft.com/office/word/2010/wordml" xmlns:w="http://schemas.openxmlformats.org/wordprocessingml/2006/main" xmlns:wne="http://schemas.microsoft.com/office/word/2006/wordml" xmlns:wp14="http://schemas.microsoft.com/office/word/2010/wordprocessingDrawing" xmlns:wp="http://schemas.openxmlformats.org/drawingml/2006/wordprocessingDrawing" xmlns:wpc="http://schemas.microsoft.com/office/word/2010/wordprocessingCanvas" xmlns:wpg="http://schemas.microsoft.com/office/word/2010/wordprocessingGroup" xmlns:wpi="http://schemas.microsoft.com/office/word/2010/wordprocessingInk" xmlns:wps="http://schemas.microsoft.com/office/word/2010/wordprocessingShape" mc:Ignorable="w14 wp14">
+  <w:p>
+    <w:pPr>
+      <w:pStyle w:val="Header"/>
+      <w:jc w:val="left"/>
+    </w:pPr>
+    <w:r>
+      <w:drawing>
+        <wp:inline xmlns:a="http://schemas.openxmlformats.org/drawingml/2006/main" xmlns:pic="http://schemas.openxmlformats.org/drawingml/2006/picture">
+          <wp:extent cx="1944000" cy="661361"/>
+          <wp:docPr id="1" name="Picture 1"/>
+          <wp:cNvGraphicFramePr>
+            <a:graphicFrameLocks noChangeAspect="1"/>
+          </wp:cNvGraphicFramePr>
+          <a:graphic>
+            <a:graphicData uri="http://schemas.openxmlformats.org/drawingml/2006/picture">
+              <pic:pic>
+                <pic:nvPicPr>
+                  <pic:cNvPr id="0" name="logo_uss.jpeg"/>
+                  <pic:cNvPicPr/>
+                </pic:nvPicPr>
+                <pic:blipFill>
+                  <a:blip r:embed="rId1"/>
+                  <a:stretch>
+                    <a:fillRect/>
+                  </a:stretch>
+                </pic:blipFill>
+                <pic:spPr>
+                  <a:xfrm>
+                    <a:off x="0" y="0"/>
+                    <a:ext cx="1944000" cy="661361"/>
+                  </a:xfrm>
+                  <a:prstGeom prst="rect"/>
+                </pic:spPr>
+              </pic:pic>
+            </a:graphicData>
+          </a:graphic>
+        </wp:inline>
+      </w:drawing>
+    </w:r>
+  </w:p>
+</w:hdr>
+</file>
+
+<file path=word/header2.xml><?xml version="1.0" encoding="utf-8"?>
+<w:hdr xmlns:m="http://schemas.openxmlformats.org/officeDocument/2006/math" xmlns:mc="http://schemas.openxmlformats.org/markup-compatibility/2006" xmlns:mo="http://schemas.microsoft.com/office/mac/office/2008/main" xmlns:mv="urn:schemas-microsoft-com:mac:vml" xmlns:o="urn:schemas-microsoft-com:office:office" xmlns:r="http://schemas.openxmlformats.org/officeDocument/2006/relationships" xmlns:v="urn:schemas-microsoft-com:vml" xmlns:w10="urn:schemas-microsoft-com:office:word" xmlns:w14="http://schemas.microsoft.com/office/word/2010/wordml" xmlns:w="http://schemas.openxmlformats.org/wordprocessingml/2006/main" xmlns:wne="http://schemas.microsoft.com/office/word/2006/wordml" xmlns:wp14="http://schemas.microsoft.com/office/word/2010/wordprocessingDrawing" xmlns:wp="http://schemas.openxmlformats.org/drawingml/2006/wordprocessingDrawing" xmlns:wpc="http://schemas.microsoft.com/office/word/2010/wordprocessingCanvas" xmlns:wpg="http://schemas.microsoft.com/office/word/2010/wordprocessingGroup" xmlns:wpi="http://schemas.microsoft.com/office/word/2010/wordprocessingInk" xmlns:wps="http://schemas.microsoft.com/office/word/2010/wordprocessingShape" mc:Ignorable="w14 wp14">
+  <w:p>
+    <w:pPr>
+      <w:pStyle w:val="Header"/>
+    </w:pPr>
+    <w:r/>
+  </w:p>
+</w:hdr>
 </file>
 
 <file path=word/numbering.xml><?xml version="1.0" encoding="utf-8"?>

</xml_diff>

<commit_message>
Actualiza informe: estructura segun rubrica (Discusion y Conclusiones separadas), comparacion con CESFAM Hualpencillo, fortalezas/debilidades reales, eliminacion de medicamentos y control legal, AF todas las semanas; cartas Gantt semanales en alta calidad; reemplaza tesis antigua por AVANCE 25.07
</commit_message>
<xml_diff>
--- a/Informe de Internado - Farmacia Asistencial y APS - CESFAM Villa Nonguen.docx
+++ b/Informe de Internado - Farmacia Asistencial y APS - CESFAM Villa Nonguen.docx
@@ -1831,7 +1831,7 @@
       <w:r>
         <w:drawing>
           <wp:inline xmlns:a="http://schemas.openxmlformats.org/drawingml/2006/main" xmlns:pic="http://schemas.openxmlformats.org/drawingml/2006/picture">
-            <wp:extent cx="5400000" cy="3552632"/>
+            <wp:extent cx="5400000" cy="3553411"/>
             <wp:docPr id="1" name="Picture 1"/>
             <wp:cNvGraphicFramePr>
               <a:graphicFrameLocks noChangeAspect="1"/>
@@ -1852,7 +1852,7 @@
                   <pic:spPr>
                     <a:xfrm>
                       <a:off x="0" y="0"/>
-                      <a:ext cx="5400000" cy="3552632"/>
+                      <a:ext cx="5400000" cy="3553411"/>
                     </a:xfrm>
                     <a:prstGeom prst="rect"/>
                   </pic:spPr>
@@ -2351,7 +2351,33 @@
           <w:rFonts w:ascii="Arial" w:hAnsi="Arial"/>
           <w:sz w:val="24"/>
         </w:rPr>
+        <w:t>Manejo de medicamentos sujetos a control legal.</w:t>
+      </w:r>
+    </w:p>
+    <w:p>
+      <w:pPr>
+        <w:pStyle w:val="ListNumber"/>
+        <w:spacing w:line="360" w:lineRule="auto"/>
+      </w:pPr>
+      <w:r>
+        <w:rPr>
+          <w:rFonts w:ascii="Arial" w:hAnsi="Arial"/>
+          <w:sz w:val="24"/>
+        </w:rPr>
         <w:t>Inventario y ordenamiento de bodega.</w:t>
+      </w:r>
+    </w:p>
+    <w:p>
+      <w:pPr>
+        <w:pStyle w:val="ListNumber"/>
+        <w:spacing w:line="360" w:lineRule="auto"/>
+      </w:pPr>
+      <w:r>
+        <w:rPr>
+          <w:rFonts w:ascii="Arial" w:hAnsi="Arial"/>
+          <w:sz w:val="24"/>
+        </w:rPr>
+        <w:t>Eliminación de medicamentos vencidos, en mal estado o sin rotulación adecuada.</w:t>
       </w:r>
     </w:p>
     <w:p>
@@ -2509,7 +2535,7 @@
           <w:i w:val="0"/>
           <w:sz w:val="24"/>
         </w:rPr>
-        <w:t>La Figura 3 muestra las actividades efectivamente desarrolladas, con detalle por día y por semana. En términos generales, la ejecución siguió lo planificado, con algunos ajustes propios de la dinámica del establecimiento. El fraccionamiento, la dispensación y la Atención Farmacéutica se extendieron durante casi todo el periodo, ya que constituyen tareas habituales de la unidad, y se sumaron actividades no previstas al inicio, como el apoyo durante las supervisiones del Servicio de Salud y una situación de vinculación con el medio surgida en terreno. La Tabla 3 complementa la figura con el detalle diario de lo realizado.</w:t>
+        <w:t>La Figura 3 muestra, semana a semana, las actividades efectivamente desarrolladas. En términos generales, la ejecución siguió lo planificado, con algunos ajustes propios de la dinámica del establecimiento. El fraccionamiento, el reenvasado y el despacho se mantuvieron durante casi todo el periodo, ya que constituyen tareas habituales de la unidad, y la Atención Farmacéutica se realizó todas las semanas, en más de una oportunidad por semana, gracias a la muy buena disposición de los Químicos Farmacéuticos para integrar al interno a esa labor y enseñarle cómo llevarla a cabo. Hacia las últimas semanas se sumó la eliminación de medicamentos vencidos, y a lo largo de la rotación aparecieron actividades no previstas al inicio, como el apoyo durante las supervisiones del Servicio de Salud y una situación de vinculación con el medio surgida en terreno. La Tabla 3 complementa la figura con el detalle de lo realizado día a día.</w:t>
       </w:r>
     </w:p>
     <w:p>
@@ -2571,7 +2597,7 @@
         <w:fldChar w:fldCharType="end"/>
       </w:r>
       <w:r>
-        <w:t>. Carta Gantt de actividades desarrolladas, con detalle por día y semana.</w:t>
+        <w:t>. Carta Gantt de actividades desarrolladas del internado.</w:t>
       </w:r>
     </w:p>
     <w:p>
@@ -3600,7 +3626,7 @@
                 <w:rFonts w:ascii="Arial" w:hAnsi="Arial"/>
                 <w:sz w:val="16"/>
               </w:rPr>
-              <w:t>Rutina de farmacia</w:t>
+              <w:t>Rutina de farmacia y Atención Farmacéutica</w:t>
             </w:r>
           </w:p>
         </w:tc>
@@ -3638,7 +3664,7 @@
                 <w:rFonts w:ascii="Arial" w:hAnsi="Arial"/>
                 <w:sz w:val="16"/>
               </w:rPr>
-              <w:t>Rutina de farmacia</w:t>
+              <w:t>Eliminación de vencidos (separación por bolsa)</w:t>
             </w:r>
           </w:p>
         </w:tc>
@@ -3737,7 +3763,7 @@
                 <w:rFonts w:ascii="Arial" w:hAnsi="Arial"/>
                 <w:sz w:val="16"/>
               </w:rPr>
-              <w:t>Entrega a domicilio</w:t>
+              <w:t>Eliminación de vencidos y acta de baja</w:t>
             </w:r>
           </w:p>
         </w:tc>
@@ -3907,7 +3933,7 @@
           <w:i w:val="0"/>
           <w:sz w:val="24"/>
         </w:rPr>
-        <w:t>Se apoyó la dispensación de medicamentos a los usuarios, con lo que se reforzaron el reconocimiento de los principios activos, las presentaciones y su ubicación dentro de la unidad, y las buenas prácticas de entrega. La dispensación se acompañó de la información necesaria para el uso correcto de la terapia, verificando la indicación y resolviendo dudas de los pacientes. También se conocieron los criterios de manejo de los medicamentos sujetos a control legal y la forma de registrar su entrega. Responde al segundo objetivo específico.</w:t>
+        <w:t>Se apoyó la dispensación de medicamentos a los usuarios siguiendo el protocolo de despacho del establecimiento, que busca entregar el tratamiento correcto de forma ordenada y sin errores. El trabajo reforzó el reconocimiento de los principios activos, las presentaciones y su ubicación dentro de la unidad, la verificación de la receta y de los datos del paciente, y las buenas prácticas de entrega. Cada despacho se registra en el sistema informático SINET Sur, que descuenta el producto de su bincard, de modo que el stock queda actualizado y trazable en todo momento. La dispensación se acompañó de la información necesaria para el uso correcto de la terapia, verificando la indicación y resolviendo dudas de los pacientes. Este orden y esta trazabilidad, junto con el traspaso registrado de medicamentos desde la bodega a la farmacia, fueron uno de los aspectos más destacables de la unidad. Responde al segundo objetivo específico.</w:t>
       </w:r>
     </w:p>
     <w:p>
@@ -3929,7 +3955,7 @@
           <w:i w:val="0"/>
           <w:sz w:val="24"/>
         </w:rPr>
-        <w:t>La Atención Farmacéutica fue una de las actividades más significativas del internado. Se acompañó al Químico Farmacéutico en la atención de los usuarios del Programa de Salud Cardiovascular, tanto en box como en el domicilio, y se participó en la entrega de medicamentos a domicilio para pacientes con dificultades para acudir al centro. En estas visitas se revisaba la medicación que el paciente realmente utilizaba, se conciliaba con la que tenía indicada, se resolvían dudas sobre horarios y formas de administración, y se reforzaba la adherencia. Durante una jornada vespertina se observó, además, el funcionamiento de la farmacia en el horario de la tarde y el procedimiento de cierre de la unidad. Esta actividad responde al tercer objetivo específico.</w:t>
+        <w:t>La Atención Farmacéutica fue una de las actividades más significativas del internado y se realizó todas las semanas, en más de una oportunidad por semana, gracias a la muy buena disposición de los Químicos Farmacéuticos, que integraron al interno a esta labor y le enseñaron cómo llevarla a cabo. Se acompañó al Químico Farmacéutico en la atención de los usuarios del Programa de Salud Cardiovascular, tanto en box como en el domicilio, y se participó en la entrega de medicamentos a domicilio para pacientes con dificultades para acudir al centro. En estas visitas se revisaba la medicación que el paciente realmente utilizaba, se conciliaba con la que tenía indicada, se resolvían dudas sobre horarios y formas de administración, y se reforzaba la adherencia. Durante una jornada vespertina se observó, además, el funcionamiento de la farmacia en el horario de la tarde y el procedimiento de cierre de la unidad. Esta actividad responde al tercer objetivo específico.</w:t>
       </w:r>
     </w:p>
     <w:p>
@@ -3996,6 +4022,50 @@
           <w:sz w:val="24"/>
         </w:rPr>
         <w:t>A lo largo del internado se conoció el arsenal farmacoterapéutico de la unidad, es decir, el listado de medicamentos disponibles en el CESFAM según la canasta de la Atención Primaria y las orientaciones del Ministerio de Salud, junto con los criterios que definen qué medicamentos se incorporan o se retiran, como ocurrió con el reemplazo de la vildagliptina por otra alternativa dentro del mismo grupo. También se conoció el manejo de los medicamentos sujetos a control legal, con su registro y custodia diferenciados, y el circuito de notificación de farmacovigilancia frente a una sospecha de reacción adversa, aunque durante la estadía no se presentó un caso que ameritara notificar. Buena parte del trabajo de la unidad se articula con los programas ministeriales y las patologías con Garantías Explícitas en Salud (GES), como la epilepsia y la tuberculosis, cuyos tratamientos se dispensan y controlan de acuerdo con cada programa. Para resolver dudas sobre los medicamentos y apoyar la Atención Farmacéutica con evidencia, se recurrió a fuentes de información confiables y actualizadas, entre ellas UpToDate, Medscape y Drugs.com, además de la normativa y las guías del Ministerio de Salud. Esta actividad aporta al segundo y al tercer objetivo específico, ya que combina la gestión del arsenal con el uso seguro y racional de los medicamentos.</w:t>
+      </w:r>
+    </w:p>
+    <w:p>
+      <w:pPr>
+        <w:pStyle w:val="Heading3"/>
+      </w:pPr>
+      <w:r>
+        <w:t>2.3.9 Manejo de medicamentos sujetos a control legal</w:t>
+      </w:r>
+    </w:p>
+    <w:p>
+      <w:pPr>
+        <w:jc w:val="both"/>
+      </w:pPr>
+      <w:r>
+        <w:rPr>
+          <w:rFonts w:ascii="Arial" w:hAnsi="Arial"/>
+          <w:b w:val="0"/>
+          <w:i w:val="0"/>
+          <w:sz w:val="24"/>
+        </w:rPr>
+        <w:t>Se conoció el manejo de los medicamentos sujetos a control legal, es decir, los psicotrópicos y estupefacientes, que se guardan bajo llave y se registran de forma diferenciada en los libros oficiales de control. Se revisó cómo se verifican las recetas retenidas, cómo se descuentan las existencias y cómo se resguarda la trazabilidad de estos fármacos, en línea con la normativa vigente. Esta actividad responde al segundo objetivo específico.</w:t>
+      </w:r>
+    </w:p>
+    <w:p>
+      <w:pPr>
+        <w:pStyle w:val="Heading3"/>
+      </w:pPr>
+      <w:r>
+        <w:t>2.3.10 Eliminación de medicamentos vencidos</w:t>
+      </w:r>
+    </w:p>
+    <w:p>
+      <w:pPr>
+        <w:jc w:val="both"/>
+      </w:pPr>
+      <w:r>
+        <w:rPr>
+          <w:rFonts w:ascii="Arial" w:hAnsi="Arial"/>
+          <w:b w:val="0"/>
+          <w:i w:val="0"/>
+          <w:sz w:val="24"/>
+        </w:rPr>
+        <w:t>Durante las dos últimas semanas del internado se participó en la eliminación de medicamentos vencidos, en mal estado o sin rotulación adecuada, siguiendo el procedimiento del establecimiento. El trabajo consistió en revisar las existencias de la farmacia y la bodega, marcar y separar los productos que debían eliminarse y llevarlos al área donde no se pueden dispensar, descontar sus saldos de la bincard en el sistema y dejar constancia en el acta de baja mensual. Los productos se acondicionan en bolsas y contenedores de residuos peligrosos para su retiro a la sala REAS, desde donde una empresa externa realiza la disposición final, y en el caso de los psicotrópicos y estupefacientes la eliminación se hace con aviso previo a la autoridad sanitaria. Esta actividad reforzó la importancia de dispensar solo productos vigentes y en buen estado, y responde al segundo objetivo específico.</w:t>
       </w:r>
     </w:p>
     <w:p>
@@ -4469,7 +4539,7 @@
         <w:pStyle w:val="Heading1"/>
       </w:pPr>
       <w:r>
-        <w:t>3. DISCUSIÓN Y CONCLUSIONES</w:t>
+        <w:t>3. DISCUSIÓN</w:t>
       </w:r>
     </w:p>
     <w:p>
@@ -4527,15 +4597,65 @@
           <w:i w:val="0"/>
           <w:sz w:val="24"/>
         </w:rPr>
-        <w:t>Entre las fortalezas del CESFAM Villa Nonguén destacan su condición de centro pionero en el Modelo de Salud Familiar, un equipo de farmacia consolidado que ya realiza Atención Farmacéutica en box y en el domicilio, y una cultura de trabajo orientada a la comunidad. La sectorización del territorio y la existencia de indicadores de despacho facilitan la organización de la atención y el uso eficiente de los recursos. Como aspecto por mejorar, se observó que la visita domiciliaria del farmacéutico se realizaba sin un procedimiento escrito y estandarizado, y que el registro se apoyaba en hojas personales además de la ficha clínica electrónica, lo que dificultaba la comparación entre profesionales y el seguimiento en el tiempo. La carga de trabajo y la disponibilidad de tiempo también limitaban la frecuencia de las visitas.</w:t>
+        <w:t>El paso por la unidad de farmacia del CESFAM Villa Nonguén dejó ver varias fortalezas. La más evidente es el orden y la trazabilidad con que se maneja el medicamento, ya que cada producto se cuenta, se descuenta de su bincard al momento del despacho y se traspasa desde la bodega a la farmacia dejando registro, lo que permite saber en todo momento con qué stock se cuenta. El sistema informático que utilizan, SINET Sur, resultó sencillo y fácil de entender, y acompaña bien el trabajo diario de dispensación. A esto se suma un equipo consolidado, con muy buena disposición de los Químicos Farmacéuticos para enseñar y para llevar al interno a hacer Atención Farmacéutica más de una vez por semana, y una atención cercana que la comunidad agradece. El centro tiene, además, el valor histórico de haber sido pionero en el Modelo de Salud Familiar en el país.</w:t>
       </w:r>
     </w:p>
     <w:p>
       <w:pPr>
+        <w:jc w:val="both"/>
+      </w:pPr>
+      <w:r>
+        <w:rPr>
+          <w:rFonts w:ascii="Arial" w:hAnsi="Arial"/>
+          <w:b w:val="0"/>
+          <w:i w:val="0"/>
+          <w:sz w:val="24"/>
+        </w:rPr>
+        <w:t>Entre los aspectos por mejorar, el más claro es el espacio. Como el CESFAM cada vez atiende a más personas, la farmacia se ha ido quedando pequeña, con pocas ventanillas de atención y momentos en que se llena de gente, lo que deja poco lugar para que los usuarios esperen con comodidad. El espacio para guardar medicamentos también es reducido, por lo que se deben hacer traspasos constantes desde la bodega, que igualmente es pequeña y deja poco margen para movilizarse, aun cuando los medicamentos están ordenados y se cumplen los criterios de almacenamiento. Un aspecto adicional, que dio origen al seminario de título, es que la visita domiciliaria del farmacéutico se realizaba sin un procedimiento escrito y estandarizado, apoyándose en hojas personales además de la ficha clínica, lo que dificultaba comparar el trabajo entre profesionales y darle continuidad.</w:t>
+      </w:r>
+    </w:p>
+    <w:p>
+      <w:pPr>
         <w:pStyle w:val="Heading2"/>
       </w:pPr>
       <w:r>
-        <w:t>3.3 Sugerencias y propuestas de mejora</w:t>
+        <w:t>3.3 Comparación con otro centro de Atención Primaria</w:t>
+      </w:r>
+    </w:p>
+    <w:p>
+      <w:pPr>
+        <w:jc w:val="both"/>
+      </w:pPr>
+      <w:r>
+        <w:rPr>
+          <w:rFonts w:ascii="Arial" w:hAnsi="Arial"/>
+          <w:b w:val="0"/>
+          <w:i w:val="0"/>
+          <w:sz w:val="24"/>
+        </w:rPr>
+        <w:t>Para poner en contexto la experiencia, resulta útil comparar el CESFAM Villa Nonguén con el CESFAM Hualpencillo, de la comuna de Hualpén, también en la Región del Biobío, donde se desarrolló una práctica previa. Ambos son establecimientos de Atención Primaria que trabajan bajo el Modelo de Salud Familiar y comparten las tareas propias de una farmacia de este nivel, como el fraccionamiento y reenvasado, el despacho informado, el control de los medicamentos sujetos a fiscalización, la eliminación de productos vencidos y la entrega de medicamentos a domicilio, que en Hualpencillo se organiza a través del programa Piloto con generación de váuchers y en Villa Nonguén se enmarca en el Programa de Salud Cardiovascular (Organización Mundial de la Salud, 2021; Ministerio de Salud de Chile, 2020).</w:t>
+      </w:r>
+    </w:p>
+    <w:p>
+      <w:pPr>
+        <w:jc w:val="both"/>
+      </w:pPr>
+      <w:r>
+        <w:rPr>
+          <w:rFonts w:ascii="Arial" w:hAnsi="Arial"/>
+          <w:b w:val="0"/>
+          <w:i w:val="0"/>
+          <w:sz w:val="24"/>
+        </w:rPr>
+        <w:t>La primera diferencia está en la dependencia administrativa, ya que Hualpencillo es de administración municipal, mientras que Villa Nonguén funciona bajo administración delegada a cargo de COSADES. En cuanto a la gestión del medicamento, el sistema informático de Villa Nonguén, SINET Sur, se percibió más sencillo y con mayor trazabilidad que el utilizado en Hualpencillo, con un conteo claro de existencias y descuentos automáticos al momento del despacho. Ambos centros, de todos modos, comparten una limitación de infraestructura, ya que en los dos el espacio de bodega y de farmacia resulta estrecho para el volumen de medicamentos y de público que manejan. La diferencia es que en Hualpencillo esa dificultad se acompaña de una falta de personal para cubrir la extensión horaria y de la ausencia de Químico Farmacéutico en algunos horarios, lo que limita la supervisión de la dispensación (Organización Panamericana de la Salud, 2024), mientras que en Villa Nonguén el problema es sobre todo de espacio físico más que de dotación. Esta comparación confirma que la infraestructura es un desafío común de la Atención Primaria y que el orden y la trazabilidad de Villa Nonguén son una fortaleza que vale la pena mantener.</w:t>
+      </w:r>
+    </w:p>
+    <w:p>
+      <w:pPr>
+        <w:pStyle w:val="Heading2"/>
+      </w:pPr>
+      <w:r>
+        <w:t>3.4 Originalidad y propuestas de mejora</w:t>
       </w:r>
     </w:p>
     <w:p>
@@ -4548,7 +4668,20 @@
           <w:rFonts w:ascii="Arial" w:hAnsi="Arial"/>
           <w:sz w:val="24"/>
         </w:rPr>
-        <w:t>Incorporar de manera formal el protocolo de Atención Farmacéutica domiciliaria basado en el Modelo CMO, con criterios de priorización propios del farmacéutico, para ordenar el ingreso de los pacientes al seguimiento.</w:t>
+        <w:t>Ampliar el espacio físico de la farmacia y de la bodega, aumentar el número de ventanillas de atención y habilitar un área de espera más cómoda, de modo de responder al crecimiento sostenido de la población inscrita.</w:t>
+      </w:r>
+    </w:p>
+    <w:p>
+      <w:pPr>
+        <w:pStyle w:val="ListNumber"/>
+        <w:spacing w:line="360" w:lineRule="auto"/>
+      </w:pPr>
+      <w:r>
+        <w:rPr>
+          <w:rFonts w:ascii="Arial" w:hAnsi="Arial"/>
+          <w:sz w:val="24"/>
+        </w:rPr>
+        <w:t>Incorporar de manera formal el protocolo de Atención Farmacéutica domiciliaria basado en el Modelo CMO, con criterios de priorización propios del farmacéutico, como aporte original surgido del seminario de título.</w:t>
       </w:r>
     </w:p>
     <w:p>
@@ -4587,15 +4720,23 @@
           <w:rFonts w:ascii="Arial" w:hAnsi="Arial"/>
           <w:sz w:val="24"/>
         </w:rPr>
-        <w:t>Aprovechar la continuidad telefónica y las instancias educativas grupales para mantener el vínculo con los pacientes entre una visita y otra.</w:t>
+        <w:t>Mantener y difundir las buenas prácticas de trazabilidad y orden observadas en Villa Nonguén, que pueden servir de referencia para otros centros de la red.</w:t>
       </w:r>
     </w:p>
     <w:p>
       <w:pPr>
+        <w:pStyle w:val="Heading1"/>
+      </w:pPr>
+      <w:r>
+        <w:t>4. CONCLUSIONES</w:t>
+      </w:r>
+    </w:p>
+    <w:p>
+      <w:pPr>
         <w:pStyle w:val="Heading2"/>
       </w:pPr>
       <w:r>
-        <w:t>3.4 Conclusiones</w:t>
+        <w:t>4.1 Conclusiones generales</w:t>
       </w:r>
     </w:p>
     <w:p>
@@ -4621,7 +4762,7 @@
           <w:rFonts w:ascii="Arial" w:hAnsi="Arial"/>
           <w:sz w:val="24"/>
         </w:rPr>
-        <w:t>Se reconocieron la estructura y los procesos de la unidad de farmacia, y se participó en las tareas de recepción, almacenamiento, gestión de stock, fraccionamiento, reenvasado y dispensación, resguardando la trazabilidad y el uso eficiente de los recursos.</w:t>
+        <w:t>Se reconocieron la estructura y los procesos de la unidad de farmacia, y se participó en las tareas de recepción, almacenamiento, gestión de stock, fraccionamiento, reenvasado, despacho y eliminación de medicamentos vencidos, resguardando la trazabilidad y el uso eficiente de los recursos.</w:t>
       </w:r>
     </w:p>
     <w:p>
@@ -4634,7 +4775,7 @@
           <w:rFonts w:ascii="Arial" w:hAnsi="Arial"/>
           <w:sz w:val="24"/>
         </w:rPr>
-        <w:t>Se ejecutaron actividades de Atención Farmacéutica, visitas domiciliarias y promoción del uso racional de los medicamentos, lo que evidenció el aporte clínico y comunitario del farmacéutico en este nivel de atención.</w:t>
+        <w:t>Se ejecutó Atención Farmacéutica de forma sostenida, con más de una actividad por semana durante toda la rotación, además de visitas domiciliarias y la promoción del uso racional de los medicamentos, lo que evidenció el aporte clínico y comunitario del farmacéutico en este nivel de atención.</w:t>
       </w:r>
     </w:p>
     <w:p>
@@ -4660,7 +4801,29 @@
           <w:rFonts w:ascii="Arial" w:hAnsi="Arial"/>
           <w:sz w:val="24"/>
         </w:rPr>
-        <w:t>La experiencia confirmó la relevancia de la Atención Primaria como puerta de entrada al sistema de salud y el valor de un ejercicio profesional basado en la evidencia, la seguridad del paciente y el trabajo en equipo.</w:t>
+        <w:t>La comparación con el CESFAM Hualpencillo mostró que la limitación de espacio es un desafío compartido de la Atención Primaria, y confirmó como fortaleza distintiva de Villa Nonguén el orden y la trazabilidad en el manejo del medicamento.</w:t>
+      </w:r>
+    </w:p>
+    <w:p>
+      <w:pPr>
+        <w:pStyle w:val="Heading2"/>
+      </w:pPr>
+      <w:r>
+        <w:t>4.2 Proyecciones y futuras líneas de trabajo</w:t>
+      </w:r>
+    </w:p>
+    <w:p>
+      <w:pPr>
+        <w:jc w:val="both"/>
+      </w:pPr>
+      <w:r>
+        <w:rPr>
+          <w:rFonts w:ascii="Arial" w:hAnsi="Arial"/>
+          <w:b w:val="0"/>
+          <w:i w:val="0"/>
+          <w:sz w:val="24"/>
+        </w:rPr>
+        <w:t>De cara al futuro, la principal proyección es implementar y evaluar en el propio centro el protocolo de Atención Farmacéutica domiciliaria diseñado como seminario de título, midiendo su efecto sobre la adherencia y sobre el control de los pacientes del Programa de Salud Cardiovascular, para luego extenderlo a otros programas y a usuarios con polifarmacia. En paralelo, sería valioso gestionar la ampliación de la infraestructura de la farmacia y de la bodega, y avanzar hacia un registro estandarizado de la Atención Farmacéutica que consolide la trazabilidad que ya caracteriza al centro. Estas líneas permitirían proyectar el aporte del Químico Farmacéutico más allá del periodo de internado y fortalecer la calidad de la atención que recibe la comunidad.</w:t>
       </w:r>
     </w:p>
     <w:p>
@@ -4963,6 +5126,34 @@
           <w:sz w:val="24"/>
         </w:rPr>
         <w:t>Morisky, D. E., Green, L. W., &amp; Levine, D. M. (1986). Concurrent and predictive validity of a self-reported measure of medication adherence. Medical Care, 24(1), 67-74.</w:t>
+      </w:r>
+    </w:p>
+    <w:p>
+      <w:pPr>
+        <w:spacing w:line="360" w:lineRule="auto" w:after="160"/>
+        <w:ind w:left="567" w:hanging="567"/>
+        <w:jc w:val="both"/>
+      </w:pPr>
+      <w:r>
+        <w:rPr>
+          <w:rFonts w:ascii="Arial" w:hAnsi="Arial"/>
+          <w:sz w:val="24"/>
+        </w:rPr>
+        <w:t>Organización Mundial de la Salud. (2021). Atención Primaria de Salud. OMS. https://www.who.int/es/health-topics/primary-health-care</w:t>
+      </w:r>
+    </w:p>
+    <w:p>
+      <w:pPr>
+        <w:spacing w:line="360" w:lineRule="auto" w:after="160"/>
+        <w:ind w:left="567" w:hanging="567"/>
+        <w:jc w:val="both"/>
+      </w:pPr>
+      <w:r>
+        <w:rPr>
+          <w:rFonts w:ascii="Arial" w:hAnsi="Arial"/>
+          <w:sz w:val="24"/>
+        </w:rPr>
+        <w:t>Organización Panamericana de la Salud. (2024). Servicios farmacéuticos basados en la Atención Primaria de Salud. OPS.</w:t>
       </w:r>
     </w:p>
     <w:p>

</xml_diff>

<commit_message>
Corrige formato segun analisis del instructivo y tesis: logo solo en portada, TOC empieza en Introduccion (titulos preliminares fuera de TOC, niveles 1-2), numeracion romana desde i, texto en negro, elimina Resumen, enriquece descripcion del lugar y anexos (protocolos), FEFO en almacenamiento
</commit_message>
<xml_diff>
--- a/Informe de Internado - Farmacia Asistencial y APS - CESFAM Villa Nonguen.docx
+++ b/Informe de Internado - Farmacia Asistencial y APS - CESFAM Villa Nonguen.docx
@@ -177,7 +177,7 @@
         <w:sectPr>
           <w:headerReference w:type="first" r:id="rId9"/>
           <w:headerReference w:type="default" r:id="rId10"/>
-          <w:footerReference w:type="default" r:id="rId11"/>
+          <w:footerReference w:type="default" r:id="rId13"/>
           <w:pgSz w:w="12240" w:h="15840"/>
           <w:pgMar w:top="1417" w:right="1417" w:bottom="1417" w:left="2268" w:header="709" w:footer="720" w:gutter="0"/>
           <w:cols w:space="720"/>
@@ -188,9 +188,14 @@
     </w:p>
     <w:p>
       <w:pPr>
-        <w:pStyle w:val="Heading1"/>
+        <w:pStyle w:val="TituloPrelim"/>
       </w:pPr>
       <w:r>
+        <w:rPr>
+          <w:rFonts w:ascii="Arial" w:hAnsi="Arial"/>
+          <w:b/>
+          <w:sz w:val="24"/>
+        </w:rPr>
         <w:t>TABLA DE CONTENIDOS</w:t>
       </w:r>
     </w:p>
@@ -199,7 +204,7 @@
         <w:fldChar w:fldCharType="begin"/>
       </w:r>
       <w:r>
-        <w:instrText xml:space="preserve"> TOC \o "1-3" \h \z \u </w:instrText>
+        <w:instrText xml:space="preserve"> TOC \o "1-2" \h \z \u </w:instrText>
       </w:r>
       <w:r>
         <w:fldChar w:fldCharType="separate"/>
@@ -218,9 +223,14 @@
     </w:p>
     <w:p>
       <w:pPr>
-        <w:pStyle w:val="Heading1"/>
+        <w:pStyle w:val="TituloPrelim"/>
       </w:pPr>
       <w:r>
+        <w:rPr>
+          <w:rFonts w:ascii="Arial" w:hAnsi="Arial"/>
+          <w:b/>
+          <w:sz w:val="24"/>
+        </w:rPr>
         <w:t>ÍNDICE DE TABLAS</w:t>
       </w:r>
     </w:p>
@@ -243,9 +253,14 @@
     </w:p>
     <w:p>
       <w:pPr>
-        <w:pStyle w:val="Heading1"/>
+        <w:pStyle w:val="TituloPrelim"/>
       </w:pPr>
       <w:r>
+        <w:rPr>
+          <w:rFonts w:ascii="Arial" w:hAnsi="Arial"/>
+          <w:b/>
+          <w:sz w:val="24"/>
+        </w:rPr>
         <w:t>ÍNDICE DE FIGURAS</w:t>
       </w:r>
     </w:p>
@@ -273,9 +288,14 @@
     </w:p>
     <w:p>
       <w:pPr>
-        <w:pStyle w:val="Heading1"/>
+        <w:pStyle w:val="TituloPrelim"/>
       </w:pPr>
       <w:r>
+        <w:rPr>
+          <w:rFonts w:ascii="Arial" w:hAnsi="Arial"/>
+          <w:b/>
+          <w:sz w:val="24"/>
+        </w:rPr>
         <w:t>ABREVIATURAS</w:t>
       </w:r>
     </w:p>
@@ -640,61 +660,14 @@
       </w:r>
     </w:p>
     <w:p>
-      <w:r>
-        <w:br w:type="page"/>
-      </w:r>
-    </w:p>
-    <w:p>
-      <w:pPr>
-        <w:pStyle w:val="Heading1"/>
-      </w:pPr>
-      <w:r>
-        <w:t>RESUMEN</w:t>
-      </w:r>
-    </w:p>
-    <w:p>
-      <w:pPr>
-        <w:jc w:val="both"/>
-      </w:pPr>
-      <w:r>
-        <w:rPr>
-          <w:rFonts w:ascii="Arial" w:hAnsi="Arial"/>
-          <w:b w:val="0"/>
-          <w:i w:val="0"/>
-          <w:sz w:val="24"/>
-        </w:rPr>
-        <w:t>El presente informe da cuenta del Internado en Farmacia Asistencial y Atención Primaria de Salud realizado en la unidad de farmacia del CESFAM Villa Nonguén, entre el 11 de mayo y el 10 de julio de 2026. Durante nueve semanas el interno se integró al equipo de farmacia y participó en los procesos de recepción, almacenamiento, gestión de stock, fraccionamiento, reenvasado y dispensación de medicamentos, además de actividades de Atención Farmacéutica, visitas domiciliarias y educación sanitaria orientadas al uso racional de los medicamentos. En paralelo se desarrolló el seminario de título, consistente en el diseño de un protocolo de Atención Farmacéutica domiciliaria basado en el Modelo CMO para los pacientes del Programa de Salud Cardiovascular del centro. El informe describe el establecimiento y su unidad de farmacia, detalla las actividades realizadas mediante una carta Gantt y su descripción, presenta el desarrollo del seminario de título y discute el cumplimiento de los objetivos a la luz de la evidencia, junto con las fortalezas, debilidades y propuestas de mejora identificadas durante la experiencia.</w:t>
-      </w:r>
-    </w:p>
-    <w:p>
-      <w:pPr>
-        <w:spacing w:line="360" w:lineRule="auto"/>
-        <w:jc w:val="both"/>
-      </w:pPr>
-      <w:r>
-        <w:rPr>
-          <w:rFonts w:ascii="Arial" w:hAnsi="Arial"/>
-          <w:b/>
-          <w:sz w:val="24"/>
-        </w:rPr>
-        <w:t xml:space="preserve">Palabras clave: </w:t>
-      </w:r>
-      <w:r>
-        <w:rPr>
-          <w:rFonts w:ascii="Arial" w:hAnsi="Arial"/>
-          <w:sz w:val="24"/>
-        </w:rPr>
-        <w:t>Atención Farmacéutica; Atención Primaria de Salud; Modelo CMO; adherencia; uso racional de medicamentos.</w:t>
-      </w:r>
-    </w:p>
-    <w:p>
       <w:pPr>
         <w:sectPr>
-          <w:footerReference w:type="default" r:id="rId12"/>
+          <w:headerReference w:type="default" r:id="rId11"/>
+          <w:headerReference w:type="first" r:id="rId12"/>
+          <w:footerReference w:type="default" r:id="rId14"/>
           <w:pgSz w:w="12240" w:h="15840"/>
           <w:pgMar w:top="1417" w:right="1417" w:bottom="1417" w:left="2268" w:header="709" w:footer="720" w:gutter="0"/>
           <w:cols w:space="720"/>
-          <w:titlePg/>
           <w:docGrid w:linePitch="360"/>
           <w:pgNumType w:fmt="lowerRoman" w:start="1"/>
         </w:sectPr>
@@ -1803,6 +1776,20 @@
     </w:p>
     <w:p>
       <w:pPr>
+        <w:jc w:val="both"/>
+      </w:pPr>
+      <w:r>
+        <w:rPr>
+          <w:rFonts w:ascii="Arial" w:hAnsi="Arial"/>
+          <w:b w:val="0"/>
+          <w:i w:val="0"/>
+          <w:sz w:val="24"/>
+        </w:rPr>
+        <w:t>Dentro de la población inscrita se reconocen grupos específicos que reflejan la diversidad de la comunidad, como 123 personas pertenecientes a pueblos originarios y 257 usuarios migrantes internacionales, lo que orienta una atención con enfoque intercultural e inclusivo. El nombre del sector proviene del mapudungun y significa agua que corre, en referencia a la relación histórica del territorio con su entorno natural. En cuanto a su desarrollo institucional, el centro ha consolidado la certificación del Modelo de Salud Familiar, que pasó de un 53,6% en 2015 a un 88,14% en 2018, y ha rendido procesos de acreditación en 2017 y 2025, lo que da cuenta de un trabajo sostenido por la calidad de la atención.</w:t>
+      </w:r>
+    </w:p>
+    <w:p>
+      <w:pPr>
         <w:pStyle w:val="Heading2"/>
       </w:pPr>
       <w:r>
@@ -1844,7 +1831,7 @@
                     <pic:cNvPicPr/>
                   </pic:nvPicPr>
                   <pic:blipFill>
-                    <a:blip r:embed="rId14"/>
+                    <a:blip r:embed="rId18"/>
                     <a:stretch>
                       <a:fillRect/>
                     </a:stretch>
@@ -2469,7 +2456,7 @@
         <w:rPr>
           <w:rFonts w:ascii="Arial" w:hAnsi="Arial"/>
           <w:i/>
-          <w:color w:val="1F3B5C"/>
+          <w:color w:val="000000"/>
           <w:sz w:val="22"/>
         </w:rPr>
         <w:t>[ Espacio reservado para insertar aquí la Carta Gantt ]</w:t>
@@ -2484,7 +2471,7 @@
         <w:rPr>
           <w:rFonts w:ascii="Arial" w:hAnsi="Arial"/>
           <w:i/>
-          <w:color w:val="1F3B5C"/>
+          <w:color w:val="000000"/>
           <w:sz w:val="20"/>
         </w:rPr>
         <w:t>Archivo fig_gantt_planificada.png (alta resolución) o fig_gantt_planificada.pdf (vectorial)</w:t>
@@ -2553,7 +2540,7 @@
         <w:rPr>
           <w:rFonts w:ascii="Arial" w:hAnsi="Arial"/>
           <w:i/>
-          <w:color w:val="1F3B5C"/>
+          <w:color w:val="000000"/>
           <w:sz w:val="22"/>
         </w:rPr>
         <w:t>[ Espacio reservado para insertar aquí la Carta Gantt ]</w:t>
@@ -2568,7 +2555,7 @@
         <w:rPr>
           <w:rFonts w:ascii="Arial" w:hAnsi="Arial"/>
           <w:i/>
-          <w:color w:val="1F3B5C"/>
+          <w:color w:val="000000"/>
           <w:sz w:val="20"/>
         </w:rPr>
         <w:t>Archivo fig_gantt_desarrollada.png (alta resolución) o fig_gantt_desarrollada.pdf (vectorial)</w:t>
@@ -3889,7 +3876,7 @@
           <w:i w:val="0"/>
           <w:sz w:val="24"/>
         </w:rPr>
-        <w:t>Se participó en la recepción y el almacenamiento de los medicamentos que llegan a la unidad, que se adquieren principalmente a través de la Central de Abastecimiento (CENABAST) y que se ordenan resguardando las condiciones de conservación. Se colaboró en la gestión del stock, con especial atención al control de los medicamentos próximos a vencer, que se marcaban y se controlaban para evitar pérdidas. Cuando un medicamento estaba por vencer y no alcanzaba a utilizarse, se gestionaban préstamos o canjes con otros centros de la red, y las existencias que no se podían aprovechar se reportaban y se redistribuían hacia otros CESFAM, de manera de dar un uso eficiente a los recursos y reducir las mermas. Se conoció además el proceso de programación anual de las necesidades de medicamentos, que se planifica según la demanda y las metas del establecimiento. Esta actividad responde al segundo objetivo específico.</w:t>
+        <w:t>Se participó en la recepción y el almacenamiento de los medicamentos que llegan a la unidad, que se adquieren principalmente a través de la Central de Abastecimiento (CENABAST) y que se ordenan resguardando las condiciones de conservación de temperatura y humedad, y aplicando el criterio FEFO, es decir, lo primero que vence es lo primero que sale, para asegurar la rotación de las existencias. Se colaboró en la gestión del stock, con especial atención al control de los medicamentos próximos a vencer, que se marcaban y se controlaban para evitar pérdidas. Cuando un medicamento estaba por vencer y no alcanzaba a utilizarse, se gestionaban préstamos o canjes con otros centros de la red, y las existencias que no se podían aprovechar se reportaban y se redistribuían hacia otros CESFAM, de manera de dar un uso eficiente a los recursos y reducir las mermas. Se conoció además el proceso de programación anual de las necesidades de medicamentos, que se planifica según la demanda y las metas del establecimiento. Esta actividad responde al segundo objetivo específico.</w:t>
       </w:r>
     </w:p>
     <w:p>
@@ -5911,12 +5898,126 @@
         <w:t>Protocolo de llamada telefónica: guion breve para contactar y agendar al paciente antes de la visita domiciliaria.</w:t>
       </w:r>
     </w:p>
+    <w:p>
+      <w:pPr>
+        <w:pStyle w:val="Heading2"/>
+      </w:pPr>
+      <w:r>
+        <w:t>Anexo 4. Protocolos de la unidad de farmacia consultados</w:t>
+      </w:r>
+    </w:p>
+    <w:p>
+      <w:pPr>
+        <w:jc w:val="both"/>
+      </w:pPr>
+      <w:r>
+        <w:rPr>
+          <w:rFonts w:ascii="Arial" w:hAnsi="Arial"/>
+          <w:b w:val="0"/>
+          <w:i w:val="0"/>
+          <w:sz w:val="24"/>
+        </w:rPr>
+        <w:t>Durante el internado se revisaron y aplicaron los procedimientos internos de la unidad de farmacia del CESFAM Villa Nonguén, que sirvieron de base para las actividades descritas en este informe.</w:t>
+      </w:r>
+    </w:p>
+    <w:p>
+      <w:pPr>
+        <w:pStyle w:val="ListBullet"/>
+        <w:spacing w:line="360" w:lineRule="auto"/>
+      </w:pPr>
+      <w:r>
+        <w:rPr>
+          <w:rFonts w:ascii="Arial" w:hAnsi="Arial"/>
+          <w:sz w:val="24"/>
+        </w:rPr>
+        <w:t>APF 1.2.1 Comité de Farmacia.</w:t>
+      </w:r>
+    </w:p>
+    <w:p>
+      <w:pPr>
+        <w:pStyle w:val="ListBullet"/>
+        <w:spacing w:line="360" w:lineRule="auto"/>
+      </w:pPr>
+      <w:r>
+        <w:rPr>
+          <w:rFonts w:ascii="Arial" w:hAnsi="Arial"/>
+          <w:sz w:val="24"/>
+        </w:rPr>
+        <w:t>APF 1.3.1 Rotulación de medicamentos.</w:t>
+      </w:r>
+    </w:p>
+    <w:p>
+      <w:pPr>
+        <w:pStyle w:val="ListBullet"/>
+        <w:spacing w:line="360" w:lineRule="auto"/>
+      </w:pPr>
+      <w:r>
+        <w:rPr>
+          <w:rFonts w:ascii="Arial" w:hAnsi="Arial"/>
+          <w:sz w:val="24"/>
+        </w:rPr>
+        <w:t>APF 1.3.2 Envasado de medicamentos e insumos de farmacia.</w:t>
+      </w:r>
+    </w:p>
+    <w:p>
+      <w:pPr>
+        <w:pStyle w:val="ListBullet"/>
+        <w:spacing w:line="360" w:lineRule="auto"/>
+      </w:pPr>
+      <w:r>
+        <w:rPr>
+          <w:rFonts w:ascii="Arial" w:hAnsi="Arial"/>
+          <w:sz w:val="24"/>
+        </w:rPr>
+        <w:t>APF 1.3.3.1 Despacho de medicamentos.</w:t>
+      </w:r>
+    </w:p>
+    <w:p>
+      <w:pPr>
+        <w:pStyle w:val="ListBullet"/>
+        <w:spacing w:line="360" w:lineRule="auto"/>
+      </w:pPr>
+      <w:r>
+        <w:rPr>
+          <w:rFonts w:ascii="Arial" w:hAnsi="Arial"/>
+          <w:sz w:val="24"/>
+        </w:rPr>
+        <w:t>APF 1.4.1 Almacenamiento y conservación de medicamentos.</w:t>
+      </w:r>
+    </w:p>
+    <w:p>
+      <w:pPr>
+        <w:pStyle w:val="ListBullet"/>
+        <w:spacing w:line="360" w:lineRule="auto"/>
+      </w:pPr>
+      <w:r>
+        <w:rPr>
+          <w:rFonts w:ascii="Arial" w:hAnsi="Arial"/>
+          <w:sz w:val="24"/>
+        </w:rPr>
+        <w:t>APF 13 Eliminación de medicamentos expirados, en mal estado o sin rotulación adecuada.</w:t>
+      </w:r>
+    </w:p>
+    <w:p>
+      <w:pPr>
+        <w:pStyle w:val="ListBullet"/>
+        <w:spacing w:line="360" w:lineRule="auto"/>
+      </w:pPr>
+      <w:r>
+        <w:rPr>
+          <w:rFonts w:ascii="Arial" w:hAnsi="Arial"/>
+          <w:sz w:val="24"/>
+        </w:rPr>
+        <w:t>APF 22 Manejo de psicotrópicos y estupefacientes.</w:t>
+      </w:r>
+    </w:p>
     <w:sectPr>
-      <w:footerReference w:type="default" r:id="rId13"/>
+      <w:headerReference w:type="default" r:id="rId15"/>
+      <w:headerReference w:type="first" r:id="rId16"/>
+      <w:footerReference w:type="default" r:id="rId17"/>
       <w:pgSz w:w="12240" w:h="15840"/>
       <w:pgMar w:top="1417" w:right="1417" w:bottom="1417" w:left="2268" w:header="709" w:footer="720" w:gutter="0"/>
       <w:cols w:space="720"/>
-      <w:titlePg/>
       <w:docGrid w:linePitch="360"/>
       <w:pgNumType w:fmt="decimal" w:start="1"/>
     </w:sectPr>
@@ -6073,6 +6174,50 @@
 </file>
 
 <file path=word/header2.xml><?xml version="1.0" encoding="utf-8"?>
+<w:hdr xmlns:m="http://schemas.openxmlformats.org/officeDocument/2006/math" xmlns:mc="http://schemas.openxmlformats.org/markup-compatibility/2006" xmlns:mo="http://schemas.microsoft.com/office/mac/office/2008/main" xmlns:mv="urn:schemas-microsoft-com:mac:vml" xmlns:o="urn:schemas-microsoft-com:office:office" xmlns:r="http://schemas.openxmlformats.org/officeDocument/2006/relationships" xmlns:v="urn:schemas-microsoft-com:vml" xmlns:w10="urn:schemas-microsoft-com:office:word" xmlns:w14="http://schemas.microsoft.com/office/word/2010/wordml" xmlns:w="http://schemas.openxmlformats.org/wordprocessingml/2006/main" xmlns:wne="http://schemas.microsoft.com/office/word/2006/wordml" xmlns:wp14="http://schemas.microsoft.com/office/word/2010/wordprocessingDrawing" xmlns:wp="http://schemas.openxmlformats.org/drawingml/2006/wordprocessingDrawing" xmlns:wpc="http://schemas.microsoft.com/office/word/2010/wordprocessingCanvas" xmlns:wpg="http://schemas.microsoft.com/office/word/2010/wordprocessingGroup" xmlns:wpi="http://schemas.microsoft.com/office/word/2010/wordprocessingInk" xmlns:wps="http://schemas.microsoft.com/office/word/2010/wordprocessingShape" mc:Ignorable="w14 wp14">
+  <w:p>
+    <w:pPr>
+      <w:pStyle w:val="Header"/>
+    </w:pPr>
+    <w:r/>
+  </w:p>
+</w:hdr>
+</file>
+
+<file path=word/header3.xml><?xml version="1.0" encoding="utf-8"?>
+<w:hdr xmlns:m="http://schemas.openxmlformats.org/officeDocument/2006/math" xmlns:mc="http://schemas.openxmlformats.org/markup-compatibility/2006" xmlns:mo="http://schemas.microsoft.com/office/mac/office/2008/main" xmlns:mv="urn:schemas-microsoft-com:mac:vml" xmlns:o="urn:schemas-microsoft-com:office:office" xmlns:r="http://schemas.openxmlformats.org/officeDocument/2006/relationships" xmlns:v="urn:schemas-microsoft-com:vml" xmlns:w10="urn:schemas-microsoft-com:office:word" xmlns:w14="http://schemas.microsoft.com/office/word/2010/wordml" xmlns:w="http://schemas.openxmlformats.org/wordprocessingml/2006/main" xmlns:wne="http://schemas.microsoft.com/office/word/2006/wordml" xmlns:wp14="http://schemas.microsoft.com/office/word/2010/wordprocessingDrawing" xmlns:wp="http://schemas.openxmlformats.org/drawingml/2006/wordprocessingDrawing" xmlns:wpc="http://schemas.microsoft.com/office/word/2010/wordprocessingCanvas" xmlns:wpg="http://schemas.microsoft.com/office/word/2010/wordprocessingGroup" xmlns:wpi="http://schemas.microsoft.com/office/word/2010/wordprocessingInk" xmlns:wps="http://schemas.microsoft.com/office/word/2010/wordprocessingShape" mc:Ignorable="w14 wp14">
+  <w:p>
+    <w:pPr>
+      <w:pStyle w:val="Header"/>
+    </w:pPr>
+    <w:r/>
+  </w:p>
+</w:hdr>
+</file>
+
+<file path=word/header4.xml><?xml version="1.0" encoding="utf-8"?>
+<w:hdr xmlns:m="http://schemas.openxmlformats.org/officeDocument/2006/math" xmlns:mc="http://schemas.openxmlformats.org/markup-compatibility/2006" xmlns:mo="http://schemas.microsoft.com/office/mac/office/2008/main" xmlns:mv="urn:schemas-microsoft-com:mac:vml" xmlns:o="urn:schemas-microsoft-com:office:office" xmlns:r="http://schemas.openxmlformats.org/officeDocument/2006/relationships" xmlns:v="urn:schemas-microsoft-com:vml" xmlns:w10="urn:schemas-microsoft-com:office:word" xmlns:w14="http://schemas.microsoft.com/office/word/2010/wordml" xmlns:w="http://schemas.openxmlformats.org/wordprocessingml/2006/main" xmlns:wne="http://schemas.microsoft.com/office/word/2006/wordml" xmlns:wp14="http://schemas.microsoft.com/office/word/2010/wordprocessingDrawing" xmlns:wp="http://schemas.openxmlformats.org/drawingml/2006/wordprocessingDrawing" xmlns:wpc="http://schemas.microsoft.com/office/word/2010/wordprocessingCanvas" xmlns:wpg="http://schemas.microsoft.com/office/word/2010/wordprocessingGroup" xmlns:wpi="http://schemas.microsoft.com/office/word/2010/wordprocessingInk" xmlns:wps="http://schemas.microsoft.com/office/word/2010/wordprocessingShape" mc:Ignorable="w14 wp14">
+  <w:p>
+    <w:pPr>
+      <w:pStyle w:val="Header"/>
+    </w:pPr>
+    <w:r/>
+  </w:p>
+</w:hdr>
+</file>
+
+<file path=word/header5.xml><?xml version="1.0" encoding="utf-8"?>
+<w:hdr xmlns:m="http://schemas.openxmlformats.org/officeDocument/2006/math" xmlns:mc="http://schemas.openxmlformats.org/markup-compatibility/2006" xmlns:mo="http://schemas.microsoft.com/office/mac/office/2008/main" xmlns:mv="urn:schemas-microsoft-com:mac:vml" xmlns:o="urn:schemas-microsoft-com:office:office" xmlns:r="http://schemas.openxmlformats.org/officeDocument/2006/relationships" xmlns:v="urn:schemas-microsoft-com:vml" xmlns:w10="urn:schemas-microsoft-com:office:word" xmlns:w14="http://schemas.microsoft.com/office/word/2010/wordml" xmlns:w="http://schemas.openxmlformats.org/wordprocessingml/2006/main" xmlns:wne="http://schemas.microsoft.com/office/word/2006/wordml" xmlns:wp14="http://schemas.microsoft.com/office/word/2010/wordprocessingDrawing" xmlns:wp="http://schemas.openxmlformats.org/drawingml/2006/wordprocessingDrawing" xmlns:wpc="http://schemas.microsoft.com/office/word/2010/wordprocessingCanvas" xmlns:wpg="http://schemas.microsoft.com/office/word/2010/wordprocessingGroup" xmlns:wpi="http://schemas.microsoft.com/office/word/2010/wordprocessingInk" xmlns:wps="http://schemas.microsoft.com/office/word/2010/wordprocessingShape" mc:Ignorable="w14 wp14">
+  <w:p>
+    <w:pPr>
+      <w:pStyle w:val="Header"/>
+    </w:pPr>
+    <w:r/>
+  </w:p>
+</w:hdr>
+</file>
+
+<file path=word/header6.xml><?xml version="1.0" encoding="utf-8"?>
 <w:hdr xmlns:m="http://schemas.openxmlformats.org/officeDocument/2006/math" xmlns:mc="http://schemas.openxmlformats.org/markup-compatibility/2006" xmlns:mo="http://schemas.microsoft.com/office/mac/office/2008/main" xmlns:mv="urn:schemas-microsoft-com:mac:vml" xmlns:o="urn:schemas-microsoft-com:office:office" xmlns:r="http://schemas.openxmlformats.org/officeDocument/2006/relationships" xmlns:v="urn:schemas-microsoft-com:vml" xmlns:w10="urn:schemas-microsoft-com:office:word" xmlns:w14="http://schemas.microsoft.com/office/word/2010/wordml" xmlns:w="http://schemas.openxmlformats.org/wordprocessingml/2006/main" xmlns:wne="http://schemas.microsoft.com/office/word/2006/wordml" xmlns:wp14="http://schemas.microsoft.com/office/word/2010/wordprocessingDrawing" xmlns:wp="http://schemas.openxmlformats.org/drawingml/2006/wordprocessingDrawing" xmlns:wpc="http://schemas.microsoft.com/office/word/2010/wordprocessingCanvas" xmlns:wpg="http://schemas.microsoft.com/office/word/2010/wordprocessingGroup" xmlns:wpi="http://schemas.microsoft.com/office/word/2010/wordprocessingInk" xmlns:wps="http://schemas.microsoft.com/office/word/2010/wordprocessingShape" mc:Ignorable="w14 wp14">
   <w:p>
     <w:pPr>
@@ -6518,7 +6663,7 @@
       <w:rFonts w:asciiTheme="majorHAnsi" w:eastAsiaTheme="majorEastAsia" w:hAnsiTheme="majorHAnsi" w:cstheme="majorBidi" w:ascii="Arial" w:hAnsi="Arial" w:eastAsia="Arial"/>
       <w:b/>
       <w:bCs/>
-      <w:color w:val="1F3B5C"/>
+      <w:color w:val="000000"/>
       <w:sz w:val="24"/>
       <w:szCs w:val="28"/>
     </w:rPr>
@@ -6543,7 +6688,7 @@
       <w:rFonts w:asciiTheme="majorHAnsi" w:eastAsiaTheme="majorEastAsia" w:hAnsiTheme="majorHAnsi" w:cstheme="majorBidi" w:ascii="Arial" w:hAnsi="Arial" w:eastAsia="Arial"/>
       <w:b/>
       <w:bCs/>
-      <w:color w:val="1F3B5C"/>
+      <w:color w:val="000000"/>
       <w:sz w:val="24"/>
       <w:szCs w:val="26"/>
     </w:rPr>
@@ -6568,7 +6713,7 @@
       <w:rFonts w:asciiTheme="majorHAnsi" w:eastAsiaTheme="majorEastAsia" w:hAnsiTheme="majorHAnsi" w:cstheme="majorBidi" w:ascii="Arial" w:hAnsi="Arial" w:eastAsia="Arial"/>
       <w:b/>
       <w:bCs/>
-      <w:color w:val="1F3B5C"/>
+      <w:color w:val="000000"/>
       <w:sz w:val="24"/>
     </w:rPr>
   </w:style>
@@ -18143,6 +18288,21 @@
         <w:shd w:val="clear" w:color="auto" w:fill="FBCAA2" w:themeFill="accent6" w:themeFillTint="7F"/>
       </w:tcPr>
     </w:tblStylePr>
+  </w:style>
+  <w:style w:type="paragraph" w:customStyle="1" w:styleId="TituloPrelim">
+    <w:name w:val="TituloPrelim"/>
+    <w:basedOn w:val="Normal"/>
+    <w:pPr>
+      <w:keepNext/>
+      <w:spacing w:before="240" w:after="240"/>
+      <w:jc w:val="center"/>
+    </w:pPr>
+    <w:rPr>
+      <w:rFonts w:ascii="Arial" w:hAnsi="Arial" w:eastAsia="Arial"/>
+      <w:b/>
+      <w:color w:val="000000"/>
+      <w:sz w:val="24"/>
+    </w:rPr>
   </w:style>
 </w:styles>
 </file>

</xml_diff>

<commit_message>
Corrige numeracion de tablas (1-6) y figuras (1-3), listas numeradas reinician en 1, fuente Arial en todo el documento; corrige vildagliptina/glibenclamida; entrega 3 disenos de carta Gantt con color por actividad
</commit_message>
<xml_diff>
--- a/Informe de Internado - Farmacia Asistencial y APS - CESFAM Villa Nonguen.docx
+++ b/Informe de Internado - Farmacia Asistencial y APS - CESFAM Villa Nonguen.docx
@@ -1108,7 +1108,7 @@
         <w:fldChar w:fldCharType="separate"/>
       </w:r>
       <w:r>
-        <w:t>1</w:t>
+        <w:t>2</w:t>
       </w:r>
       <w:r>
         <w:fldChar w:fldCharType="end"/>
@@ -2150,54 +2150,58 @@
     </w:p>
     <w:p>
       <w:pPr>
-        <w:pStyle w:val="ListNumber"/>
-        <w:spacing w:line="360" w:lineRule="auto"/>
+        <w:spacing w:line="360" w:lineRule="auto" w:after="80"/>
+        <w:ind w:left="567" w:hanging="340"/>
+        <w:jc w:val="both"/>
       </w:pPr>
       <w:r>
         <w:rPr>
           <w:rFonts w:ascii="Arial" w:hAnsi="Arial"/>
           <w:sz w:val="24"/>
         </w:rPr>
-        <w:t>Reconocer la estructura organizacional y las funciones del equipo de la unidad de farmacia del CESFAM Villa Nonguén.</w:t>
+        <w:t>1. Reconocer la estructura organizacional y las funciones del equipo de la unidad de farmacia del CESFAM Villa Nonguén.</w:t>
       </w:r>
     </w:p>
     <w:p>
       <w:pPr>
-        <w:pStyle w:val="ListNumber"/>
-        <w:spacing w:line="360" w:lineRule="auto"/>
+        <w:spacing w:line="360" w:lineRule="auto" w:after="80"/>
+        <w:ind w:left="567" w:hanging="340"/>
+        <w:jc w:val="both"/>
       </w:pPr>
       <w:r>
         <w:rPr>
           <w:rFonts w:ascii="Arial" w:hAnsi="Arial"/>
           <w:sz w:val="24"/>
         </w:rPr>
-        <w:t>Participar en los procesos técnicos de recepción, almacenamiento, fraccionamiento, reenvasado y dispensación de medicamentos de la unidad de farmacia.</w:t>
+        <w:t>2. Participar en los procesos técnicos de recepción, almacenamiento, fraccionamiento, reenvasado y dispensación de medicamentos de la unidad de farmacia.</w:t>
       </w:r>
     </w:p>
     <w:p>
       <w:pPr>
-        <w:pStyle w:val="ListNumber"/>
-        <w:spacing w:line="360" w:lineRule="auto"/>
+        <w:spacing w:line="360" w:lineRule="auto" w:after="80"/>
+        <w:ind w:left="567" w:hanging="340"/>
+        <w:jc w:val="both"/>
       </w:pPr>
       <w:r>
         <w:rPr>
           <w:rFonts w:ascii="Arial" w:hAnsi="Arial"/>
           <w:sz w:val="24"/>
         </w:rPr>
-        <w:t>Ejecutar actividades de Atención Farmacéutica, visitas domiciliarias y educación sanitaria orientadas al uso racional de los medicamentos.</w:t>
+        <w:t>3. Ejecutar actividades de Atención Farmacéutica, visitas domiciliarias y educación sanitaria orientadas al uso racional de los medicamentos.</w:t>
       </w:r>
     </w:p>
     <w:p>
       <w:pPr>
-        <w:pStyle w:val="ListNumber"/>
-        <w:spacing w:line="360" w:lineRule="auto"/>
+        <w:spacing w:line="360" w:lineRule="auto" w:after="80"/>
+        <w:ind w:left="567" w:hanging="340"/>
+        <w:jc w:val="both"/>
       </w:pPr>
       <w:r>
         <w:rPr>
           <w:rFonts w:ascii="Arial" w:hAnsi="Arial"/>
           <w:sz w:val="24"/>
         </w:rPr>
-        <w:t>Diseñar un protocolo de Atención Farmacéutica domiciliaria basado en el Modelo CMO para el Programa de Salud Cardiovascular del CESFAM Villa Nonguén.</w:t>
+        <w:t>4. Diseñar un protocolo de Atención Farmacéutica domiciliaria basado en el Modelo CMO para el Programa de Salud Cardiovascular del CESFAM Villa Nonguén.</w:t>
       </w:r>
     </w:p>
     <w:p>
@@ -2239,184 +2243,198 @@
     </w:p>
     <w:p>
       <w:pPr>
-        <w:pStyle w:val="ListNumber"/>
-        <w:spacing w:line="360" w:lineRule="auto"/>
+        <w:spacing w:line="360" w:lineRule="auto" w:after="80"/>
+        <w:ind w:left="567" w:hanging="340"/>
+        <w:jc w:val="both"/>
       </w:pPr>
       <w:r>
         <w:rPr>
           <w:rFonts w:ascii="Arial" w:hAnsi="Arial"/>
           <w:sz w:val="24"/>
         </w:rPr>
-        <w:t>Inducción y conocimiento del centro y de la unidad de farmacia.</w:t>
+        <w:t>1. Inducción y conocimiento del centro y de la unidad de farmacia.</w:t>
       </w:r>
     </w:p>
     <w:p>
       <w:pPr>
-        <w:pStyle w:val="ListNumber"/>
-        <w:spacing w:line="360" w:lineRule="auto"/>
+        <w:spacing w:line="360" w:lineRule="auto" w:after="80"/>
+        <w:ind w:left="567" w:hanging="340"/>
+        <w:jc w:val="both"/>
       </w:pPr>
       <w:r>
         <w:rPr>
           <w:rFonts w:ascii="Arial" w:hAnsi="Arial"/>
           <w:sz w:val="24"/>
         </w:rPr>
-        <w:t>Recepción, almacenamiento y gestión del stock de medicamentos.</w:t>
+        <w:t>2. Recepción, almacenamiento y gestión del stock de medicamentos.</w:t>
       </w:r>
     </w:p>
     <w:p>
       <w:pPr>
-        <w:pStyle w:val="ListNumber"/>
-        <w:spacing w:line="360" w:lineRule="auto"/>
+        <w:spacing w:line="360" w:lineRule="auto" w:after="80"/>
+        <w:ind w:left="567" w:hanging="340"/>
+        <w:jc w:val="both"/>
       </w:pPr>
       <w:r>
         <w:rPr>
           <w:rFonts w:ascii="Arial" w:hAnsi="Arial"/>
           <w:sz w:val="24"/>
         </w:rPr>
-        <w:t>Fraccionamiento y reenvasado de medicamentos.</w:t>
+        <w:t>3. Fraccionamiento y reenvasado de medicamentos.</w:t>
       </w:r>
     </w:p>
     <w:p>
       <w:pPr>
-        <w:pStyle w:val="ListNumber"/>
-        <w:spacing w:line="360" w:lineRule="auto"/>
+        <w:spacing w:line="360" w:lineRule="auto" w:after="80"/>
+        <w:ind w:left="567" w:hanging="340"/>
+        <w:jc w:val="both"/>
       </w:pPr>
       <w:r>
         <w:rPr>
           <w:rFonts w:ascii="Arial" w:hAnsi="Arial"/>
           <w:sz w:val="24"/>
         </w:rPr>
-        <w:t>Dispensación informada de medicamentos.</w:t>
+        <w:t>4. Dispensación informada de medicamentos.</w:t>
       </w:r>
     </w:p>
     <w:p>
       <w:pPr>
-        <w:pStyle w:val="ListNumber"/>
-        <w:spacing w:line="360" w:lineRule="auto"/>
+        <w:spacing w:line="360" w:lineRule="auto" w:after="80"/>
+        <w:ind w:left="567" w:hanging="340"/>
+        <w:jc w:val="both"/>
       </w:pPr>
       <w:r>
         <w:rPr>
           <w:rFonts w:ascii="Arial" w:hAnsi="Arial"/>
           <w:sz w:val="24"/>
         </w:rPr>
-        <w:t>Control de indicadores y registros de despacho.</w:t>
+        <w:t>5. Control de indicadores y registros de despacho.</w:t>
       </w:r>
     </w:p>
     <w:p>
       <w:pPr>
-        <w:pStyle w:val="ListNumber"/>
-        <w:spacing w:line="360" w:lineRule="auto"/>
+        <w:spacing w:line="360" w:lineRule="auto" w:after="80"/>
+        <w:ind w:left="567" w:hanging="340"/>
+        <w:jc w:val="both"/>
       </w:pPr>
       <w:r>
         <w:rPr>
           <w:rFonts w:ascii="Arial" w:hAnsi="Arial"/>
           <w:sz w:val="24"/>
         </w:rPr>
-        <w:t>Atención Farmacéutica y visitas domiciliarias.</w:t>
+        <w:t>6. Atención Farmacéutica y visitas domiciliarias.</w:t>
       </w:r>
     </w:p>
     <w:p>
       <w:pPr>
-        <w:pStyle w:val="ListNumber"/>
-        <w:spacing w:line="360" w:lineRule="auto"/>
+        <w:spacing w:line="360" w:lineRule="auto" w:after="80"/>
+        <w:ind w:left="567" w:hanging="340"/>
+        <w:jc w:val="both"/>
       </w:pPr>
       <w:r>
         <w:rPr>
           <w:rFonts w:ascii="Arial" w:hAnsi="Arial"/>
           <w:sz w:val="24"/>
         </w:rPr>
-        <w:t>Educación sanitaria y promoción del uso racional de medicamentos.</w:t>
+        <w:t>7. Educación sanitaria y promoción del uso racional de medicamentos.</w:t>
       </w:r>
     </w:p>
     <w:p>
       <w:pPr>
-        <w:pStyle w:val="ListNumber"/>
-        <w:spacing w:line="360" w:lineRule="auto"/>
+        <w:spacing w:line="360" w:lineRule="auto" w:after="80"/>
+        <w:ind w:left="567" w:hanging="340"/>
+        <w:jc w:val="both"/>
       </w:pPr>
       <w:r>
         <w:rPr>
           <w:rFonts w:ascii="Arial" w:hAnsi="Arial"/>
           <w:sz w:val="24"/>
         </w:rPr>
-        <w:t>Manejo de medicamentos sujetos a control legal.</w:t>
+        <w:t>8. Manejo de medicamentos sujetos a control legal.</w:t>
       </w:r>
     </w:p>
     <w:p>
       <w:pPr>
-        <w:pStyle w:val="ListNumber"/>
-        <w:spacing w:line="360" w:lineRule="auto"/>
+        <w:spacing w:line="360" w:lineRule="auto" w:after="80"/>
+        <w:ind w:left="567" w:hanging="340"/>
+        <w:jc w:val="both"/>
       </w:pPr>
       <w:r>
         <w:rPr>
           <w:rFonts w:ascii="Arial" w:hAnsi="Arial"/>
           <w:sz w:val="24"/>
         </w:rPr>
-        <w:t>Inventario y ordenamiento de bodega.</w:t>
+        <w:t>9. Inventario y ordenamiento de bodega.</w:t>
       </w:r>
     </w:p>
     <w:p>
       <w:pPr>
-        <w:pStyle w:val="ListNumber"/>
-        <w:spacing w:line="360" w:lineRule="auto"/>
+        <w:spacing w:line="360" w:lineRule="auto" w:after="80"/>
+        <w:ind w:left="567" w:hanging="340"/>
+        <w:jc w:val="both"/>
       </w:pPr>
       <w:r>
         <w:rPr>
           <w:rFonts w:ascii="Arial" w:hAnsi="Arial"/>
           <w:sz w:val="24"/>
         </w:rPr>
-        <w:t>Eliminación de medicamentos vencidos, en mal estado o sin rotulación adecuada.</w:t>
+        <w:t>10. Eliminación de medicamentos vencidos, en mal estado o sin rotulación adecuada.</w:t>
       </w:r>
     </w:p>
     <w:p>
       <w:pPr>
-        <w:pStyle w:val="ListNumber"/>
-        <w:spacing w:line="360" w:lineRule="auto"/>
+        <w:spacing w:line="360" w:lineRule="auto" w:after="80"/>
+        <w:ind w:left="567" w:hanging="340"/>
+        <w:jc w:val="both"/>
       </w:pPr>
       <w:r>
         <w:rPr>
           <w:rFonts w:ascii="Arial" w:hAnsi="Arial"/>
           <w:sz w:val="24"/>
         </w:rPr>
-        <w:t>Apoyo en las supervisiones del Servicio de Salud.</w:t>
+        <w:t>11. Apoyo en las supervisiones del Servicio de Salud.</w:t>
       </w:r>
     </w:p>
     <w:p>
       <w:pPr>
-        <w:pStyle w:val="ListNumber"/>
-        <w:spacing w:line="360" w:lineRule="auto"/>
+        <w:spacing w:line="360" w:lineRule="auto" w:after="80"/>
+        <w:ind w:left="567" w:hanging="340"/>
+        <w:jc w:val="both"/>
       </w:pPr>
       <w:r>
         <w:rPr>
           <w:rFonts w:ascii="Arial" w:hAnsi="Arial"/>
           <w:sz w:val="24"/>
         </w:rPr>
-        <w:t>Conocimiento del arsenal farmacoterapéutico, los programas ministeriales (GES) y las fuentes de información de medicamentos.</w:t>
+        <w:t>12. Conocimiento del arsenal farmacoterapéutico, los programas ministeriales (GES) y las fuentes de información de medicamentos.</w:t>
       </w:r>
     </w:p>
     <w:p>
       <w:pPr>
-        <w:pStyle w:val="ListNumber"/>
-        <w:spacing w:line="360" w:lineRule="auto"/>
+        <w:spacing w:line="360" w:lineRule="auto" w:after="80"/>
+        <w:ind w:left="567" w:hanging="340"/>
+        <w:jc w:val="both"/>
       </w:pPr>
       <w:r>
         <w:rPr>
           <w:rFonts w:ascii="Arial" w:hAnsi="Arial"/>
           <w:sz w:val="24"/>
         </w:rPr>
-        <w:t>Vinculación con el medio.</w:t>
+        <w:t>13. Vinculación con el medio.</w:t>
       </w:r>
     </w:p>
     <w:p>
       <w:pPr>
-        <w:pStyle w:val="ListNumber"/>
-        <w:spacing w:line="360" w:lineRule="auto"/>
+        <w:spacing w:line="360" w:lineRule="auto" w:after="80"/>
+        <w:ind w:left="567" w:hanging="340"/>
+        <w:jc w:val="both"/>
       </w:pPr>
       <w:r>
         <w:rPr>
           <w:rFonts w:ascii="Arial" w:hAnsi="Arial"/>
           <w:sz w:val="24"/>
         </w:rPr>
-        <w:t>Seminario de título: diseño de un protocolo de Atención Farmacéutica domiciliaria.</w:t>
+        <w:t>14. Seminario de título: diseño de un protocolo de Atención Farmacéutica domiciliaria.</w:t>
       </w:r>
     </w:p>
     <w:p>
@@ -2446,10 +2464,10 @@
         <w:spacing w:before="360" w:after="120"/>
         <w:jc w:val="center"/>
         <w:pBdr>
-          <w:top w:val="dashed" w:sz="6" w:space="16" w:color="1F3B5C"/>
-          <w:bottom w:val="dashed" w:sz="6" w:space="16" w:color="1F3B5C"/>
-          <w:left w:val="dashed" w:sz="6" w:space="16" w:color="1F3B5C"/>
-          <w:right w:val="dashed" w:sz="6" w:space="16" w:color="1F3B5C"/>
+          <w:top w:val="dashed" w:sz="6" w:space="16" w:color="808080"/>
+          <w:bottom w:val="dashed" w:sz="6" w:space="16" w:color="808080"/>
+          <w:left w:val="dashed" w:sz="6" w:space="16" w:color="808080"/>
+          <w:right w:val="dashed" w:sz="6" w:space="16" w:color="808080"/>
         </w:pBdr>
       </w:pPr>
       <w:r>
@@ -2459,7 +2477,7 @@
           <w:color w:val="000000"/>
           <w:sz w:val="22"/>
         </w:rPr>
-        <w:t>[ Espacio reservado para insertar aquí la Carta Gantt ]</w:t>
+        <w:t>[ Espacio reservado para insertar aquí la Carta Gantt de actividades planificadas ]</w:t>
         <w:br/>
         <w:br/>
         <w:br/>
@@ -2474,7 +2492,7 @@
           <w:color w:val="000000"/>
           <w:sz w:val="20"/>
         </w:rPr>
-        <w:t>Archivo fig_gantt_planificada.png (alta resolución) o fig_gantt_planificada.pdf (vectorial)</w:t>
+        <w:t>Elija uno de los diseños disponibles en la carpeta recursos-informe (fig_gantt_opcion1, opcion2 u opcion3) en PNG o PDF.</w:t>
       </w:r>
     </w:p>
     <w:p>
@@ -2494,7 +2512,7 @@
         <w:fldChar w:fldCharType="separate"/>
       </w:r>
       <w:r>
-        <w:t>1</w:t>
+        <w:t>2</w:t>
       </w:r>
       <w:r>
         <w:fldChar w:fldCharType="end"/>
@@ -2530,10 +2548,10 @@
         <w:spacing w:before="360" w:after="120"/>
         <w:jc w:val="center"/>
         <w:pBdr>
-          <w:top w:val="dashed" w:sz="6" w:space="16" w:color="1F3B5C"/>
-          <w:bottom w:val="dashed" w:sz="6" w:space="16" w:color="1F3B5C"/>
-          <w:left w:val="dashed" w:sz="6" w:space="16" w:color="1F3B5C"/>
-          <w:right w:val="dashed" w:sz="6" w:space="16" w:color="1F3B5C"/>
+          <w:top w:val="dashed" w:sz="6" w:space="16" w:color="808080"/>
+          <w:bottom w:val="dashed" w:sz="6" w:space="16" w:color="808080"/>
+          <w:left w:val="dashed" w:sz="6" w:space="16" w:color="808080"/>
+          <w:right w:val="dashed" w:sz="6" w:space="16" w:color="808080"/>
         </w:pBdr>
       </w:pPr>
       <w:r>
@@ -2543,7 +2561,7 @@
           <w:color w:val="000000"/>
           <w:sz w:val="22"/>
         </w:rPr>
-        <w:t>[ Espacio reservado para insertar aquí la Carta Gantt ]</w:t>
+        <w:t>[ Espacio reservado para insertar aquí la Carta Gantt de actividades desarrolladas ]</w:t>
         <w:br/>
         <w:br/>
         <w:br/>
@@ -2558,7 +2576,7 @@
           <w:color w:val="000000"/>
           <w:sz w:val="20"/>
         </w:rPr>
-        <w:t>Archivo fig_gantt_desarrollada.png (alta resolución) o fig_gantt_desarrollada.pdf (vectorial)</w:t>
+        <w:t>Elija uno de los diseños disponibles en la carpeta recursos-informe (fig_gantt_opcion1, opcion2 u opcion3) en PNG o PDF.</w:t>
       </w:r>
     </w:p>
     <w:p>
@@ -2578,7 +2596,7 @@
         <w:fldChar w:fldCharType="separate"/>
       </w:r>
       <w:r>
-        <w:t>1</w:t>
+        <w:t>3</w:t>
       </w:r>
       <w:r>
         <w:fldChar w:fldCharType="end"/>
@@ -2604,7 +2622,7 @@
         <w:fldChar w:fldCharType="separate"/>
       </w:r>
       <w:r>
-        <w:t>1</w:t>
+        <w:t>3</w:t>
       </w:r>
       <w:r>
         <w:fldChar w:fldCharType="end"/>
@@ -2806,7 +2824,7 @@
                 <w:rFonts w:ascii="Arial" w:hAnsi="Arial"/>
                 <w:sz w:val="16"/>
               </w:rPr>
-              <w:t>Fraccionamiento y reenvasado; cambio de vildagliptina</w:t>
+              <w:t>Fraccionamiento y reenvasado; incorporación de vildagliptina al arsenal</w:t>
             </w:r>
           </w:p>
         </w:tc>
@@ -4008,7 +4026,7 @@
           <w:i w:val="0"/>
           <w:sz w:val="24"/>
         </w:rPr>
-        <w:t>A lo largo del internado se conoció el arsenal farmacoterapéutico de la unidad, es decir, el listado de medicamentos disponibles en el CESFAM según la canasta de la Atención Primaria y las orientaciones del Ministerio de Salud, junto con los criterios que definen qué medicamentos se incorporan o se retiran, como ocurrió con el reemplazo de la vildagliptina por otra alternativa dentro del mismo grupo. También se conoció el manejo de los medicamentos sujetos a control legal, con su registro y custodia diferenciados, y el circuito de notificación de farmacovigilancia frente a una sospecha de reacción adversa, aunque durante la estadía no se presentó un caso que ameritara notificar. Buena parte del trabajo de la unidad se articula con los programas ministeriales y las patologías con Garantías Explícitas en Salud (GES), como la epilepsia y la tuberculosis, cuyos tratamientos se dispensan y controlan de acuerdo con cada programa. Para resolver dudas sobre los medicamentos y apoyar la Atención Farmacéutica con evidencia, se recurrió a fuentes de información confiables y actualizadas, entre ellas UpToDate, Medscape y Drugs.com, además de la normativa y las guías del Ministerio de Salud. Esta actividad aporta al segundo y al tercer objetivo específico, ya que combina la gestión del arsenal con el uso seguro y racional de los medicamentos.</w:t>
+        <w:t>A lo largo del internado se conoció el arsenal farmacoterapéutico de la unidad, es decir, el listado de medicamentos disponibles en el CESFAM según la canasta de la Atención Primaria y las orientaciones del Ministerio de Salud, junto con los criterios que definen qué medicamentos se incorporan o se retiran del arsenal. Un ejemplo observado durante el internado fue la incorporación de la vildagliptina, un inhibidor de la enzima DPP-4, como una alternativa más para el tratamiento de la diabetes mellitus tipo 2, mientras que la glibenclamida, una sulfonilurea asociada a un mayor riesgo de hipoglucemia, se está retirando de forma gradual. También se conoció el manejo de los medicamentos sujetos a control legal, con su registro y custodia diferenciados, y el circuito de notificación de farmacovigilancia frente a una sospecha de reacción adversa, aunque durante la estadía no se presentó un caso que ameritara notificar. Buena parte del trabajo de la unidad se articula con los programas ministeriales y las patologías con Garantías Explícitas en Salud (GES), como la epilepsia y la tuberculosis, cuyos tratamientos se dispensan y controlan de acuerdo con cada programa. Para resolver dudas sobre los medicamentos y apoyar la Atención Farmacéutica con evidencia, se recurrió a fuentes de información confiables y actualizadas, entre ellas UpToDate, Medscape y Drugs.com, además de la normativa y las guías del Ministerio de Salud. Esta actividad aporta al segundo y al tercer objetivo específico, ya que combina la gestión del arsenal con el uso seguro y racional de los medicamentos.</w:t>
       </w:r>
     </w:p>
     <w:p>
@@ -4160,7 +4178,7 @@
         <w:fldChar w:fldCharType="separate"/>
       </w:r>
       <w:r>
-        <w:t>1</w:t>
+        <w:t>4</w:t>
       </w:r>
       <w:r>
         <w:fldChar w:fldCharType="end"/>
@@ -4647,67 +4665,72 @@
     </w:p>
     <w:p>
       <w:pPr>
-        <w:pStyle w:val="ListNumber"/>
-        <w:spacing w:line="360" w:lineRule="auto"/>
+        <w:spacing w:line="360" w:lineRule="auto" w:after="80"/>
+        <w:ind w:left="567" w:hanging="340"/>
+        <w:jc w:val="both"/>
       </w:pPr>
       <w:r>
         <w:rPr>
           <w:rFonts w:ascii="Arial" w:hAnsi="Arial"/>
           <w:sz w:val="24"/>
         </w:rPr>
-        <w:t>Ampliar el espacio físico de la farmacia y de la bodega, aumentar el número de ventanillas de atención y habilitar un área de espera más cómoda, de modo de responder al crecimiento sostenido de la población inscrita.</w:t>
+        <w:t>1. Ampliar el espacio físico de la farmacia y de la bodega, aumentar el número de ventanillas de atención y habilitar un área de espera más cómoda, de modo de responder al crecimiento sostenido de la población inscrita.</w:t>
       </w:r>
     </w:p>
     <w:p>
       <w:pPr>
-        <w:pStyle w:val="ListNumber"/>
-        <w:spacing w:line="360" w:lineRule="auto"/>
+        <w:spacing w:line="360" w:lineRule="auto" w:after="80"/>
+        <w:ind w:left="567" w:hanging="340"/>
+        <w:jc w:val="both"/>
       </w:pPr>
       <w:r>
         <w:rPr>
           <w:rFonts w:ascii="Arial" w:hAnsi="Arial"/>
           <w:sz w:val="24"/>
         </w:rPr>
-        <w:t>Incorporar de manera formal el protocolo de Atención Farmacéutica domiciliaria basado en el Modelo CMO, con criterios de priorización propios del farmacéutico, como aporte original surgido del seminario de título.</w:t>
+        <w:t>2. Incorporar de manera formal el protocolo de Atención Farmacéutica domiciliaria basado en el Modelo CMO, con criterios de priorización propios del farmacéutico, como aporte original surgido del seminario de título.</w:t>
       </w:r>
     </w:p>
     <w:p>
       <w:pPr>
-        <w:pStyle w:val="ListNumber"/>
-        <w:spacing w:line="360" w:lineRule="auto"/>
+        <w:spacing w:line="360" w:lineRule="auto" w:after="80"/>
+        <w:ind w:left="567" w:hanging="340"/>
+        <w:jc w:val="both"/>
       </w:pPr>
       <w:r>
         <w:rPr>
           <w:rFonts w:ascii="Arial" w:hAnsi="Arial"/>
           <w:sz w:val="24"/>
         </w:rPr>
-        <w:t>Estandarizar el registro de la Atención Farmacéutica mediante fichas de conciliación y de seguimiento comunes, que luego se traspasen a la ficha clínica electrónica, para mejorar la trazabilidad y la continuidad.</w:t>
+        <w:t>3. Estandarizar el registro de la Atención Farmacéutica mediante fichas de conciliación y de seguimiento comunes, que luego se traspasen a la ficha clínica electrónica, para mejorar la trazabilidad y la continuidad.</w:t>
       </w:r>
     </w:p>
     <w:p>
       <w:pPr>
-        <w:pStyle w:val="ListNumber"/>
-        <w:spacing w:line="360" w:lineRule="auto"/>
+        <w:spacing w:line="360" w:lineRule="auto" w:after="80"/>
+        <w:ind w:left="567" w:hanging="340"/>
+        <w:jc w:val="both"/>
       </w:pPr>
       <w:r>
         <w:rPr>
           <w:rFonts w:ascii="Arial" w:hAnsi="Arial"/>
           <w:sz w:val="24"/>
         </w:rPr>
-        <w:t>Reforzar el trabajo de la adherencia con herramientas simples y validadas, como el test de Morisky-Green-Levine, y con la entrevista motivacional.</w:t>
+        <w:t>4. Reforzar el trabajo de la adherencia con herramientas simples y validadas, como el test de Morisky-Green-Levine, y con la entrevista motivacional.</w:t>
       </w:r>
     </w:p>
     <w:p>
       <w:pPr>
-        <w:pStyle w:val="ListNumber"/>
-        <w:spacing w:line="360" w:lineRule="auto"/>
+        <w:spacing w:line="360" w:lineRule="auto" w:after="80"/>
+        <w:ind w:left="567" w:hanging="340"/>
+        <w:jc w:val="both"/>
       </w:pPr>
       <w:r>
         <w:rPr>
           <w:rFonts w:ascii="Arial" w:hAnsi="Arial"/>
           <w:sz w:val="24"/>
         </w:rPr>
-        <w:t>Mantener y difundir las buenas prácticas de trazabilidad y orden observadas en Villa Nonguén, que pueden servir de referencia para otros centros de la red.</w:t>
+        <w:t>5. Mantener y difundir las buenas prácticas de trazabilidad y orden observadas en Villa Nonguén, que pueden servir de referencia para otros centros de la red.</w:t>
       </w:r>
     </w:p>
     <w:p>
@@ -4728,67 +4751,72 @@
     </w:p>
     <w:p>
       <w:pPr>
-        <w:pStyle w:val="ListNumber"/>
-        <w:spacing w:line="360" w:lineRule="auto"/>
+        <w:spacing w:line="360" w:lineRule="auto" w:after="80"/>
+        <w:ind w:left="567" w:hanging="340"/>
+        <w:jc w:val="both"/>
       </w:pPr>
       <w:r>
         <w:rPr>
           <w:rFonts w:ascii="Arial" w:hAnsi="Arial"/>
           <w:sz w:val="24"/>
         </w:rPr>
-        <w:t>El internado en el CESFAM Villa Nonguén permitió desarrollar las competencias del Químico Farmacéutico en el ámbito de la farmacia asistencial y la Atención Primaria, cumpliendo el objetivo general planteado.</w:t>
+        <w:t>1. El internado en el CESFAM Villa Nonguén permitió desarrollar las competencias del Químico Farmacéutico en el ámbito de la farmacia asistencial y la Atención Primaria, cumpliendo el objetivo general planteado.</w:t>
       </w:r>
     </w:p>
     <w:p>
       <w:pPr>
-        <w:pStyle w:val="ListNumber"/>
-        <w:spacing w:line="360" w:lineRule="auto"/>
+        <w:spacing w:line="360" w:lineRule="auto" w:after="80"/>
+        <w:ind w:left="567" w:hanging="340"/>
+        <w:jc w:val="both"/>
       </w:pPr>
       <w:r>
         <w:rPr>
           <w:rFonts w:ascii="Arial" w:hAnsi="Arial"/>
           <w:sz w:val="24"/>
         </w:rPr>
-        <w:t>Se reconocieron la estructura y los procesos de la unidad de farmacia, y se participó en las tareas de recepción, almacenamiento, gestión de stock, fraccionamiento, reenvasado, despacho y eliminación de medicamentos vencidos, resguardando la trazabilidad y el uso eficiente de los recursos.</w:t>
+        <w:t>2. Se reconocieron la estructura y los procesos de la unidad de farmacia, y se participó en las tareas de recepción, almacenamiento, gestión de stock, fraccionamiento, reenvasado, despacho y eliminación de medicamentos vencidos, resguardando la trazabilidad y el uso eficiente de los recursos.</w:t>
       </w:r>
     </w:p>
     <w:p>
       <w:pPr>
-        <w:pStyle w:val="ListNumber"/>
-        <w:spacing w:line="360" w:lineRule="auto"/>
+        <w:spacing w:line="360" w:lineRule="auto" w:after="80"/>
+        <w:ind w:left="567" w:hanging="340"/>
+        <w:jc w:val="both"/>
       </w:pPr>
       <w:r>
         <w:rPr>
           <w:rFonts w:ascii="Arial" w:hAnsi="Arial"/>
           <w:sz w:val="24"/>
         </w:rPr>
-        <w:t>Se ejecutó Atención Farmacéutica de forma sostenida, con más de una actividad por semana durante toda la rotación, además de visitas domiciliarias y la promoción del uso racional de los medicamentos, lo que evidenció el aporte clínico y comunitario del farmacéutico en este nivel de atención.</w:t>
+        <w:t>3. Se ejecutó Atención Farmacéutica de forma sostenida, con más de una actividad por semana durante toda la rotación, además de visitas domiciliarias y la promoción del uso racional de los medicamentos, lo que evidenció el aporte clínico y comunitario del farmacéutico en este nivel de atención.</w:t>
       </w:r>
     </w:p>
     <w:p>
       <w:pPr>
-        <w:pStyle w:val="ListNumber"/>
-        <w:spacing w:line="360" w:lineRule="auto"/>
+        <w:spacing w:line="360" w:lineRule="auto" w:after="80"/>
+        <w:ind w:left="567" w:hanging="340"/>
+        <w:jc w:val="both"/>
       </w:pPr>
       <w:r>
         <w:rPr>
           <w:rFonts w:ascii="Arial" w:hAnsi="Arial"/>
           <w:sz w:val="24"/>
         </w:rPr>
-        <w:t>Se diseñó, como seminario de título, un protocolo de Atención Farmacéutica domiciliaria basado en el Modelo CMO, que aporta una herramienta concreta para ordenar, estandarizar y hacer trazable la visita domiciliaria en el establecimiento.</w:t>
+        <w:t>4. Se diseñó, como seminario de título, un protocolo de Atención Farmacéutica domiciliaria basado en el Modelo CMO, que aporta una herramienta concreta para ordenar, estandarizar y hacer trazable la visita domiciliaria en el establecimiento.</w:t>
       </w:r>
     </w:p>
     <w:p>
       <w:pPr>
-        <w:pStyle w:val="ListNumber"/>
-        <w:spacing w:line="360" w:lineRule="auto"/>
+        <w:spacing w:line="360" w:lineRule="auto" w:after="80"/>
+        <w:ind w:left="567" w:hanging="340"/>
+        <w:jc w:val="both"/>
       </w:pPr>
       <w:r>
         <w:rPr>
           <w:rFonts w:ascii="Arial" w:hAnsi="Arial"/>
           <w:sz w:val="24"/>
         </w:rPr>
-        <w:t>La comparación con el CESFAM Hualpencillo mostró que la limitación de espacio es un desafío compartido de la Atención Primaria, y confirmó como fortaleza distintiva de Villa Nonguén el orden y la trazabilidad en el manejo del medicamento.</w:t>
+        <w:t>5. La comparación con el CESFAM Hualpencillo mostró que la limitación de espacio es un desafío compartido de la Atención Primaria, y confirmó como fortaleza distintiva de Villa Nonguén el orden y la trazabilidad en el manejo del medicamento.</w:t>
       </w:r>
     </w:p>
     <w:p>
@@ -5218,7 +5246,7 @@
         <w:fldChar w:fldCharType="separate"/>
       </w:r>
       <w:r>
-        <w:t>1</w:t>
+        <w:t>5</w:t>
       </w:r>
       <w:r>
         <w:fldChar w:fldCharType="end"/>
@@ -5577,7 +5605,7 @@
         <w:fldChar w:fldCharType="separate"/>
       </w:r>
       <w:r>
-        <w:t>1</w:t>
+        <w:t>6</w:t>
       </w:r>
       <w:r>
         <w:fldChar w:fldCharType="end"/>
@@ -6436,7 +6464,7 @@
   <w:docDefaults>
     <w:rPrDefault>
       <w:rPr>
-        <w:rFonts w:asciiTheme="minorHAnsi" w:eastAsiaTheme="minorEastAsia" w:hAnsiTheme="minorHAnsi" w:cstheme="minorBidi"/>
+        <w:rFonts w:asciiTheme="minorHAnsi" w:eastAsiaTheme="minorEastAsia" w:hAnsiTheme="minorHAnsi" w:cstheme="minorBidi" w:ascii="Arial" w:hAnsi="Arial" w:cs="Arial" w:eastAsia="Arial"/>
         <w:sz w:val="22"/>
         <w:szCs w:val="22"/>
         <w:lang w:val="en-US" w:eastAsia="en-US" w:bidi="ar-SA"/>

</xml_diff>

<commit_message>
Elimina el punto 2.1 Cronograma de actividades planificadas y renumera la seccion 2 (2.1 desarrolladas, 2.2 descripcion, 2.3 seminario); ajusta figuras y referencias cruzadas
</commit_message>
<xml_diff>
--- a/Informe de Internado - Farmacia Asistencial y APS - CESFAM Villa Nonguen.docx
+++ b/Informe de Internado - Farmacia Asistencial y APS - CESFAM Villa Nonguen.docx
@@ -1959,7 +1959,7 @@
           <w:i w:val="0"/>
           <w:sz w:val="24"/>
         </w:rPr>
-        <w:t>El marco que hoy se usa como referencia para modernizar la Atención Farmacéutica es el Modelo CMO, sigla de Capacidad, Motivación y Oportunidad, desarrollado en España y validado por su sociedad de farmacia hospitalaria (Calleja Hernández &amp; Morillo Verdugo, 2016). Su valor está en que ordena la atención en torno a tres ideas que pueden llevarse al domicilio del paciente. La Capacidad tiene que ver con priorizar, es decir, concentrar el tiempo en los pacientes que más lo necesitan según criterios de riesgo y complejidad (Manzano García &amp; Morillo Verdugo, 2018). La Motivación pone el foco en la relación con el paciente y en su adherencia, trabajando mediante la entrevista motivacional las creencias y dificultades que llevan a no tomar bien el tratamiento. La Oportunidad, por último, busca llegar al paciente más allá del box, en su casa o por teléfono, para resolver a tiempo lo que vaya surgiendo. Estos tres pilares son los que dan forma al protocolo desarrollado como seminario de título durante el internado, descrito en la sección 2.4.</w:t>
+        <w:t>El marco que hoy se usa como referencia para modernizar la Atención Farmacéutica es el Modelo CMO, sigla de Capacidad, Motivación y Oportunidad, desarrollado en España y validado por su sociedad de farmacia hospitalaria (Calleja Hernández &amp; Morillo Verdugo, 2016). Su valor está en que ordena la atención en torno a tres ideas que pueden llevarse al domicilio del paciente. La Capacidad tiene que ver con priorizar, es decir, concentrar el tiempo en los pacientes que más lo necesitan según criterios de riesgo y complejidad (Manzano García &amp; Morillo Verdugo, 2018). La Motivación pone el foco en la relación con el paciente y en su adherencia, trabajando mediante la entrevista motivacional las creencias y dificultades que llevan a no tomar bien el tratamiento. La Oportunidad, por último, busca llegar al paciente más allá del box, en su casa o por teléfono, para resolver a tiempo lo que vaya surgiendo. Estos tres pilares son los que dan forma al protocolo desarrollado como seminario de título durante el internado, descrito en la sección 2.3.</w:t>
       </w:r>
     </w:p>
     <w:p>
@@ -2216,7 +2216,7 @@
           <w:i w:val="0"/>
           <w:sz w:val="24"/>
         </w:rPr>
-        <w:t>Cada uno de estos objetivos se desarrolla de forma explícita en el informe: los tres primeros a través de las actividades descritas en la sección 2.3, y el cuarto a través del seminario de título presentado en la sección 2.4. Su grado de cumplimiento se evalúa en la sección 3.1.</w:t>
+        <w:t>Cada uno de estos objetivos se desarrolla de forma explícita en el informe: los tres primeros a través de las actividades descritas en la sección 2.2, y el cuarto a través del seminario de título presentado en la sección 2.3. Su grado de cumplimiento se evalúa en la sección 3.1.</w:t>
       </w:r>
     </w:p>
     <w:p>
@@ -2442,7 +2442,7 @@
         <w:pStyle w:val="Heading2"/>
       </w:pPr>
       <w:r>
-        <w:t>2.1 Cronograma de actividades planificadas</w:t>
+        <w:t>2.1 Cronograma de actividades desarrolladas</w:t>
       </w:r>
     </w:p>
     <w:p>
@@ -2456,91 +2456,7 @@
           <w:i w:val="0"/>
           <w:sz w:val="24"/>
         </w:rPr>
-        <w:t>Al inicio del internado se acordó con el equipo de farmacia un plan de trabajo que ordenó la rotación por las distintas tareas de la unidad y reservó tiempo para el desarrollo del seminario de título. La Figura 2 presenta la carta Gantt con las actividades planificadas a lo largo de las nueve semanas.</w:t>
-      </w:r>
-    </w:p>
-    <w:p>
-      <w:pPr>
-        <w:spacing w:before="360" w:after="120"/>
-        <w:jc w:val="center"/>
-        <w:pBdr>
-          <w:top w:val="dashed" w:sz="6" w:space="16" w:color="808080"/>
-          <w:bottom w:val="dashed" w:sz="6" w:space="16" w:color="808080"/>
-          <w:left w:val="dashed" w:sz="6" w:space="16" w:color="808080"/>
-          <w:right w:val="dashed" w:sz="6" w:space="16" w:color="808080"/>
-        </w:pBdr>
-      </w:pPr>
-      <w:r>
-        <w:rPr>
-          <w:rFonts w:ascii="Arial" w:hAnsi="Arial"/>
-          <w:i/>
-          <w:color w:val="000000"/>
-          <w:sz w:val="22"/>
-        </w:rPr>
-        <w:t>[ Espacio reservado para insertar aquí la Carta Gantt de actividades planificadas ]</w:t>
-        <w:br/>
-        <w:br/>
-        <w:br/>
-        <w:br/>
-        <w:br/>
-        <w:br/>
-      </w:r>
-      <w:r>
-        <w:rPr>
-          <w:rFonts w:ascii="Arial" w:hAnsi="Arial"/>
-          <w:i/>
-          <w:color w:val="000000"/>
-          <w:sz w:val="20"/>
-        </w:rPr>
-        <w:t>Elija uno de los diseños disponibles en la carpeta recursos-informe (fig_gantt_opcion1, opcion2 u opcion3) en PNG o PDF.</w:t>
-      </w:r>
-    </w:p>
-    <w:p>
-      <w:pPr>
-        <w:pStyle w:val="Caption"/>
-      </w:pPr>
-      <w:r>
-        <w:t xml:space="preserve">Figura </w:t>
-      </w:r>
-      <w:r>
-        <w:fldChar w:fldCharType="begin"/>
-      </w:r>
-      <w:r>
-        <w:instrText xml:space="preserve"> SEQ Figura \* ARABIC </w:instrText>
-      </w:r>
-      <w:r>
-        <w:fldChar w:fldCharType="separate"/>
-      </w:r>
-      <w:r>
-        <w:t>2</w:t>
-      </w:r>
-      <w:r>
-        <w:fldChar w:fldCharType="end"/>
-      </w:r>
-      <w:r>
-        <w:t>. Carta Gantt de actividades planificadas del internado.</w:t>
-      </w:r>
-    </w:p>
-    <w:p>
-      <w:pPr>
-        <w:pStyle w:val="Heading2"/>
-      </w:pPr>
-      <w:r>
-        <w:t>2.2 Cronograma de actividades desarrolladas</w:t>
-      </w:r>
-    </w:p>
-    <w:p>
-      <w:pPr>
-        <w:jc w:val="both"/>
-      </w:pPr>
-      <w:r>
-        <w:rPr>
-          <w:rFonts w:ascii="Arial" w:hAnsi="Arial"/>
-          <w:b w:val="0"/>
-          <w:i w:val="0"/>
-          <w:sz w:val="24"/>
-        </w:rPr>
-        <w:t>La Figura 3 muestra, semana a semana, las actividades efectivamente desarrolladas. En términos generales, la ejecución siguió lo planificado, con algunos ajustes propios de la dinámica del establecimiento. El fraccionamiento, el reenvasado y el despacho se mantuvieron durante casi todo el periodo, ya que constituyen tareas habituales de la unidad, y la Atención Farmacéutica se realizó todas las semanas, en más de una oportunidad por semana, gracias a la muy buena disposición de los Químicos Farmacéuticos para integrar al interno a esa labor y enseñarle cómo llevarla a cabo. Hacia las últimas semanas se sumó la eliminación de medicamentos vencidos, y a lo largo de la rotación aparecieron actividades no previstas al inicio, como el apoyo durante las supervisiones del Servicio de Salud y una situación de vinculación con el medio surgida en terreno. La Tabla 3 complementa la figura con el detalle de lo realizado día a día.</w:t>
+        <w:t>La Figura 2 muestra, semana a semana, las actividades efectivamente desarrolladas. En términos generales, la ejecución siguió lo planificado, con algunos ajustes propios de la dinámica del establecimiento. El fraccionamiento, el reenvasado y el despacho se mantuvieron durante casi todo el periodo, ya que constituyen tareas habituales de la unidad, y la Atención Farmacéutica se realizó todas las semanas, en más de una oportunidad por semana, gracias a la muy buena disposición de los Químicos Farmacéuticos para integrar al interno a esa labor y enseñarle cómo llevarla a cabo. Hacia las últimas semanas se sumó la eliminación de medicamentos vencidos, y a lo largo de la rotación aparecieron actividades no previstas al inicio, como el apoyo durante las supervisiones del Servicio de Salud y una situación de vinculación con el medio surgida en terreno. La Tabla 3 complementa la figura con el detalle de lo realizado día a día.</w:t>
       </w:r>
     </w:p>
     <w:p>
@@ -2596,7 +2512,7 @@
         <w:fldChar w:fldCharType="separate"/>
       </w:r>
       <w:r>
-        <w:t>3</w:t>
+        <w:t>2</w:t>
       </w:r>
       <w:r>
         <w:fldChar w:fldCharType="end"/>
@@ -3850,7 +3766,7 @@
         <w:pStyle w:val="Heading2"/>
       </w:pPr>
       <w:r>
-        <w:t>2.3 Descripción de las actividades realizadas</w:t>
+        <w:t>2.2 Descripción de las actividades realizadas</w:t>
       </w:r>
     </w:p>
     <w:p>
@@ -3858,7 +3774,7 @@
         <w:pStyle w:val="Heading3"/>
       </w:pPr>
       <w:r>
-        <w:t>2.3.1 Inducción y conocimiento del centro y de la unidad de farmacia</w:t>
+        <w:t>2.2.1 Inducción y conocimiento del centro y de la unidad de farmacia</w:t>
       </w:r>
     </w:p>
     <w:p>
@@ -3880,7 +3796,7 @@
         <w:pStyle w:val="Heading3"/>
       </w:pPr>
       <w:r>
-        <w:t>2.3.2 Recepción, almacenamiento y gestión del stock</w:t>
+        <w:t>2.2.2 Recepción, almacenamiento y gestión del stock</w:t>
       </w:r>
     </w:p>
     <w:p>
@@ -3902,7 +3818,7 @@
         <w:pStyle w:val="Heading3"/>
       </w:pPr>
       <w:r>
-        <w:t>2.3.3 Fraccionamiento y reenvasado de medicamentos</w:t>
+        <w:t>2.2.3 Fraccionamiento y reenvasado de medicamentos</w:t>
       </w:r>
     </w:p>
     <w:p>
@@ -3924,7 +3840,7 @@
         <w:pStyle w:val="Heading3"/>
       </w:pPr>
       <w:r>
-        <w:t>2.3.4 Dispensación informada de medicamentos</w:t>
+        <w:t>2.2.4 Dispensación informada de medicamentos</w:t>
       </w:r>
     </w:p>
     <w:p>
@@ -3946,7 +3862,7 @@
         <w:pStyle w:val="Heading3"/>
       </w:pPr>
       <w:r>
-        <w:t>2.3.5 Atención Farmacéutica y visitas domiciliarias</w:t>
+        <w:t>2.2.5 Atención Farmacéutica y visitas domiciliarias</w:t>
       </w:r>
     </w:p>
     <w:p>
@@ -3968,7 +3884,7 @@
         <w:pStyle w:val="Heading3"/>
       </w:pPr>
       <w:r>
-        <w:t>2.3.6 Educación sanitaria y promoción del uso racional de medicamentos</w:t>
+        <w:t>2.2.6 Educación sanitaria y promoción del uso racional de medicamentos</w:t>
       </w:r>
     </w:p>
     <w:p>
@@ -3990,7 +3906,7 @@
         <w:pStyle w:val="Heading3"/>
       </w:pPr>
       <w:r>
-        <w:t>2.3.7 Control de indicadores, inventario y supervisiones</w:t>
+        <w:t>2.2.7 Control de indicadores, inventario y supervisiones</w:t>
       </w:r>
     </w:p>
     <w:p>
@@ -4012,7 +3928,7 @@
         <w:pStyle w:val="Heading3"/>
       </w:pPr>
       <w:r>
-        <w:t>2.3.8 Arsenal farmacoterapéutico, programas ministeriales y fuentes de información</w:t>
+        <w:t>2.2.8 Arsenal farmacoterapéutico, programas ministeriales y fuentes de información</w:t>
       </w:r>
     </w:p>
     <w:p>
@@ -4034,7 +3950,7 @@
         <w:pStyle w:val="Heading3"/>
       </w:pPr>
       <w:r>
-        <w:t>2.3.9 Manejo de medicamentos sujetos a control legal</w:t>
+        <w:t>2.2.9 Manejo de medicamentos sujetos a control legal</w:t>
       </w:r>
     </w:p>
     <w:p>
@@ -4056,7 +3972,7 @@
         <w:pStyle w:val="Heading3"/>
       </w:pPr>
       <w:r>
-        <w:t>2.3.10 Eliminación de medicamentos vencidos</w:t>
+        <w:t>2.2.10 Eliminación de medicamentos vencidos</w:t>
       </w:r>
     </w:p>
     <w:p>
@@ -4078,7 +3994,7 @@
         <w:pStyle w:val="Heading2"/>
       </w:pPr>
       <w:r>
-        <w:t>2.4 Seminario de título</w:t>
+        <w:t>2.3 Seminario de título</w:t>
       </w:r>
     </w:p>
     <w:p>
@@ -4100,7 +4016,7 @@
         <w:pStyle w:val="Heading3"/>
       </w:pPr>
       <w:r>
-        <w:t>2.4.1 Objetivos del seminario</w:t>
+        <w:t>2.3.1 Objetivos del seminario</w:t>
       </w:r>
     </w:p>
     <w:p>
@@ -4122,7 +4038,7 @@
         <w:pStyle w:val="Heading3"/>
       </w:pPr>
       <w:r>
-        <w:t>2.4.2 Tipo de estudio y desarrollo</w:t>
+        <w:t>2.3.2 Tipo de estudio y desarrollo</w:t>
       </w:r>
     </w:p>
     <w:p>
@@ -4144,7 +4060,7 @@
         <w:pStyle w:val="Heading3"/>
       </w:pPr>
       <w:r>
-        <w:t>2.4.3 Diagnóstico de brechas, población y criterios</w:t>
+        <w:t>2.3.3 Diagnóstico de brechas, población y criterios</w:t>
       </w:r>
     </w:p>
     <w:p>
@@ -4522,7 +4438,7 @@
         <w:pStyle w:val="Heading3"/>
       </w:pPr>
       <w:r>
-        <w:t>2.4.4 Instrumentos diseñados y consideraciones éticas</w:t>
+        <w:t>2.3.4 Instrumentos diseñados y consideraciones éticas</w:t>
       </w:r>
     </w:p>
     <w:p>

</xml_diff>

<commit_message>
Fuerza Arial en el tema (elimina Calibri), quita frases redundantes de cumplimiento de objetivos en actividades y discusion, corrige orden alfabetico de la bibliografia
</commit_message>
<xml_diff>
--- a/Informe de Internado - Farmacia Asistencial y APS - CESFAM Villa Nonguen.docx
+++ b/Informe de Internado - Farmacia Asistencial y APS - CESFAM Villa Nonguen.docx
@@ -2202,21 +2202,6 @@
           <w:sz w:val="24"/>
         </w:rPr>
         <w:t>4. Diseñar un protocolo de Atención Farmacéutica domiciliaria basado en el Modelo CMO para el Programa de Salud Cardiovascular del CESFAM Villa Nonguén.</w:t>
-      </w:r>
-    </w:p>
-    <w:p>
-      <w:pPr>
-        <w:spacing w:after="160"/>
-        <w:jc w:val="both"/>
-      </w:pPr>
-      <w:r>
-        <w:rPr>
-          <w:rFonts w:ascii="Arial" w:hAnsi="Arial"/>
-          <w:b w:val="0"/>
-          <w:i w:val="0"/>
-          <w:sz w:val="24"/>
-        </w:rPr>
-        <w:t>Cada uno de estos objetivos se desarrolla de forma explícita en el informe: los tres primeros a través de las actividades descritas en la sección 2.2, y el cuarto a través del seminario de título presentado en la sección 2.3. Su grado de cumplimiento se evalúa en la sección 3.1.</w:t>
       </w:r>
     </w:p>
     <w:p>
@@ -3788,7 +3773,7 @@
           <w:i w:val="0"/>
           <w:sz w:val="24"/>
         </w:rPr>
-        <w:t>Durante la primera semana se realizó la presentación al equipo de trabajo y se recorrieron las dependencias del CESFAM y de la unidad de farmacia. El equipo explicó la organización de la unidad, la ubicación física de los medicamentos, el flujo de trabajo diario y el uso de los sistemas de registro. Se revisaron los protocolos internos del establecimiento, incluidos los de emergencia, como el código rojo y la reanimación cardiopulmonar ante un paro cardiorrespiratorio, y el manejo inicial de situaciones críticas como la reacción alérgica, la hemorragia masiva y la convulsión. También se conocieron los programas computacionales de apoyo y la ficha clínica electrónica del establecimiento (SINET Sur), utilizada para consultar antecedentes y dejar constancia de las atenciones. Esta actividad responde al primer objetivo específico.</w:t>
+        <w:t>Durante la primera semana se realizó la presentación al equipo de trabajo y se recorrieron las dependencias del CESFAM y de la unidad de farmacia. El equipo explicó la organización de la unidad, la ubicación física de los medicamentos, el flujo de trabajo diario y el uso de los sistemas de registro. Se revisaron los protocolos internos del establecimiento, incluidos los de emergencia, como el código rojo y la reanimación cardiopulmonar ante un paro cardiorrespiratorio, y el manejo inicial de situaciones críticas como la reacción alérgica, la hemorragia masiva y la convulsión. También se conocieron los programas computacionales de apoyo y la ficha clínica electrónica del establecimiento (SINET Sur), utilizada para consultar antecedentes y dejar constancia de las atenciones.</w:t>
       </w:r>
     </w:p>
     <w:p>
@@ -3810,7 +3795,7 @@
           <w:i w:val="0"/>
           <w:sz w:val="24"/>
         </w:rPr>
-        <w:t>Se participó en la recepción y el almacenamiento de los medicamentos que llegan a la unidad, que se adquieren principalmente a través de la Central de Abastecimiento (CENABAST) y que se ordenan resguardando las condiciones de conservación de temperatura y humedad, y aplicando el criterio FEFO, es decir, lo primero que vence es lo primero que sale, para asegurar la rotación de las existencias. Se colaboró en la gestión del stock, con especial atención al control de los medicamentos próximos a vencer, que se marcaban y se controlaban para evitar pérdidas. Cuando un medicamento estaba por vencer y no alcanzaba a utilizarse, se gestionaban préstamos o canjes con otros centros de la red, y las existencias que no se podían aprovechar se reportaban y se redistribuían hacia otros CESFAM, de manera de dar un uso eficiente a los recursos y reducir las mermas. Se conoció además el proceso de programación anual de las necesidades de medicamentos, que se planifica según la demanda y las metas del establecimiento. Esta actividad responde al segundo objetivo específico.</w:t>
+        <w:t>Se participó en la recepción y el almacenamiento de los medicamentos que llegan a la unidad, que se adquieren principalmente a través de la Central de Abastecimiento (CENABAST) y que se ordenan resguardando las condiciones de conservación de temperatura y humedad, y aplicando el criterio FEFO, es decir, lo primero que vence es lo primero que sale, para asegurar la rotación de las existencias. Se colaboró en la gestión del stock, con especial atención al control de los medicamentos próximos a vencer, que se marcaban y se controlaban para evitar pérdidas. Cuando un medicamento estaba por vencer y no alcanzaba a utilizarse, se gestionaban préstamos o canjes con otros centros de la red, y las existencias que no se podían aprovechar se reportaban y se redistribuían hacia otros CESFAM, de manera de dar un uso eficiente a los recursos y reducir las mermas. Se conoció además el proceso de programación anual de las necesidades de medicamentos, que se planifica según la demanda y las metas del establecimiento.</w:t>
       </w:r>
     </w:p>
     <w:p>
@@ -3832,7 +3817,7 @@
           <w:i w:val="0"/>
           <w:sz w:val="24"/>
         </w:rPr>
-        <w:t>El fraccionamiento y el reenvasado fueron tareas frecuentes a lo largo del internado. El trabajo consistió en acondicionar los medicamentos en la cantidad correspondiente a cada paciente y preparar las bolsas de tratamiento, rotulando cada envase con el nombre del medicamento, la indicación, la cantidad, la fecha de vencimiento y la serie o lote, de manera de asegurar la trazabilidad del producto hasta el usuario. Este proceso permitió comprender la importancia del rotulado correcto y del resguardo de la información para la seguridad del paciente, sobre todo en personas con polifarmacia que retiran varios medicamentos a la vez. Responde al segundo objetivo específico.</w:t>
+        <w:t>El fraccionamiento y el reenvasado fueron tareas frecuentes a lo largo del internado. El trabajo consistió en acondicionar los medicamentos en la cantidad correspondiente a cada paciente y preparar las bolsas de tratamiento, rotulando cada envase con el nombre del medicamento, la indicación, la cantidad, la fecha de vencimiento y la serie o lote, de manera de asegurar la trazabilidad del producto hasta el usuario. Este proceso permitió comprender la importancia del rotulado correcto y del resguardo de la información para la seguridad del paciente, sobre todo en personas con polifarmacia que retiran varios medicamentos a la vez.</w:t>
       </w:r>
     </w:p>
     <w:p>
@@ -3854,7 +3839,7 @@
           <w:i w:val="0"/>
           <w:sz w:val="24"/>
         </w:rPr>
-        <w:t>Se apoyó la dispensación de medicamentos a los usuarios siguiendo el protocolo de despacho del establecimiento, que busca entregar el tratamiento correcto de forma ordenada y sin errores. El trabajo reforzó el reconocimiento de los principios activos, las presentaciones y su ubicación dentro de la unidad, la verificación de la receta y de los datos del paciente, y las buenas prácticas de entrega. Cada despacho se registra en el sistema informático SINET Sur, que descuenta el producto de su bincard, de modo que el stock queda actualizado y trazable en todo momento. La dispensación se acompañó de la información necesaria para el uso correcto de la terapia, verificando la indicación y resolviendo dudas de los pacientes. Este orden y esta trazabilidad, junto con el traspaso registrado de medicamentos desde la bodega a la farmacia, fueron uno de los aspectos más destacables de la unidad. Responde al segundo objetivo específico.</w:t>
+        <w:t>Se apoyó la dispensación de medicamentos a los usuarios siguiendo el protocolo de despacho del establecimiento, que busca entregar el tratamiento correcto de forma ordenada y sin errores. El trabajo reforzó el reconocimiento de los principios activos, las presentaciones y su ubicación dentro de la unidad, la verificación de la receta y de los datos del paciente, y las buenas prácticas de entrega. Cada despacho se registra en el sistema informático SINET Sur, que descuenta el producto de su bincard, de modo que el stock queda actualizado y trazable en todo momento. La dispensación se acompañó de la información necesaria para el uso correcto de la terapia, verificando la indicación y resolviendo dudas de los pacientes. Este orden y esta trazabilidad, junto con el traspaso registrado de medicamentos desde la bodega a la farmacia, fueron uno de los aspectos más destacables de la unidad.</w:t>
       </w:r>
     </w:p>
     <w:p>
@@ -3876,7 +3861,7 @@
           <w:i w:val="0"/>
           <w:sz w:val="24"/>
         </w:rPr>
-        <w:t>La Atención Farmacéutica fue una de las actividades más significativas del internado y se realizó todas las semanas, en más de una oportunidad por semana, gracias a la muy buena disposición de los Químicos Farmacéuticos, que integraron al interno a esta labor y le enseñaron cómo llevarla a cabo. Se acompañó al Químico Farmacéutico en la atención de los usuarios del Programa de Salud Cardiovascular, tanto en box como en el domicilio, y se participó en la entrega de medicamentos a domicilio para pacientes con dificultades para acudir al centro. En estas visitas se revisaba la medicación que el paciente realmente utilizaba, se conciliaba con la que tenía indicada, se resolvían dudas sobre horarios y formas de administración, y se reforzaba la adherencia. Durante una jornada vespertina se observó, además, el funcionamiento de la farmacia en el horario de la tarde y el procedimiento de cierre de la unidad. Esta actividad responde al tercer objetivo específico.</w:t>
+        <w:t>La Atención Farmacéutica fue una de las actividades más significativas del internado y se realizó todas las semanas, en más de una oportunidad por semana, gracias a la muy buena disposición de los Químicos Farmacéuticos, que integraron al interno a esta labor y le enseñaron cómo llevarla a cabo. Se acompañó al Químico Farmacéutico en la atención de los usuarios del Programa de Salud Cardiovascular, tanto en box como en el domicilio, y se participó en la entrega de medicamentos a domicilio para pacientes con dificultades para acudir al centro. En estas visitas se revisaba la medicación que el paciente realmente utilizaba, se conciliaba con la que tenía indicada, se resolvían dudas sobre horarios y formas de administración, y se reforzaba la adherencia. Durante una jornada vespertina se observó, además, el funcionamiento de la farmacia en el horario de la tarde y el procedimiento de cierre de la unidad.</w:t>
       </w:r>
     </w:p>
     <w:p>
@@ -3898,7 +3883,7 @@
           <w:i w:val="0"/>
           <w:sz w:val="24"/>
         </w:rPr>
-        <w:t>Se participó en un taller grupal de uso racional de medicamentos dirigido a los usuarios del CESFAM. La actividad se realizó junto al Químico Farmacéutico y consistió en conversar con los pacientes, entregar material educativo en forma de trípticos y desarrollar una dinámica participativa con paletas de respuesta, en la que los asistentes respondían situaciones sobre el uso correcto de los medicamentos y recibían pequeños incentivos por participar. La instancia favoreció la educación sanitaria y acercó el rol del farmacéutico a la comunidad. Responde al tercer objetivo específico.</w:t>
+        <w:t>Se participó en un taller grupal de uso racional de medicamentos dirigido a los usuarios del CESFAM. La actividad se realizó junto al Químico Farmacéutico y consistió en conversar con los pacientes, entregar material educativo en forma de trípticos y desarrollar una dinámica participativa con paletas de respuesta, en la que los asistentes respondían situaciones sobre el uso correcto de los medicamentos y recibían pequeños incentivos por participar. La instancia favoreció la educación sanitaria y acercó el rol del farmacéutico a la comunidad.</w:t>
       </w:r>
     </w:p>
     <w:p>
@@ -3942,7 +3927,7 @@
           <w:i w:val="0"/>
           <w:sz w:val="24"/>
         </w:rPr>
-        <w:t>A lo largo del internado se conoció el arsenal farmacoterapéutico de la unidad, es decir, el listado de medicamentos disponibles en el CESFAM según la canasta de la Atención Primaria y las orientaciones del Ministerio de Salud, junto con los criterios que definen qué medicamentos se incorporan o se retiran del arsenal. Un ejemplo observado durante el internado fue la incorporación de la vildagliptina, un inhibidor de la enzima DPP-4, como una alternativa más para el tratamiento de la diabetes mellitus tipo 2, mientras que la glibenclamida, una sulfonilurea asociada a un mayor riesgo de hipoglucemia, se está retirando de forma gradual. También se conoció el manejo de los medicamentos sujetos a control legal, con su registro y custodia diferenciados, y el circuito de notificación de farmacovigilancia frente a una sospecha de reacción adversa, aunque durante la estadía no se presentó un caso que ameritara notificar. Buena parte del trabajo de la unidad se articula con los programas ministeriales y las patologías con Garantías Explícitas en Salud (GES), como la epilepsia y la tuberculosis, cuyos tratamientos se dispensan y controlan de acuerdo con cada programa. Para resolver dudas sobre los medicamentos y apoyar la Atención Farmacéutica con evidencia, se recurrió a fuentes de información confiables y actualizadas, entre ellas UpToDate, Medscape y Drugs.com, además de la normativa y las guías del Ministerio de Salud. Esta actividad aporta al segundo y al tercer objetivo específico, ya que combina la gestión del arsenal con el uso seguro y racional de los medicamentos.</w:t>
+        <w:t>A lo largo del internado se conoció el arsenal farmacoterapéutico de la unidad, es decir, el listado de medicamentos disponibles en el CESFAM según la canasta de la Atención Primaria y las orientaciones del Ministerio de Salud, junto con los criterios que definen qué medicamentos se incorporan o se retiran del arsenal. Un ejemplo observado durante el internado fue la incorporación de la vildagliptina, un inhibidor de la enzima DPP-4, como una alternativa más para el tratamiento de la diabetes mellitus tipo 2, mientras que la glibenclamida, una sulfonilurea asociada a un mayor riesgo de hipoglucemia, se está retirando de forma gradual. También se conoció el manejo de los medicamentos sujetos a control legal, con su registro y custodia diferenciados, y el circuito de notificación de farmacovigilancia frente a una sospecha de reacción adversa, aunque durante la estadía no se presentó un caso que ameritara notificar. Buena parte del trabajo de la unidad se articula con los programas ministeriales y las patologías con Garantías Explícitas en Salud (GES), como la epilepsia y la tuberculosis, cuyos tratamientos se dispensan y controlan de acuerdo con cada programa. Para resolver dudas sobre los medicamentos y apoyar la Atención Farmacéutica con evidencia, se recurrió a fuentes de información confiables y actualizadas, entre ellas UpToDate, Medscape y Drugs.com, además de la normativa y las guías del Ministerio de Salud.</w:t>
       </w:r>
     </w:p>
     <w:p>
@@ -3964,7 +3949,7 @@
           <w:i w:val="0"/>
           <w:sz w:val="24"/>
         </w:rPr>
-        <w:t>Se conoció el manejo de los medicamentos sujetos a control legal, es decir, los psicotrópicos y estupefacientes, que se guardan bajo llave y se registran de forma diferenciada en los libros oficiales de control. Se revisó cómo se verifican las recetas retenidas, cómo se descuentan las existencias y cómo se resguarda la trazabilidad de estos fármacos, en línea con la normativa vigente. Esta actividad responde al segundo objetivo específico.</w:t>
+        <w:t>Se conoció el manejo de los medicamentos sujetos a control legal, es decir, los psicotrópicos y estupefacientes, que se guardan bajo llave y se registran de forma diferenciada en los libros oficiales de control. Se revisó cómo se verifican las recetas retenidas, cómo se descuentan las existencias y cómo se resguarda la trazabilidad de estos fármacos, en línea con la normativa vigente.</w:t>
       </w:r>
     </w:p>
     <w:p>
@@ -3986,7 +3971,7 @@
           <w:i w:val="0"/>
           <w:sz w:val="24"/>
         </w:rPr>
-        <w:t>Durante las dos últimas semanas del internado se participó en la eliminación de medicamentos vencidos, en mal estado o sin rotulación adecuada, siguiendo el procedimiento del establecimiento. El trabajo consistió en revisar las existencias de la farmacia y la bodega, marcar y separar los productos que debían eliminarse y llevarlos al área donde no se pueden dispensar, descontar sus saldos de la bincard en el sistema y dejar constancia en el acta de baja mensual. Los productos se acondicionan en bolsas y contenedores de residuos peligrosos para su retiro a la sala REAS, desde donde una empresa externa realiza la disposición final, y en el caso de los psicotrópicos y estupefacientes la eliminación se hace con aviso previo a la autoridad sanitaria. Esta actividad reforzó la importancia de dispensar solo productos vigentes y en buen estado, y responde al segundo objetivo específico.</w:t>
+        <w:t>Durante las dos últimas semanas del internado se participó en la eliminación de medicamentos vencidos, en mal estado o sin rotulación adecuada, siguiendo el procedimiento del establecimiento. El trabajo consistió en revisar las existencias de la farmacia y la bodega, marcar y separar los productos que debían eliminarse y llevarlos al área donde no se pueden dispensar, descontar sus saldos de la bincard en el sistema y dejar constancia en el acta de baja mensual. Los productos se acondicionan en bolsas y contenedores de residuos peligrosos para su retiro a la sala REAS, desde donde una empresa externa realiza la disposición final, y en el caso de los psicotrópicos y estupefacientes la eliminación se hace con aviso previo a la autoridad sanitaria. Esta actividad reforzó la importancia de dispensar solo productos vigentes y en buen estado.</w:t>
       </w:r>
     </w:p>
     <w:p>
@@ -4008,7 +3993,7 @@
           <w:i w:val="0"/>
           <w:sz w:val="24"/>
         </w:rPr>
-        <w:t>El seminario de título se desarrolló en paralelo a las actividades de farmacia y corresponde al cuarto objetivo específico del internado. Consistió en el diseño de un protocolo de Atención Farmacéutica domiciliaria basado en el Modelo CMO para los pacientes del Programa de Salud Cardiovascular del CESFAM Villa Nonguén, bajo la guía del profesor Diego Ignacio Jorquera Pereira y con el apoyo del Químico Farmacéutico tutor del centro. A continuación se describe cómo se realizó.</w:t>
+        <w:t>El seminario de título se desarrolló en paralelo a las actividades de farmacia y consistió en el diseño de un protocolo de Atención Farmacéutica domiciliaria basado en el Modelo CMO para los pacientes del Programa de Salud Cardiovascular del CESFAM Villa Nonguén, bajo la guía del profesor Diego Ignacio Jorquera Pereira y con el apoyo del Químico Farmacéutico tutor del centro. A continuación se describe cómo se realizó.</w:t>
       </w:r>
     </w:p>
     <w:p>
@@ -4482,7 +4467,7 @@
           <w:i w:val="0"/>
           <w:sz w:val="24"/>
         </w:rPr>
-        <w:t>El internado permitió conocer de manera directa el funcionamiento de una unidad de farmacia de Atención Primaria y participar en la mayoría de sus procesos, desde la gestión del arsenal hasta la Atención Farmacéutica en el domicilio. El primer objetivo específico se cumplió al reconocer la estructura, las funciones del equipo y los procesos de la unidad, tal como se describe en la sección 1 y en el organigrama. El segundo se alcanzó mediante la participación sostenida en la recepción, el almacenamiento, la gestión de stock, el fraccionamiento, el reenvasado y la dispensación, resguardando la trazabilidad a través del rotulado. El tercero se desarrolló a través de la Atención Farmacéutica, las visitas domiciliarias y el taller de uso racional de medicamentos. Y el cuarto se materializó en el diseño del protocolo de Atención Farmacéutica domiciliaria basado en el Modelo CMO, presentado como seminario de título. En conjunto, estas actividades permitieron cumplir el objetivo general del internado.</w:t>
+        <w:t>El internado permitió conocer de manera directa el funcionamiento de una unidad de farmacia de Atención Primaria y participar en la mayoría de sus procesos. La rotación abarcó tanto las tareas técnicas y de gestión, como la recepción, el almacenamiento, la gestión de stock, el fraccionamiento, el reenvasado, la dispensación y la eliminación de medicamentos vencidos, como las tareas clínicas y comunitarias, entre ellas la Atención Farmacéutica, las visitas domiciliarias y el taller de uso racional de medicamentos, y culminó con el diseño del protocolo domiciliario basado en el Modelo CMO como seminario de título. Este recorrido, que fue desde la gestión del arsenal hasta el seguimiento del paciente en su propio hogar, entregó una visión completa del quehacer del Químico Farmacéutico en la Atención Primaria y permitió alcanzar lo propuesto al inicio de la rotación.</w:t>
       </w:r>
     </w:p>
     <w:p>
@@ -4676,7 +4661,7 @@
           <w:rFonts w:ascii="Arial" w:hAnsi="Arial"/>
           <w:sz w:val="24"/>
         </w:rPr>
-        <w:t>1. El internado en el CESFAM Villa Nonguén permitió desarrollar las competencias del Químico Farmacéutico en el ámbito de la farmacia asistencial y la Atención Primaria, cumpliendo el objetivo general planteado.</w:t>
+        <w:t>1. El internado en el CESFAM Villa Nonguén permitió desarrollar las competencias del Químico Farmacéutico en el ámbito de la farmacia asistencial y la Atención Primaria, integrándose de manera efectiva al equipo de la unidad de farmacia.</w:t>
       </w:r>
     </w:p>
     <w:p>
@@ -4790,6 +4775,20 @@
           <w:rFonts w:ascii="Arial" w:hAnsi="Arial"/>
           <w:sz w:val="24"/>
         </w:rPr>
+        <w:t>Álvarez-Díaz, A. M., Morillo-Verdugo, R., &amp; Fernández-Llamazares, C. M. (2025). Estudio cualitativo sobre la adopción y potenciación del modelo capacidad-motivación-oportunidad para la Atención Farmacéutica en consultas externas de farmacia en España. Farmacia Hospitalaria, 49(6), 384-391.</w:t>
+      </w:r>
+    </w:p>
+    <w:p>
+      <w:pPr>
+        <w:spacing w:line="360" w:lineRule="auto" w:after="160"/>
+        <w:ind w:left="567" w:hanging="567"/>
+        <w:jc w:val="both"/>
+      </w:pPr>
+      <w:r>
+        <w:rPr>
+          <w:rFonts w:ascii="Arial" w:hAnsi="Arial"/>
+          <w:sz w:val="24"/>
+        </w:rPr>
         <w:t>Bonal, J., Alerany, C., Bassons, T., &amp; Gascón, P. (2003). Farmacia clínica y Atención Farmacéutica. Sociedad Española de Farmacia Hospitalaria.</w:t>
       </w:r>
     </w:p>
@@ -5099,20 +5098,6 @@
           <w:sz w:val="24"/>
         </w:rPr>
         <w:t>Sánchez-Yáñez, E., Manzano-García, M., &amp; Morillo-Verdugo, R. (2023). Application of CMO (capacity, motivation, and opportunity) methodology in pharmaceutical care to optimize the pharmacotherapy in older people living with HIV. DISPIMDINAC project. Revista Española de Quimioterapia, 36(6), 584-591.</w:t>
-      </w:r>
-    </w:p>
-    <w:p>
-      <w:pPr>
-        <w:spacing w:line="360" w:lineRule="auto" w:after="160"/>
-        <w:ind w:left="567" w:hanging="567"/>
-        <w:jc w:val="both"/>
-      </w:pPr>
-      <w:r>
-        <w:rPr>
-          <w:rFonts w:ascii="Arial" w:hAnsi="Arial"/>
-          <w:sz w:val="24"/>
-        </w:rPr>
-        <w:t>Álvarez-Díaz, A. M., Morillo-Verdugo, R., &amp; Fernández-Llamazares, C. M. (2025). Estudio cualitativo sobre la adopción y potenciación del modelo capacidad-motivación-oportunidad para la Atención Farmacéutica en consultas externas de farmacia en España. Farmacia Hospitalaria, 49(6), 384-391.</w:t>
       </w:r>
     </w:p>
     <w:p>
@@ -30096,7 +30081,7 @@
     </a:clrScheme>
     <a:fontScheme name="Office">
       <a:majorFont>
-        <a:latin typeface="Calibri"/>
+        <a:latin typeface="Arial"/>
         <a:ea typeface=""/>
         <a:cs typeface=""/>
         <a:font script="Jpan" typeface="ＭＳ ゴシック"/>

</xml_diff>

<commit_message>
Agrega seccion 2.1 Cronograma de actividades planificadas con Carta Gantt (Figura 2) segun instructivo; renumera 2.2 desarrolladas, 2.3 descripcion y 2.4 seminario, y ajusta referencias cruzadas
</commit_message>
<xml_diff>
--- a/Informe de Internado - Farmacia Asistencial y APS - CESFAM Villa Nonguen.docx
+++ b/Informe de Internado - Farmacia Asistencial y APS - CESFAM Villa Nonguen.docx
@@ -1959,7 +1959,7 @@
           <w:i w:val="0"/>
           <w:sz w:val="24"/>
         </w:rPr>
-        <w:t>El marco que hoy se usa como referencia para modernizar la Atención Farmacéutica es el Modelo CMO, sigla de Capacidad, Motivación y Oportunidad, desarrollado en España y validado por su sociedad de farmacia hospitalaria (Calleja Hernández &amp; Morillo Verdugo, 2016). Su valor está en que ordena la atención en torno a tres ideas que pueden llevarse al domicilio del paciente. La Capacidad tiene que ver con priorizar, es decir, concentrar el tiempo en los pacientes que más lo necesitan según criterios de riesgo y complejidad (Manzano García &amp; Morillo Verdugo, 2018). La Motivación pone el foco en la relación con el paciente y en su adherencia, trabajando mediante la entrevista motivacional las creencias y dificultades que llevan a no tomar bien el tratamiento. La Oportunidad, por último, busca llegar al paciente más allá del box, en su casa o por teléfono, para resolver a tiempo lo que vaya surgiendo. Estos tres pilares son los que dan forma al protocolo desarrollado como seminario de título durante el internado, descrito en la sección 2.3.</w:t>
+        <w:t>El marco que hoy se usa como referencia para modernizar la Atención Farmacéutica es el Modelo CMO, sigla de Capacidad, Motivación y Oportunidad, desarrollado en España y validado por su sociedad de farmacia hospitalaria (Calleja Hernández &amp; Morillo Verdugo, 2016). Su valor está en que ordena la atención en torno a tres ideas que pueden llevarse al domicilio del paciente. La Capacidad tiene que ver con priorizar, es decir, concentrar el tiempo en los pacientes que más lo necesitan según criterios de riesgo y complejidad (Manzano García &amp; Morillo Verdugo, 2018). La Motivación pone el foco en la relación con el paciente y en su adherencia, trabajando mediante la entrevista motivacional las creencias y dificultades que llevan a no tomar bien el tratamiento. La Oportunidad, por último, busca llegar al paciente más allá del box, en su casa o por teléfono, para resolver a tiempo lo que vaya surgiendo. Estos tres pilares son los que dan forma al protocolo desarrollado como seminario de título durante el internado, descrito en la sección 2.4.</w:t>
       </w:r>
     </w:p>
     <w:p>
@@ -2427,7 +2427,7 @@
         <w:pStyle w:val="Heading2"/>
       </w:pPr>
       <w:r>
-        <w:t>2.1 Cronograma de actividades desarrolladas</w:t>
+        <w:t>2.1 Cronograma de actividades planificadas</w:t>
       </w:r>
     </w:p>
     <w:p>
@@ -2441,7 +2441,95 @@
           <w:i w:val="0"/>
           <w:sz w:val="24"/>
         </w:rPr>
-        <w:t>La Figura 2 muestra, semana a semana, las actividades efectivamente desarrolladas. En términos generales, la ejecución siguió lo planificado, con algunos ajustes propios de la dinámica del establecimiento. El fraccionamiento, el reenvasado y el despacho se mantuvieron durante casi todo el periodo, ya que constituyen tareas habituales de la unidad, y la Atención Farmacéutica se realizó todas las semanas, en más de una oportunidad por semana, gracias a la muy buena disposición de los Químicos Farmacéuticos para integrar al interno a esa labor y enseñarle cómo llevarla a cabo. Hacia las últimas semanas se sumó la eliminación de medicamentos vencidos, y a lo largo de la rotación aparecieron actividades no previstas al inicio, como el apoyo durante las supervisiones del Servicio de Salud y una situación de vinculación con el medio surgida en terreno. La Tabla 3 complementa la figura con el detalle de lo realizado día a día.</w:t>
+        <w:t>Al inicio del internado, el Químico Farmacéutico tutor definió un plan de trabajo que ordenó la rotación por las distintas tareas de la unidad de farmacia a lo largo de las nueve semanas. La Figura 2 presenta la Carta Gantt de las actividades planificadas, en la que las tareas técnicas de recepción, almacenamiento, fraccionamiento, reenvasado y despacho se concentran en las primeras semanas y se mantienen de manera habitual, mientras que las tareas clínicas y comunitarias, como la Atención Farmacéutica, las visitas domiciliarias y la educación sanitaria, se incorporan una vez conocido el funcionamiento de la unidad. El seminario de título se planificó de forma transversal durante todo el periodo. El plan contempló también la participación en el Comité de Farmacia y Terapéutica y en actividades de farmacovigilancia, que finalmente no pudieron concretarse por las razones que se explican en la sección 2.2.</w:t>
+      </w:r>
+    </w:p>
+    <w:p>
+      <w:pPr>
+        <w:spacing w:before="120" w:after="40"/>
+        <w:jc w:val="center"/>
+      </w:pPr>
+      <w:r>
+        <w:drawing>
+          <wp:inline xmlns:a="http://schemas.openxmlformats.org/drawingml/2006/main" xmlns:pic="http://schemas.openxmlformats.org/drawingml/2006/picture">
+            <wp:extent cx="5580000" cy="3198595"/>
+            <wp:docPr id="2" name="Picture 2"/>
+            <wp:cNvGraphicFramePr>
+              <a:graphicFrameLocks noChangeAspect="1"/>
+            </wp:cNvGraphicFramePr>
+            <a:graphic>
+              <a:graphicData uri="http://schemas.openxmlformats.org/drawingml/2006/picture">
+                <pic:pic>
+                  <pic:nvPicPr>
+                    <pic:cNvPr id="0" name="fig_gantt_planificada.png"/>
+                    <pic:cNvPicPr/>
+                  </pic:nvPicPr>
+                  <pic:blipFill>
+                    <a:blip r:embed="rId19"/>
+                    <a:stretch>
+                      <a:fillRect/>
+                    </a:stretch>
+                  </pic:blipFill>
+                  <pic:spPr>
+                    <a:xfrm>
+                      <a:off x="0" y="0"/>
+                      <a:ext cx="5580000" cy="3198595"/>
+                    </a:xfrm>
+                    <a:prstGeom prst="rect"/>
+                  </pic:spPr>
+                </pic:pic>
+              </a:graphicData>
+            </a:graphic>
+          </wp:inline>
+        </w:drawing>
+      </w:r>
+    </w:p>
+    <w:p>
+      <w:pPr>
+        <w:pStyle w:val="Caption"/>
+      </w:pPr>
+      <w:r>
+        <w:t xml:space="preserve">Figura </w:t>
+      </w:r>
+      <w:r>
+        <w:fldChar w:fldCharType="begin"/>
+      </w:r>
+      <w:r>
+        <w:instrText xml:space="preserve"> SEQ Figura \* ARABIC </w:instrText>
+      </w:r>
+      <w:r>
+        <w:fldChar w:fldCharType="separate"/>
+      </w:r>
+      <w:r>
+        <w:t>2</w:t>
+      </w:r>
+      <w:r>
+        <w:fldChar w:fldCharType="end"/>
+      </w:r>
+      <w:r>
+        <w:t>. Carta Gantt de actividades planificadas del internado.</w:t>
+      </w:r>
+    </w:p>
+    <w:p>
+      <w:pPr>
+        <w:pStyle w:val="Heading2"/>
+      </w:pPr>
+      <w:r>
+        <w:t>2.2 Cronograma de actividades desarrolladas</w:t>
+      </w:r>
+    </w:p>
+    <w:p>
+      <w:pPr>
+        <w:jc w:val="both"/>
+      </w:pPr>
+      <w:r>
+        <w:rPr>
+          <w:rFonts w:ascii="Arial" w:hAnsi="Arial"/>
+          <w:b w:val="0"/>
+          <w:i w:val="0"/>
+          <w:sz w:val="24"/>
+        </w:rPr>
+        <w:t>La Figura 3 muestra, semana a semana, las actividades efectivamente desarrolladas. En términos generales, la ejecución siguió lo planificado en la Figura 2, con algunos ajustes propios de la dinámica del establecimiento. El fraccionamiento, el reenvasado y el despacho se mantuvieron durante casi todo el periodo, ya que constituyen tareas habituales de la unidad, y la Atención Farmacéutica se realizó todas las semanas, en más de una oportunidad por semana, gracias a la muy buena disposición de los Químicos Farmacéuticos para integrar al interno a esa labor y enseñarle cómo llevarla a cabo. Hacia las últimas semanas se sumó la eliminación de medicamentos vencidos, y a lo largo de la rotación aparecieron actividades no previstas al inicio, como el apoyo durante las supervisiones del Servicio de Salud y una situación de vinculación con el medio surgida en terreno. La Tabla 3 complementa la figura con el detalle de lo realizado día a día.</w:t>
       </w:r>
     </w:p>
     <w:p>
@@ -2497,7 +2585,7 @@
         <w:fldChar w:fldCharType="separate"/>
       </w:r>
       <w:r>
-        <w:t>2</w:t>
+        <w:t>3</w:t>
       </w:r>
       <w:r>
         <w:fldChar w:fldCharType="end"/>
@@ -3751,7 +3839,7 @@
         <w:pStyle w:val="Heading2"/>
       </w:pPr>
       <w:r>
-        <w:t>2.2 Descripción de las actividades realizadas</w:t>
+        <w:t>2.3 Descripción de las actividades realizadas</w:t>
       </w:r>
     </w:p>
     <w:p>
@@ -3759,7 +3847,7 @@
         <w:pStyle w:val="Heading3"/>
       </w:pPr>
       <w:r>
-        <w:t>2.2.1 Inducción y conocimiento del centro y de la unidad de farmacia</w:t>
+        <w:t>2.3.1 Inducción y conocimiento del centro y de la unidad de farmacia</w:t>
       </w:r>
     </w:p>
     <w:p>
@@ -3781,7 +3869,7 @@
         <w:pStyle w:val="Heading3"/>
       </w:pPr>
       <w:r>
-        <w:t>2.2.2 Recepción, almacenamiento y gestión del stock</w:t>
+        <w:t>2.3.2 Recepción, almacenamiento y gestión del stock</w:t>
       </w:r>
     </w:p>
     <w:p>
@@ -3803,7 +3891,7 @@
         <w:pStyle w:val="Heading3"/>
       </w:pPr>
       <w:r>
-        <w:t>2.2.3 Fraccionamiento y reenvasado de medicamentos</w:t>
+        <w:t>2.3.3 Fraccionamiento y reenvasado de medicamentos</w:t>
       </w:r>
     </w:p>
     <w:p>
@@ -3825,7 +3913,7 @@
         <w:pStyle w:val="Heading3"/>
       </w:pPr>
       <w:r>
-        <w:t>2.2.4 Dispensación informada de medicamentos</w:t>
+        <w:t>2.3.4 Dispensación informada de medicamentos</w:t>
       </w:r>
     </w:p>
     <w:p>
@@ -3847,7 +3935,7 @@
         <w:pStyle w:val="Heading3"/>
       </w:pPr>
       <w:r>
-        <w:t>2.2.5 Atención Farmacéutica y visitas domiciliarias</w:t>
+        <w:t>2.3.5 Atención Farmacéutica y visitas domiciliarias</w:t>
       </w:r>
     </w:p>
     <w:p>
@@ -3869,7 +3957,7 @@
         <w:pStyle w:val="Heading3"/>
       </w:pPr>
       <w:r>
-        <w:t>2.2.6 Educación sanitaria y promoción del uso racional de medicamentos</w:t>
+        <w:t>2.3.6 Educación sanitaria y promoción del uso racional de medicamentos</w:t>
       </w:r>
     </w:p>
     <w:p>
@@ -3891,7 +3979,7 @@
         <w:pStyle w:val="Heading3"/>
       </w:pPr>
       <w:r>
-        <w:t>2.2.7 Control de indicadores, inventario y supervisiones</w:t>
+        <w:t>2.3.7 Control de indicadores, inventario y supervisiones</w:t>
       </w:r>
     </w:p>
     <w:p>
@@ -3913,7 +4001,7 @@
         <w:pStyle w:val="Heading3"/>
       </w:pPr>
       <w:r>
-        <w:t>2.2.8 Arsenal farmacoterapéutico, programas ministeriales y fuentes de información</w:t>
+        <w:t>2.3.8 Arsenal farmacoterapéutico, programas ministeriales y fuentes de información</w:t>
       </w:r>
     </w:p>
     <w:p>
@@ -3935,7 +4023,7 @@
         <w:pStyle w:val="Heading3"/>
       </w:pPr>
       <w:r>
-        <w:t>2.2.9 Manejo de medicamentos sujetos a control legal</w:t>
+        <w:t>2.3.9 Manejo de medicamentos sujetos a control legal</w:t>
       </w:r>
     </w:p>
     <w:p>
@@ -3957,7 +4045,7 @@
         <w:pStyle w:val="Heading3"/>
       </w:pPr>
       <w:r>
-        <w:t>2.2.10 Eliminación de medicamentos vencidos</w:t>
+        <w:t>2.3.10 Eliminación de medicamentos vencidos</w:t>
       </w:r>
     </w:p>
     <w:p>
@@ -3979,7 +4067,7 @@
         <w:pStyle w:val="Heading2"/>
       </w:pPr>
       <w:r>
-        <w:t>2.3 Seminario de título</w:t>
+        <w:t>2.4 Seminario de título</w:t>
       </w:r>
     </w:p>
     <w:p>
@@ -4001,7 +4089,7 @@
         <w:pStyle w:val="Heading3"/>
       </w:pPr>
       <w:r>
-        <w:t>2.3.1 Objetivos del seminario</w:t>
+        <w:t>2.4.1 Objetivos del seminario</w:t>
       </w:r>
     </w:p>
     <w:p>
@@ -4023,7 +4111,7 @@
         <w:pStyle w:val="Heading3"/>
       </w:pPr>
       <w:r>
-        <w:t>2.3.2 Tipo de estudio y desarrollo</w:t>
+        <w:t>2.4.2 Tipo de estudio y desarrollo</w:t>
       </w:r>
     </w:p>
     <w:p>
@@ -4045,7 +4133,7 @@
         <w:pStyle w:val="Heading3"/>
       </w:pPr>
       <w:r>
-        <w:t>2.3.3 Diagnóstico de brechas, población y criterios</w:t>
+        <w:t>2.4.3 Diagnóstico de brechas, población y criterios</w:t>
       </w:r>
     </w:p>
     <w:p>
@@ -4423,7 +4511,7 @@
         <w:pStyle w:val="Heading3"/>
       </w:pPr>
       <w:r>
-        <w:t>2.3.4 Instrumentos diseñados y consideraciones éticas</w:t>
+        <w:t>2.4.4 Instrumentos diseñados y consideraciones éticas</w:t>
       </w:r>
     </w:p>
     <w:p>

</xml_diff>